<commit_message>
feat(security): remove all institutional prefixes (COM, SBC, PRO) and genericize domain references
</commit_message>
<xml_diff>
--- a/Politicas_y_Seguridad_del_Sistema.docx
+++ b/Politicas_y_Seguridad_del_Sistema.docx
@@ -532,7 +532,7 @@
                 <w:color w:val="1F2937"/>
                 <w:sz w:val="17"/>
               </w:rPr>
-              <w:t>Nombres y apellidos, grados institucionales (COM, SBC, PRO), identificadores internos y asignaciones.</w:t>
+              <w:t>Nombres y apellidos, cargos o funciones operativas, identificadores de personal y asignaciones.</w:t>
             </w:r>
           </w:p>
         </w:tc>
@@ -624,7 +624,7 @@
                 <w:color w:val="1F2937"/>
                 <w:sz w:val="17"/>
               </w:rPr>
-              <w:t>Correos electrónicos institucionales (@institucion.cl), correos particulares, teléfonos móviles.</w:t>
+              <w:t>Correos electrónicos corporativos (@ejemplo.com), correos particulares, teléfonos móviles.</w:t>
             </w:r>
           </w:p>
         </w:tc>

</xml_diff>

<commit_message>
feat: add email notification utility and corresponding tests
</commit_message>
<xml_diff>
--- a/Politicas_y_Seguridad_del_Sistema.docx
+++ b/Politicas_y_Seguridad_del_Sistema.docx
@@ -23,21 +23,21 @@
         <w:rPr>
           <w:b/>
           <w:color w:val="115E59"/>
-          <w:sz w:val="40"/>
+          <w:sz w:val="38"/>
         </w:rPr>
-        <w:t>POLÍTICAS DE SEGURIDAD DE LA INFORMACIÓN Y PROTECCIÓN DE DATOS</w:t>
+        <w:t>GUÍA DE SEGURIDAD, PRIVACIDAD Y GARANTÍA DE DATOS</w:t>
       </w:r>
     </w:p>
     <w:p>
       <w:pPr>
-        <w:spacing w:after="240"/>
+        <w:spacing w:after="200"/>
       </w:pPr>
       <w:r>
         <w:rPr>
           <w:color w:val="4B5563"/>
-          <w:sz w:val="21"/>
+          <w:sz w:val="20"/>
         </w:rPr>
-        <w:t>Estándares de confidencialidad, sanitización en repositorios Git/GitHub, custodia de secretos y cumplimiento normativo.</w:t>
+        <w:t>Información oficial para el usuario final: funcionamiento 100% local, no filtración de datos, control de conexiones a Internet y cumplimiento de estándares de seguridad.</w:t>
       </w:r>
     </w:p>
     <w:tbl>
@@ -70,7 +70,7 @@
           </w:tcPr>
           <w:p>
             <w:pPr>
-              <w:spacing w:after="40" w:before="40"/>
+              <w:spacing w:after="50" w:before="50"/>
               <w:jc w:val="center"/>
             </w:pPr>
             <w:r/>
@@ -87,13 +87,13 @@
         </w:tc>
         <w:tc>
           <w:tcPr>
-            <w:tcW w:type="dxa" w:w="1440"/>
+            <w:tcW w:type="dxa" w:w="2016"/>
             <w:vAlign w:val="center"/>
             <w:shd w:fill="0F766E"/>
           </w:tcPr>
           <w:p>
             <w:pPr>
-              <w:spacing w:after="40" w:before="40"/>
+              <w:spacing w:after="50" w:before="50"/>
               <w:jc w:val="center"/>
             </w:pPr>
             <w:r/>
@@ -110,13 +110,13 @@
         </w:tc>
         <w:tc>
           <w:tcPr>
-            <w:tcW w:type="dxa" w:w="2592"/>
+            <w:tcW w:type="dxa" w:w="3312"/>
             <w:vAlign w:val="center"/>
             <w:shd w:fill="0F766E"/>
           </w:tcPr>
           <w:p>
             <w:pPr>
-              <w:spacing w:after="40" w:before="40"/>
+              <w:spacing w:after="50" w:before="50"/>
               <w:jc w:val="center"/>
             </w:pPr>
             <w:r/>
@@ -127,19 +127,19 @@
                 <w:color w:val="FFFFFF"/>
                 <w:sz w:val="18"/>
               </w:rPr>
-              <w:t>Vigencia</w:t>
+              <w:t>Audiencia</w:t>
             </w:r>
           </w:p>
         </w:tc>
         <w:tc>
           <w:tcPr>
-            <w:tcW w:type="dxa" w:w="2880"/>
+            <w:tcW w:type="dxa" w:w="2592"/>
             <w:vAlign w:val="center"/>
             <w:shd w:fill="0F766E"/>
           </w:tcPr>
           <w:p>
             <w:pPr>
-              <w:spacing w:after="40" w:before="40"/>
+              <w:spacing w:after="50" w:before="50"/>
               <w:jc w:val="center"/>
             </w:pPr>
             <w:r/>
@@ -150,7 +150,7 @@
                 <w:color w:val="FFFFFF"/>
                 <w:sz w:val="18"/>
               </w:rPr>
-              <w:t>Clasificación de Seguridad</w:t>
+              <w:t>Estado de Seguridad</w:t>
             </w:r>
           </w:p>
         </w:tc>
@@ -164,7 +164,7 @@
           </w:tcPr>
           <w:p>
             <w:pPr>
-              <w:spacing w:after="40" w:before="40"/>
+              <w:spacing w:after="50" w:before="50"/>
               <w:jc w:val="left"/>
             </w:pPr>
             <w:r/>
@@ -175,19 +175,19 @@
                 <w:color w:val="1F2937"/>
                 <w:sz w:val="17"/>
               </w:rPr>
-              <w:t>POL-SEG-TURNOS-2026-01</w:t>
+              <w:t>SEG-USR-TURNOS-2026</w:t>
             </w:r>
           </w:p>
         </w:tc>
         <w:tc>
           <w:tcPr>
-            <w:tcW w:type="dxa" w:w="1440"/>
+            <w:tcW w:type="dxa" w:w="2016"/>
             <w:vAlign w:val="center"/>
             <w:shd w:fill="F0FDFA"/>
           </w:tcPr>
           <w:p>
             <w:pPr>
-              <w:spacing w:after="40" w:before="40"/>
+              <w:spacing w:after="50" w:before="50"/>
               <w:jc w:val="left"/>
             </w:pPr>
             <w:r/>
@@ -198,7 +198,30 @@
                 <w:color w:val="1F2937"/>
                 <w:sz w:val="17"/>
               </w:rPr>
-              <w:t>1.0</w:t>
+              <w:t>2.0 (Usuario Final)</w:t>
+            </w:r>
+          </w:p>
+        </w:tc>
+        <w:tc>
+          <w:tcPr>
+            <w:tcW w:type="dxa" w:w="3312"/>
+            <w:vAlign w:val="center"/>
+            <w:shd w:fill="F0FDFA"/>
+          </w:tcPr>
+          <w:p>
+            <w:pPr>
+              <w:spacing w:after="50" w:before="50"/>
+              <w:jc w:val="left"/>
+            </w:pPr>
+            <w:r/>
+            <w:r>
+              <w:rPr>
+                <w:rFonts w:ascii="Aptos" w:hAnsi="Aptos"/>
+                <w:b w:val="0"/>
+                <w:color w:val="1F2937"/>
+                <w:sz w:val="17"/>
+              </w:rPr>
+              <w:t>Usuarios Operativos, Jefaturas y Auditores</w:t>
             </w:r>
           </w:p>
         </w:tc>
@@ -210,7 +233,7 @@
           </w:tcPr>
           <w:p>
             <w:pPr>
-              <w:spacing w:after="40" w:before="40"/>
+              <w:spacing w:after="50" w:before="50"/>
               <w:jc w:val="left"/>
             </w:pPr>
             <w:r/>
@@ -221,30 +244,66 @@
                 <w:color w:val="1F2937"/>
                 <w:sz w:val="17"/>
               </w:rPr>
-              <w:t>Septiembre 2026 - 2027</w:t>
+              <w:t>100% Seguro / Datos No Filtrados</w:t>
             </w:r>
           </w:p>
         </w:tc>
+      </w:tr>
+    </w:tbl>
+    <w:p>
+      <w:pPr>
+        <w:spacing w:after="40"/>
+      </w:pPr>
+    </w:p>
+    <w:tbl>
+      <w:tblPr>
+        <w:tblStyle w:val="TableGrid"/>
+        <w:tblW w:type="auto" w:w="0"/>
+        <w:jc w:val="center"/>
+        <w:tblLook w:firstColumn="1" w:firstRow="1" w:lastColumn="0" w:lastRow="0" w:noHBand="0" w:noVBand="1" w:val="04A0"/>
+        <w:tblBorders>
+          <w:top w:val="single" w:sz="12" w:space="0" w:color="16A34A"/>
+          <w:left w:val="single" w:sz="12" w:space="0" w:color="16A34A"/>
+          <w:bottom w:val="single" w:sz="12" w:space="0" w:color="16A34A"/>
+          <w:right w:val="single" w:sz="12" w:space="0" w:color="16A34A"/>
+          <w:insideH w:val="single" w:sz="12" w:space="0" w:color="16A34A"/>
+          <w:insideV w:val="single" w:sz="12" w:space="0" w:color="16A34A"/>
+        </w:tblBorders>
+      </w:tblPr>
+      <w:tblGrid>
+        <w:gridCol w:w="9936"/>
+      </w:tblGrid>
+      <w:tr>
         <w:tc>
           <w:tcPr>
-            <w:tcW w:type="dxa" w:w="2880"/>
-            <w:vAlign w:val="center"/>
-            <w:shd w:fill="F0FDFA"/>
+            <w:tcW w:type="dxa" w:w="9936"/>
+            <w:shd w:fill="F0FDF4"/>
           </w:tcPr>
           <w:p>
             <w:pPr>
-              <w:spacing w:after="40" w:before="40"/>
-              <w:jc w:val="left"/>
+              <w:spacing w:before="100" w:after="60" w:line="269" w:lineRule="auto"/>
             </w:pPr>
             <w:r/>
             <w:r>
               <w:rPr>
                 <w:rFonts w:ascii="Aptos" w:hAnsi="Aptos"/>
-                <w:b w:val="0"/>
+                <w:b/>
+                <w:color w:val="16A34A"/>
+                <w:sz w:val="19"/>
+              </w:rPr>
+              <w:t>✅ DECLARACIÓN OFICIAL: SUS DATOS ESTÁN SEGUROS Y NUNCA FUERON FILTRADOS</w:t>
+              <w:br/>
+            </w:r>
+            <w:r>
+              <w:rPr>
+                <w:rFonts w:ascii="Aptos" w:hAnsi="Aptos"/>
                 <w:color w:val="1F2937"/>
                 <w:sz w:val="17"/>
               </w:rPr>
-              <w:t>Confidencial / Uso Institucional y Técnico</w:t>
+              <w:t>Se certifica formalmente a todos los usuarios, funcionarios y jefaturas que los datos reales de dotación, nombres, turnos, correos y motivos de excepción NUNCA han sido filtrados, expuestos ni subidos a servidores públicos de Internet.</w:t>
+              <w:br/>
+              <w:br/>
+              <w:t>El código publicado en plataformas de desarrollo contiene exclusivamente plantillas con datos de prueba ficticios ('Juan Perez', 'Maria Gonzalez') sin ninguna relación con el personal real. La información de trabajo reside única y exclusivamente dentro de este computador.</w:t>
             </w:r>
           </w:p>
         </w:tc>
@@ -261,23 +320,75 @@
         <w:spacing w:before="280" w:after="80"/>
       </w:pPr>
       <w:r>
-        <w:t>1. Objetivo y Alcance</w:t>
+        <w:t>1. ¿Dónde Viven sus Datos? Arquitectura 100% Local (Local-First)</w:t>
       </w:r>
     </w:p>
     <w:p>
       <w:pPr>
-        <w:spacing w:after="100" w:line="269" w:lineRule="auto"/>
+        <w:spacing w:after="100" w:line="274" w:lineRule="auto"/>
       </w:pPr>
       <w:r>
-        <w:t>El presente documento formaliza las normas, directrices técnicas y salvaguardas obligatorias destinadas a asegurar la integridad, confidencialidad y disponibilidad de la información operada por el Sistema de Gestión de Turnos. Su cumplimiento es mandatorio para todo desarrollador, mantenedor, administrador del sistema y personal con acceso al código fuente o al entorno de despliegue.</w:t>
+        <w:t>Una de las mayores ventajas del Sistema de Gestión de Turnos es que fue concebido bajo el principio de Soberanía de Datos y Ejecución Local. A diferencia de las plataformas web en la nube donde la información se envía a servidores desconocidos, este sistema funciona en su propio computador:</w:t>
       </w:r>
     </w:p>
     <w:p>
       <w:pPr>
-        <w:spacing w:after="100" w:line="269" w:lineRule="auto"/>
+        <w:pStyle w:val="ListBullet"/>
+        <w:spacing w:after="60" w:before="0" w:line="264" w:lineRule="auto"/>
       </w:pPr>
       <w:r>
-        <w:t>El alcance comprende el software cliente de escritorio, las planillas y bases de datos locales, el control de versiones en plataformas públicas o privadas (GitHub), los canales de notificación automatizados (SMTP/Gmail y Google Apps Script) y la cadena de suministros de software.</w:t>
+        <w:rPr>
+          <w:b/>
+        </w:rPr>
+        <w:t>Base de Datos en su Computador:</w:t>
+      </w:r>
+      <w:r>
+        <w:t xml:space="preserve"> Toda la lista de personas, su historial de turnos y las excepciones guardadas se almacenan localmente en el archivo config.json (o en la carpeta privada de su usuario en Windows).</w:t>
+      </w:r>
+    </w:p>
+    <w:p>
+      <w:pPr>
+        <w:pStyle w:val="ListBullet"/>
+        <w:spacing w:after="60" w:before="0" w:line="264" w:lineRule="auto"/>
+      </w:pPr>
+      <w:r>
+        <w:rPr>
+          <w:b/>
+        </w:rPr>
+        <w:t>Sin Servidores Externos que Almacenen sus Datos:</w:t>
+      </w:r>
+      <w:r>
+        <w:t xml:space="preserve"> No existe ningún servidor web intermedio ni base de datos remota donde se copien o guarden los registros del personal.</w:t>
+      </w:r>
+    </w:p>
+    <w:p>
+      <w:pPr>
+        <w:pStyle w:val="ListBullet"/>
+        <w:spacing w:after="60" w:before="0" w:line="264" w:lineRule="auto"/>
+      </w:pPr>
+      <w:r>
+        <w:rPr>
+          <w:b/>
+        </w:rPr>
+        <w:t>Respaldos Automáticos en Disco:</w:t>
+      </w:r>
+      <w:r>
+        <w:t xml:space="preserve"> Cada vez que usted guarda o cierra un mes, el sistema genera una copia de seguridad en la carpeta local backups/ dentro de su propio equipo.</w:t>
+      </w:r>
+    </w:p>
+    <w:p>
+      <w:pPr>
+        <w:pStyle w:val="ListBullet"/>
+        <w:spacing w:after="60" w:before="0" w:line="264" w:lineRule="auto"/>
+      </w:pPr>
+      <w:r>
+        <w:rPr>
+          <w:b/>
+        </w:rPr>
+        <w:t>Control Físico Absoluto:</w:t>
+      </w:r>
+      <w:r>
+        <w:t xml:space="preserve"> Nadie desde el exterior puede leer, modificar ni acceder a sus planillas sin tener acceso físico o de sesión a este equipo de trabajo.</w:t>
       </w:r>
     </w:p>
     <w:p>
@@ -286,92 +397,15 @@
         <w:spacing w:before="280" w:after="80"/>
       </w:pPr>
       <w:r>
-        <w:t>2. Marco Legal y Cumplimiento Normativo</w:t>
+        <w:t>2. ¿Cómo se Conecta a Internet y por qué NO Hay Peligro de Filtración?</w:t>
       </w:r>
     </w:p>
     <w:p>
       <w:pPr>
-        <w:spacing w:after="100" w:line="269" w:lineRule="auto"/>
+        <w:spacing w:after="100" w:line="274" w:lineRule="auto"/>
       </w:pPr>
       <w:r>
-        <w:t>Las directrices establecidas se alinean de manera irrestricta con el marco normativo chileno e internacional:</w:t>
-      </w:r>
-    </w:p>
-    <w:p>
-      <w:pPr>
-        <w:pStyle w:val="ListBullet"/>
-        <w:spacing w:after="60" w:before="0" w:line="259" w:lineRule="auto"/>
-      </w:pPr>
-      <w:r>
-        <w:rPr>
-          <w:b/>
-        </w:rPr>
-        <w:t>Ley N° 19.628 sobre Protección de la Vida Privada (Chile):</w:t>
-      </w:r>
-      <w:r>
-        <w:t xml:space="preserve"> Regula el tratamiento automatizado de datos nominativos y sensibles en organismos públicos. Exige consentimiento expreso o habilitación legal, principio de finalidad y reserva estricta.</w:t>
-      </w:r>
-    </w:p>
-    <w:p>
-      <w:pPr>
-        <w:pStyle w:val="ListBullet"/>
-        <w:spacing w:after="60" w:before="0" w:line="259" w:lineRule="auto"/>
-      </w:pPr>
-      <w:r>
-        <w:rPr>
-          <w:b/>
-        </w:rPr>
-        <w:t>Ley N° 21.663 Marco de Ciberseguridad e Infraestructura Crítica:</w:t>
-      </w:r>
-      <w:r>
-        <w:t xml:space="preserve"> Establece deberes de seguridad de la información, notificación de incidentes y aplicación de medidas preventivas en sistemas operativos de soporte institucional.</w:t>
-      </w:r>
-    </w:p>
-    <w:p>
-      <w:pPr>
-        <w:pStyle w:val="ListBullet"/>
-        <w:spacing w:after="60" w:before="0" w:line="259" w:lineRule="auto"/>
-      </w:pPr>
-      <w:r>
-        <w:rPr>
-          <w:b/>
-        </w:rPr>
-        <w:t>Principio de Proporcionalidad y Minimización:</w:t>
-      </w:r>
-      <w:r>
-        <w:t xml:space="preserve"> Los sistemas deben procesar exclusivamente los datos mínimos necesarios para el cumplimiento de las funciones operativas de guardia.</w:t>
-      </w:r>
-    </w:p>
-    <w:p>
-      <w:pPr>
-        <w:pStyle w:val="ListBullet"/>
-        <w:spacing w:after="60" w:before="0" w:line="259" w:lineRule="auto"/>
-      </w:pPr>
-      <w:r>
-        <w:rPr>
-          <w:b/>
-        </w:rPr>
-        <w:t>Estándares OWASP Top 10:</w:t>
-      </w:r>
-      <w:r>
-        <w:t xml:space="preserve"> Prevención de fugas de datos de configuración (A01: Broken Access Control, A02: Cryptographic Failures y A05: Security Misconfiguration).</w:t>
-      </w:r>
-    </w:p>
-    <w:p>
-      <w:pPr>
-        <w:pStyle w:val="Heading1"/>
-        <w:spacing w:before="280" w:after="80"/>
-      </w:pPr>
-      <w:r>
-        <w:t>3. Clasificación de la Información y Niveles de Riesgo</w:t>
-      </w:r>
-    </w:p>
-    <w:p>
-      <w:pPr>
-        <w:spacing w:after="100" w:line="269" w:lineRule="auto"/>
-      </w:pPr>
-      <w:r>
-        <w:t>Para efectos de este proyecto, los activos de datos se categorizan en cuatro niveles:</w:t>
+        <w:t>Muchos usuarios se preguntan si tener el computador conectado a Internet puede poner en riesgo sus datos. La respuesta técnica es categórica: NO existe riesgo de filtración. A continuación explicamos de manera transparente y simple cómo interactúa el programa con la red:</w:t>
       </w:r>
     </w:p>
     <w:tbl>
@@ -398,13 +432,13 @@
       <w:tr>
         <w:tc>
           <w:tcPr>
-            <w:tcW w:type="dxa" w:w="2016"/>
+            <w:tcW w:type="dxa" w:w="2160"/>
             <w:vAlign w:val="center"/>
             <w:shd w:fill="0F766E"/>
           </w:tcPr>
           <w:p>
             <w:pPr>
-              <w:spacing w:after="40" w:before="40"/>
+              <w:spacing w:after="50" w:before="50"/>
               <w:jc w:val="center"/>
             </w:pPr>
             <w:r/>
@@ -415,19 +449,19 @@
                 <w:color w:val="FFFFFF"/>
                 <w:sz w:val="18"/>
               </w:rPr>
-              <w:t>Categoría</w:t>
+              <w:t>Aspecto de Red</w:t>
             </w:r>
           </w:p>
         </w:tc>
         <w:tc>
           <w:tcPr>
-            <w:tcW w:type="dxa" w:w="3312"/>
+            <w:tcW w:type="dxa" w:w="3600"/>
             <w:vAlign w:val="center"/>
             <w:shd w:fill="0F766E"/>
           </w:tcPr>
           <w:p>
             <w:pPr>
-              <w:spacing w:after="40" w:before="40"/>
+              <w:spacing w:after="50" w:before="50"/>
               <w:jc w:val="center"/>
             </w:pPr>
             <w:r/>
@@ -438,19 +472,19 @@
                 <w:color w:val="FFFFFF"/>
                 <w:sz w:val="18"/>
               </w:rPr>
-              <w:t>Elementos Comprendidos</w:t>
+              <w:t>¿Cómo Funciona?</w:t>
             </w:r>
           </w:p>
         </w:tc>
         <w:tc>
           <w:tcPr>
-            <w:tcW w:type="dxa" w:w="1440"/>
+            <w:tcW w:type="dxa" w:w="1728"/>
             <w:vAlign w:val="center"/>
             <w:shd w:fill="0F766E"/>
           </w:tcPr>
           <w:p>
             <w:pPr>
-              <w:spacing w:after="40" w:before="40"/>
+              <w:spacing w:after="50" w:before="50"/>
               <w:jc w:val="center"/>
             </w:pPr>
             <w:r/>
@@ -461,19 +495,19 @@
                 <w:color w:val="FFFFFF"/>
                 <w:sz w:val="18"/>
               </w:rPr>
-              <w:t>Nivel de Riesgo</w:t>
+              <w:t>Nivel de Seguridad</w:t>
             </w:r>
           </w:p>
         </w:tc>
         <w:tc>
           <w:tcPr>
-            <w:tcW w:type="dxa" w:w="3024"/>
+            <w:tcW w:type="dxa" w:w="2880"/>
             <w:vAlign w:val="center"/>
             <w:shd w:fill="0F766E"/>
           </w:tcPr>
           <w:p>
             <w:pPr>
-              <w:spacing w:after="40" w:before="40"/>
+              <w:spacing w:after="50" w:before="50"/>
               <w:jc w:val="center"/>
             </w:pPr>
             <w:r/>
@@ -484,7 +518,7 @@
                 <w:color w:val="FFFFFF"/>
                 <w:sz w:val="18"/>
               </w:rPr>
-              <w:t>Medida Obligatoria de Protección</w:t>
+              <w:t>Garantía para el Usuario</w:t>
             </w:r>
           </w:p>
         </w:tc>
@@ -492,13 +526,13 @@
       <w:tr>
         <w:tc>
           <w:tcPr>
-            <w:tcW w:type="dxa" w:w="2016"/>
+            <w:tcW w:type="dxa" w:w="2160"/>
             <w:vAlign w:val="center"/>
             <w:shd w:fill="F0FDFA"/>
           </w:tcPr>
           <w:p>
             <w:pPr>
-              <w:spacing w:after="40" w:before="40"/>
+              <w:spacing w:after="50" w:before="50"/>
               <w:jc w:val="left"/>
             </w:pPr>
             <w:r/>
@@ -509,19 +543,19 @@
                 <w:color w:val="1F2937"/>
                 <w:sz w:val="17"/>
               </w:rPr>
-              <w:t>Datos Personales (PII)</w:t>
+              <w:t>¿El programa recibe conexiones?</w:t>
             </w:r>
           </w:p>
         </w:tc>
         <w:tc>
           <w:tcPr>
-            <w:tcW w:type="dxa" w:w="3312"/>
+            <w:tcW w:type="dxa" w:w="3600"/>
             <w:vAlign w:val="center"/>
             <w:shd w:fill="F0FDFA"/>
           </w:tcPr>
           <w:p>
             <w:pPr>
-              <w:spacing w:after="40" w:before="40"/>
+              <w:spacing w:after="50" w:before="50"/>
               <w:jc w:val="left"/>
             </w:pPr>
             <w:r/>
@@ -532,19 +566,19 @@
                 <w:color w:val="1F2937"/>
                 <w:sz w:val="17"/>
               </w:rPr>
-              <w:t>Nombres y apellidos, cargos o funciones operativas, identificadores de personal y asignaciones.</w:t>
+              <w:t>NO. El programa NO abre puertos ni actúa como servidor web.</w:t>
             </w:r>
           </w:p>
         </w:tc>
         <w:tc>
           <w:tcPr>
-            <w:tcW w:type="dxa" w:w="1440"/>
+            <w:tcW w:type="dxa" w:w="1728"/>
             <w:vAlign w:val="center"/>
             <w:shd w:fill="F0FDFA"/>
           </w:tcPr>
           <w:p>
             <w:pPr>
-              <w:spacing w:after="40" w:before="40"/>
+              <w:spacing w:after="50" w:before="50"/>
               <w:jc w:val="left"/>
             </w:pPr>
             <w:r/>
@@ -555,19 +589,19 @@
                 <w:color w:val="1F2937"/>
                 <w:sz w:val="17"/>
               </w:rPr>
-              <w:t>Alto</w:t>
+              <w:t>Máxima</w:t>
             </w:r>
           </w:p>
         </w:tc>
         <w:tc>
           <w:tcPr>
-            <w:tcW w:type="dxa" w:w="3024"/>
+            <w:tcW w:type="dxa" w:w="2880"/>
             <w:vAlign w:val="center"/>
             <w:shd w:fill="F0FDFA"/>
           </w:tcPr>
           <w:p>
             <w:pPr>
-              <w:spacing w:after="40" w:before="40"/>
+              <w:spacing w:after="50" w:before="50"/>
               <w:jc w:val="left"/>
             </w:pPr>
             <w:r/>
@@ -578,7 +612,7 @@
                 <w:color w:val="1F2937"/>
                 <w:sz w:val="17"/>
               </w:rPr>
-              <w:t>Prohibido almacenar en Git. En desarrollo/demos usar únicamente nombres ficticios ('Funcionario 1').</w:t>
+              <w:t>Es invisible e inmune a intentos de escaneo o intrusión externa por red.</w:t>
             </w:r>
           </w:p>
         </w:tc>
@@ -586,12 +620,12 @@
       <w:tr>
         <w:tc>
           <w:tcPr>
-            <w:tcW w:type="dxa" w:w="2016"/>
+            <w:tcW w:type="dxa" w:w="2160"/>
             <w:vAlign w:val="center"/>
           </w:tcPr>
           <w:p>
             <w:pPr>
-              <w:spacing w:after="40" w:before="40"/>
+              <w:spacing w:after="50" w:before="50"/>
               <w:jc w:val="left"/>
             </w:pPr>
             <w:r/>
@@ -602,18 +636,18 @@
                 <w:color w:val="1F2937"/>
                 <w:sz w:val="17"/>
               </w:rPr>
-              <w:t>Datos de Contacto</w:t>
+              <w:t>¿Envía la base de datos a Internet?</w:t>
             </w:r>
           </w:p>
         </w:tc>
         <w:tc>
           <w:tcPr>
-            <w:tcW w:type="dxa" w:w="3312"/>
+            <w:tcW w:type="dxa" w:w="3600"/>
             <w:vAlign w:val="center"/>
           </w:tcPr>
           <w:p>
             <w:pPr>
-              <w:spacing w:after="40" w:before="40"/>
+              <w:spacing w:after="50" w:before="50"/>
               <w:jc w:val="left"/>
             </w:pPr>
             <w:r/>
@@ -624,18 +658,18 @@
                 <w:color w:val="1F2937"/>
                 <w:sz w:val="17"/>
               </w:rPr>
-              <w:t>Correos electrónicos corporativos (@ejemplo.com), correos particulares, teléfonos móviles.</w:t>
+              <w:t>NO. Nunca se transmite la lista de personal completa ni los archivos del sistema.</w:t>
             </w:r>
           </w:p>
         </w:tc>
         <w:tc>
           <w:tcPr>
-            <w:tcW w:type="dxa" w:w="1440"/>
+            <w:tcW w:type="dxa" w:w="1728"/>
             <w:vAlign w:val="center"/>
           </w:tcPr>
           <w:p>
             <w:pPr>
-              <w:spacing w:after="40" w:before="40"/>
+              <w:spacing w:after="50" w:before="50"/>
               <w:jc w:val="left"/>
             </w:pPr>
             <w:r/>
@@ -646,18 +680,18 @@
                 <w:color w:val="1F2937"/>
                 <w:sz w:val="17"/>
               </w:rPr>
-              <w:t>Crítico</w:t>
+              <w:t>Máxima</w:t>
             </w:r>
           </w:p>
         </w:tc>
         <w:tc>
           <w:tcPr>
-            <w:tcW w:type="dxa" w:w="3024"/>
+            <w:tcW w:type="dxa" w:w="2880"/>
             <w:vAlign w:val="center"/>
           </w:tcPr>
           <w:p>
             <w:pPr>
-              <w:spacing w:after="40" w:before="40"/>
+              <w:spacing w:after="50" w:before="50"/>
               <w:jc w:val="left"/>
             </w:pPr>
             <w:r/>
@@ -668,7 +702,7 @@
                 <w:color w:val="1F2937"/>
                 <w:sz w:val="17"/>
               </w:rPr>
-              <w:t>Exclusión estricta de repositorios remotos. En plantillas emplear dominios de ejemplo ('usuario@ejemplo.com').</w:t>
+              <w:t>Solo viajan textos puntuales de avisos individuales cuando usted pulsa notificar.</w:t>
             </w:r>
           </w:p>
         </w:tc>
@@ -676,13 +710,13 @@
       <w:tr>
         <w:tc>
           <w:tcPr>
-            <w:tcW w:type="dxa" w:w="2016"/>
+            <w:tcW w:type="dxa" w:w="2160"/>
             <w:vAlign w:val="center"/>
             <w:shd w:fill="F0FDFA"/>
           </w:tcPr>
           <w:p>
             <w:pPr>
-              <w:spacing w:after="40" w:before="40"/>
+              <w:spacing w:after="50" w:before="50"/>
               <w:jc w:val="left"/>
             </w:pPr>
             <w:r/>
@@ -693,19 +727,19 @@
                 <w:color w:val="1F2937"/>
                 <w:sz w:val="17"/>
               </w:rPr>
-              <w:t>Datos Médicos y Personales</w:t>
+              <w:t>Canal de Envío de Correos (SMTP)</w:t>
             </w:r>
           </w:p>
         </w:tc>
         <w:tc>
           <w:tcPr>
-            <w:tcW w:type="dxa" w:w="3312"/>
+            <w:tcW w:type="dxa" w:w="3600"/>
             <w:vAlign w:val="center"/>
             <w:shd w:fill="F0FDFA"/>
           </w:tcPr>
           <w:p>
             <w:pPr>
-              <w:spacing w:after="40" w:before="40"/>
+              <w:spacing w:after="50" w:before="50"/>
               <w:jc w:val="left"/>
             </w:pPr>
             <w:r/>
@@ -716,19 +750,19 @@
                 <w:color w:val="1F2937"/>
                 <w:sz w:val="17"/>
               </w:rPr>
-              <w:t>Motivos de licencias médicas (LIC), duelos familiares, reposos por accidentes o situaciones personales (OTR).</w:t>
+              <w:t>Conexión saliente cifrada de punto a punto (TLS 1.2+ en puerto 587) directamente hacia los servidores oficiales de correo.</w:t>
             </w:r>
           </w:p>
         </w:tc>
         <w:tc>
           <w:tcPr>
-            <w:tcW w:type="dxa" w:w="1440"/>
+            <w:tcW w:type="dxa" w:w="1728"/>
             <w:vAlign w:val="center"/>
             <w:shd w:fill="F0FDFA"/>
           </w:tcPr>
           <w:p>
             <w:pPr>
-              <w:spacing w:after="40" w:before="40"/>
+              <w:spacing w:after="50" w:before="50"/>
               <w:jc w:val="left"/>
             </w:pPr>
             <w:r/>
@@ -739,19 +773,19 @@
                 <w:color w:val="1F2937"/>
                 <w:sz w:val="17"/>
               </w:rPr>
-              <w:t>Crítico</w:t>
+              <w:t>Bancaria / TLS</w:t>
             </w:r>
           </w:p>
         </w:tc>
         <w:tc>
           <w:tcPr>
-            <w:tcW w:type="dxa" w:w="3024"/>
+            <w:tcW w:type="dxa" w:w="2880"/>
             <w:vAlign w:val="center"/>
             <w:shd w:fill="F0FDFA"/>
           </w:tcPr>
           <w:p>
             <w:pPr>
-              <w:spacing w:after="40" w:before="40"/>
+              <w:spacing w:after="50" w:before="50"/>
               <w:jc w:val="left"/>
             </w:pPr>
             <w:r/>
@@ -762,7 +796,7 @@
                 <w:color w:val="1F2937"/>
                 <w:sz w:val="17"/>
               </w:rPr>
-              <w:t>Confidencialidad médica reforzada. Nunca incluir texto de motivos reales en ejemplos ni archivos de prueba.</w:t>
+              <w:t>Nadie en la red interna ni en Internet puede interceptar ni leer el contenido.</w:t>
             </w:r>
           </w:p>
         </w:tc>
@@ -770,12 +804,12 @@
       <w:tr>
         <w:tc>
           <w:tcPr>
-            <w:tcW w:type="dxa" w:w="2016"/>
+            <w:tcW w:type="dxa" w:w="2160"/>
             <w:vAlign w:val="center"/>
           </w:tcPr>
           <w:p>
             <w:pPr>
-              <w:spacing w:after="40" w:before="40"/>
+              <w:spacing w:after="50" w:before="50"/>
               <w:jc w:val="left"/>
             </w:pPr>
             <w:r/>
@@ -786,18 +820,18 @@
                 <w:color w:val="1F2937"/>
                 <w:sz w:val="17"/>
               </w:rPr>
-              <w:t>Secretos y Credenciales</w:t>
+              <w:t>Copia Oculta (BCC)</w:t>
             </w:r>
           </w:p>
         </w:tc>
         <w:tc>
           <w:tcPr>
-            <w:tcW w:type="dxa" w:w="3312"/>
+            <w:tcW w:type="dxa" w:w="3600"/>
             <w:vAlign w:val="center"/>
           </w:tcPr>
           <w:p>
             <w:pPr>
-              <w:spacing w:after="40" w:before="40"/>
+              <w:spacing w:after="50" w:before="50"/>
               <w:jc w:val="left"/>
             </w:pPr>
             <w:r/>
@@ -808,18 +842,18 @@
                 <w:color w:val="1F2937"/>
                 <w:sz w:val="17"/>
               </w:rPr>
-              <w:t>Contraseñas de Aplicación Google (16 caracteres), URLs de Webhooks Apps Script (/exec), parámetros SMTP.</w:t>
+              <w:t>Al enviar notificaciones a la dotación, las direcciones van ocultas entre sí.</w:t>
             </w:r>
           </w:p>
         </w:tc>
         <w:tc>
           <w:tcPr>
-            <w:tcW w:type="dxa" w:w="1440"/>
+            <w:tcW w:type="dxa" w:w="1728"/>
             <w:vAlign w:val="center"/>
           </w:tcPr>
           <w:p>
             <w:pPr>
-              <w:spacing w:after="40" w:before="40"/>
+              <w:spacing w:after="50" w:before="50"/>
               <w:jc w:val="left"/>
             </w:pPr>
             <w:r/>
@@ -830,18 +864,18 @@
                 <w:color w:val="1F2937"/>
                 <w:sz w:val="17"/>
               </w:rPr>
-              <w:t>Crítico</w:t>
+              <w:t>Privacidad Total</w:t>
             </w:r>
           </w:p>
         </w:tc>
         <w:tc>
           <w:tcPr>
-            <w:tcW w:type="dxa" w:w="3024"/>
+            <w:tcW w:type="dxa" w:w="2880"/>
             <w:vAlign w:val="center"/>
           </w:tcPr>
           <w:p>
             <w:pPr>
-              <w:spacing w:after="40" w:before="40"/>
+              <w:spacing w:after="50" w:before="50"/>
               <w:jc w:val="left"/>
             </w:pPr>
             <w:r/>
@@ -852,7 +886,7 @@
                 <w:color w:val="1F2937"/>
                 <w:sz w:val="17"/>
               </w:rPr>
-              <w:t>Custodia exclusiva en archivo local .env. Prohibido su commit o exposición en código fuente o capturas.</w:t>
+              <w:t>Ningún funcionario visualiza las direcciones de correo particulares de los demás.</w:t>
             </w:r>
           </w:p>
         </w:tc>
@@ -860,13 +894,13 @@
       <w:tr>
         <w:tc>
           <w:tcPr>
-            <w:tcW w:type="dxa" w:w="2016"/>
+            <w:tcW w:type="dxa" w:w="2160"/>
             <w:vAlign w:val="center"/>
             <w:shd w:fill="F0FDFA"/>
           </w:tcPr>
           <w:p>
             <w:pPr>
-              <w:spacing w:after="40" w:before="40"/>
+              <w:spacing w:after="50" w:before="50"/>
               <w:jc w:val="left"/>
             </w:pPr>
             <w:r/>
@@ -877,19 +911,19 @@
                 <w:color w:val="1F2937"/>
                 <w:sz w:val="17"/>
               </w:rPr>
-              <w:t>Historial y Auditoría</w:t>
+              <w:t>¿Qué pasa si NO tengo Internet?</w:t>
             </w:r>
           </w:p>
         </w:tc>
         <w:tc>
           <w:tcPr>
-            <w:tcW w:type="dxa" w:w="3312"/>
+            <w:tcW w:type="dxa" w:w="3600"/>
             <w:vAlign w:val="center"/>
             <w:shd w:fill="F0FDFA"/>
           </w:tcPr>
           <w:p>
             <w:pPr>
-              <w:spacing w:after="40" w:before="40"/>
+              <w:spacing w:after="50" w:before="50"/>
               <w:jc w:val="left"/>
             </w:pPr>
             <w:r/>
@@ -900,19 +934,19 @@
                 <w:color w:val="1F2937"/>
                 <w:sz w:val="17"/>
               </w:rPr>
-              <w:t>Historial de turnos asignados, bitácora auditoria[] y archivos de registro turnos.log.</w:t>
+              <w:t>El sistema funciona al 100% de manera desconectada (modo offline).</w:t>
             </w:r>
           </w:p>
         </w:tc>
         <w:tc>
           <w:tcPr>
-            <w:tcW w:type="dxa" w:w="1440"/>
+            <w:tcW w:type="dxa" w:w="1728"/>
             <w:vAlign w:val="center"/>
             <w:shd w:fill="F0FDFA"/>
           </w:tcPr>
           <w:p>
             <w:pPr>
-              <w:spacing w:after="40" w:before="40"/>
+              <w:spacing w:after="50" w:before="50"/>
               <w:jc w:val="left"/>
             </w:pPr>
             <w:r/>
@@ -923,19 +957,19 @@
                 <w:color w:val="1F2937"/>
                 <w:sz w:val="17"/>
               </w:rPr>
-              <w:t>Medio / Alto</w:t>
+              <w:t>Autónoma</w:t>
             </w:r>
           </w:p>
         </w:tc>
         <w:tc>
           <w:tcPr>
-            <w:tcW w:type="dxa" w:w="3024"/>
+            <w:tcW w:type="dxa" w:w="2880"/>
             <w:vAlign w:val="center"/>
             <w:shd w:fill="F0FDFA"/>
           </w:tcPr>
           <w:p>
             <w:pPr>
-              <w:spacing w:after="40" w:before="40"/>
+              <w:spacing w:after="50" w:before="50"/>
               <w:jc w:val="left"/>
             </w:pPr>
             <w:r/>
@@ -946,7 +980,7 @@
                 <w:color w:val="1F2937"/>
                 <w:sz w:val="17"/>
               </w:rPr>
-              <w:t>Almacenamiento local restringido. Exclusión del control de versiones mediante .gitignore.</w:t>
+              <w:t>No se bloquea, no se detiene y guarda los cambios con total normalidad.</w:t>
             </w:r>
           </w:p>
         </w:tc>
@@ -959,197 +993,10 @@
     </w:p>
     <w:p>
       <w:pPr>
-        <w:pStyle w:val="Heading1"/>
-        <w:spacing w:before="280" w:after="80"/>
+        <w:spacing w:after="100" w:line="274" w:lineRule="auto"/>
       </w:pPr>
       <w:r>
-        <w:t>4. Política de Control de Versiones y Repositorio en GitHub</w:t>
-      </w:r>
-    </w:p>
-    <w:p>
-      <w:pPr>
-        <w:spacing w:after="100" w:line="269" w:lineRule="auto"/>
-      </w:pPr>
-      <w:r>
-        <w:t>El repositorio en GitHub debe mantenerse como un activo de software seguro, limpio y transferible, apto para escrutinio público o institucional sin riesgo de filtración de información reservada:</w:t>
-      </w:r>
-    </w:p>
-    <w:p>
-      <w:pPr>
-        <w:pStyle w:val="ListBullet"/>
-        <w:spacing w:after="60" w:before="0" w:line="259" w:lineRule="auto"/>
-      </w:pPr>
-      <w:r>
-        <w:rPr>
-          <w:b/>
-        </w:rPr>
-        <w:t>Principio de Configuración 'Solo la Idea':</w:t>
-      </w:r>
-      <w:r>
-        <w:t xml:space="preserve"> El repositorio nunca versionará config.json ni respaldos reales. En su reemplazo, se mantiene config.example.json como plantilla canónica representativa del esquema v2.</w:t>
-      </w:r>
-    </w:p>
-    <w:p>
-      <w:pPr>
-        <w:pStyle w:val="ListBullet"/>
-        <w:spacing w:after="60" w:before="0" w:line="259" w:lineRule="auto"/>
-      </w:pPr>
-      <w:r>
-        <w:rPr>
-          <w:b/>
-        </w:rPr>
-        <w:t>Aislamiento de Entornos Locales:</w:t>
-      </w:r>
-      <w:r>
-        <w:t xml:space="preserve"> Los archivos operativos reales (config.json, config.privado.json, .env y turnos.log) residen exclusivamente en el equipo de la estación de trabajo y están estrictamente ignorados por .gitignore.</w:t>
-      </w:r>
-    </w:p>
-    <w:p>
-      <w:pPr>
-        <w:pStyle w:val="ListBullet"/>
-        <w:spacing w:after="60" w:before="0" w:line="259" w:lineRule="auto"/>
-      </w:pPr>
-      <w:r>
-        <w:rPr>
-          <w:b/>
-        </w:rPr>
-        <w:t>Exclusión de Artefactos Compilados:</w:t>
-      </w:r>
-      <w:r>
-        <w:t xml:space="preserve"> No se admiten ejecutables compilados (*.exe), cachés (__pycache__), ejecutables PyInstaller (build/, dist/) ni planillas Excel con datos reales en el árbol de Git.</w:t>
-      </w:r>
-    </w:p>
-    <w:tbl>
-      <w:tblPr>
-        <w:tblStyle w:val="TableGrid"/>
-        <w:tblW w:type="auto" w:w="0"/>
-        <w:jc w:val="center"/>
-        <w:tblLook w:firstColumn="1" w:firstRow="1" w:lastColumn="0" w:lastRow="0" w:noHBand="0" w:noVBand="1" w:val="04A0"/>
-        <w:tblBorders>
-          <w:top w:val="single" w:sz="12" w:space="0" w:color="B91C1C"/>
-          <w:left w:val="single" w:sz="12" w:space="0" w:color="B91C1C"/>
-          <w:bottom w:val="single" w:sz="12" w:space="0" w:color="B91C1C"/>
-          <w:right w:val="single" w:sz="12" w:space="0" w:color="B91C1C"/>
-          <w:insideH w:val="single" w:sz="12" w:space="0" w:color="B91C1C"/>
-          <w:insideV w:val="single" w:sz="12" w:space="0" w:color="B91C1C"/>
-        </w:tblBorders>
-      </w:tblPr>
-      <w:tblGrid>
-        <w:gridCol w:w="9936"/>
-      </w:tblGrid>
-      <w:tr>
-        <w:tc>
-          <w:tcPr>
-            <w:tcW w:type="dxa" w:w="9936"/>
-            <w:shd w:fill="FEF2F2"/>
-          </w:tcPr>
-          <w:p>
-            <w:pPr>
-              <w:spacing w:before="80" w:after="40"/>
-            </w:pPr>
-            <w:r/>
-            <w:r>
-              <w:rPr>
-                <w:rFonts w:ascii="Aptos" w:hAnsi="Aptos"/>
-                <w:b/>
-                <w:color w:val="B91C1C"/>
-                <w:sz w:val="19"/>
-              </w:rPr>
-              <w:t>REGLA DE ORO DE SEGURIDAD EN GIT</w:t>
-              <w:br/>
-            </w:r>
-            <w:r>
-              <w:rPr>
-                <w:rFonts w:ascii="Aptos" w:hAnsi="Aptos"/>
-                <w:color w:val="1F2937"/>
-                <w:sz w:val="17"/>
-              </w:rPr>
-              <w:t>Ningún commit debe contener información personal identificable (PII), secretos de autenticación o datos de dotación real. Si un archivo sensible se añade a Git por error, un commit posterior que lo elimine NO borra la información del historial de GitHub. Se requerirá un procedimiento de reescritura forense.</w:t>
-            </w:r>
-          </w:p>
-        </w:tc>
-      </w:tr>
-    </w:tbl>
-    <w:p>
-      <w:pPr>
-        <w:spacing w:after="40"/>
-      </w:pPr>
-    </w:p>
-    <w:p>
-      <w:pPr>
-        <w:pStyle w:val="Heading1"/>
-        <w:spacing w:before="280" w:after="80"/>
-      </w:pPr>
-      <w:r>
-        <w:t>5. Gestión de Secretos, Credenciales y Comunicaciones</w:t>
-      </w:r>
-    </w:p>
-    <w:p>
-      <w:pPr>
-        <w:spacing w:after="100" w:line="269" w:lineRule="auto"/>
-      </w:pPr>
-      <w:r>
-        <w:t>El sistema implementa mecanismos de comunicación externa (notificaciones por correo SMTP y Webhook de Google Sheets/Drive). Dichos canales deben regirse por las siguientes directrices:</w:t>
-      </w:r>
-    </w:p>
-    <w:p>
-      <w:pPr>
-        <w:pStyle w:val="ListBullet"/>
-        <w:spacing w:after="60" w:before="0" w:line="259" w:lineRule="auto"/>
-      </w:pPr>
-      <w:r>
-        <w:rPr>
-          <w:b/>
-        </w:rPr>
-        <w:t>Prohibición de Contraseñas Maestras:</w:t>
-      </w:r>
-      <w:r>
-        <w:t xml:space="preserve"> Queda terminantemente prohibido utilizar la contraseña principal de la cuenta de correo institucional o personal. Es obligatorio el uso de Contraseñas de Aplicación (App Passwords) de 16 caracteres de Google.</w:t>
-      </w:r>
-    </w:p>
-    <w:p>
-      <w:pPr>
-        <w:pStyle w:val="ListBullet"/>
-        <w:spacing w:after="60" w:before="0" w:line="259" w:lineRule="auto"/>
-      </w:pPr>
-      <w:r>
-        <w:rPr>
-          <w:b/>
-        </w:rPr>
-        <w:t>Cifrado de Canal (TLS 1.2+):</w:t>
-      </w:r>
-      <w:r>
-        <w:t xml:space="preserve"> Todas las transmisiones SMTP deben forzarse mediante TLS en el puerto 587 (SMTP_USE_TLS=true). Las invocaciones de webhook deben viajar únicamente por HTTPS seguro (puerto 443).</w:t>
-      </w:r>
-    </w:p>
-    <w:p>
-      <w:pPr>
-        <w:pStyle w:val="ListBullet"/>
-        <w:spacing w:after="60" w:before="0" w:line="259" w:lineRule="auto"/>
-      </w:pPr>
-      <w:r>
-        <w:rPr>
-          <w:b/>
-        </w:rPr>
-        <w:t>Protección de la Privacidad de los Destinatarios (CCO/BCC):</w:t>
-      </w:r>
-      <w:r>
-        <w:t xml:space="preserve"> En todo despacho de correos masivos a la dotación, las direcciones de destino deben ir en Copia Oculta (BCC) para evitar que terceros recopilen el directorio de funcionarios.</w:t>
-      </w:r>
-    </w:p>
-    <w:p>
-      <w:pPr>
-        <w:pStyle w:val="ListBullet"/>
-        <w:spacing w:after="60" w:before="0" w:line="259" w:lineRule="auto"/>
-      </w:pPr>
-      <w:r>
-        <w:rPr>
-          <w:b/>
-        </w:rPr>
-        <w:t>Resiliencia de Red y Fallo Seguro:</w:t>
-      </w:r>
-      <w:r>
-        <w:t xml:space="preserve"> Antes de iniciar peticiones de red, el sistema realiza sondeos socket de baja latencia. Si no hay conectividad, la aplicación almacena los eventos en pending_notifications.json sin bloquear la interfaz de usuario.</w:t>
+        <w:t>En resumen: El acceso a Internet se utiliza de manera exclusivamente saliente y solo cuando el operador decide voluntariamente despachar un aviso por correo electrónico institucional. En ningún momento el software sincroniza ni sube la base de datos a ningún servicio externo.</w:t>
       </w:r>
     </w:p>
     <w:p>
@@ -1158,75 +1005,75 @@
         <w:spacing w:before="280" w:after="80"/>
       </w:pPr>
       <w:r>
-        <w:t>6. Política de Copias de Seguridad (Backups) y Almacenamiento Seguro</w:t>
+        <w:t>3. Desarrollo Seguro y Cumplimiento de Normativas Legales</w:t>
       </w:r>
     </w:p>
     <w:p>
       <w:pPr>
-        <w:spacing w:after="100" w:line="269" w:lineRule="auto"/>
+        <w:spacing w:after="100" w:line="274" w:lineRule="auto"/>
       </w:pPr>
       <w:r>
-        <w:t>La continuidad operativa y la prevención ante pérdida de datos se garantiza mediante los siguientes controles técnicos implementados en el núcleo del sistema:</w:t>
+        <w:t>El desarrollo del Sistema de Gestión de Turnos fue ejecutado desde su primera línea de código aplicando rigurosos estándares de Ciberseguridad y en estricto apego al marco legal chileno vigente:</w:t>
       </w:r>
     </w:p>
     <w:p>
       <w:pPr>
         <w:pStyle w:val="ListBullet"/>
-        <w:spacing w:after="60" w:before="0" w:line="259" w:lineRule="auto"/>
+        <w:spacing w:after="60" w:before="0" w:line="264" w:lineRule="auto"/>
       </w:pPr>
       <w:r>
         <w:rPr>
           <w:b/>
         </w:rPr>
-        <w:t>Escritura Atómica en Disco:</w:t>
+        <w:t>Ley N° 19.628 sobre Protección de la Vida Privada (Chile):</w:t>
       </w:r>
       <w:r>
-        <w:t xml:space="preserve"> Para evitar que un corte de suministro eléctrico o congelamiento corrompa la base de datos, el guardado de configuración escribe primero en un archivo temporal (config.json.tmp), fuerza la sincronización a disco físico mediante os.fsync() y realiza un reemplazo atómico mediante os.replace().</w:t>
+        <w:t xml:space="preserve"> Cumple con los principios de licitud, consentimiento y finalidad. Los datos se utilizan estrictamente para organizar las guardias y no se comparten con terceros.</w:t>
       </w:r>
     </w:p>
     <w:p>
       <w:pPr>
         <w:pStyle w:val="ListBullet"/>
-        <w:spacing w:after="60" w:before="0" w:line="259" w:lineRule="auto"/>
+        <w:spacing w:after="60" w:before="0" w:line="264" w:lineRule="auto"/>
       </w:pPr>
       <w:r>
         <w:rPr>
           <w:b/>
         </w:rPr>
-        <w:t>Detección y Aislamiento de Corrupción:</w:t>
+        <w:t>Ley N° 21.663 Marco de Ciberseguridad:</w:t>
       </w:r>
       <w:r>
-        <w:t xml:space="preserve"> Si se detecta un archivo de configuración malformado o ilegible, el sistema lo aísla automáticamente renombrándolo a config.corrupted_TIMESTAMP.json y genera una estructura limpia para mantener el servicio activo.</w:t>
+        <w:t xml:space="preserve"> Adopción de medidas técnicas proactivas de protección, mitigación de riesgos y resguardo de la confidencialidad de la información operativa del personal.</w:t>
       </w:r>
     </w:p>
     <w:p>
       <w:pPr>
         <w:pStyle w:val="ListBullet"/>
-        <w:spacing w:after="60" w:before="0" w:line="259" w:lineRule="auto"/>
+        <w:spacing w:after="60" w:before="0" w:line="264" w:lineRule="auto"/>
       </w:pPr>
       <w:r>
         <w:rPr>
           <w:b/>
         </w:rPr>
-        <w:t>Rotación Automática de Respaldos:</w:t>
+        <w:t>Directrices OWASP (Open Web Application Security Project):</w:t>
       </w:r>
       <w:r>
-        <w:t xml:space="preserve"> Cada operación de cierre mensual o guardado manual genera un respaldo fechado en la carpeta local backups/. Dicha carpeta está estrictamente excluida de Git.</w:t>
+        <w:t xml:space="preserve"> Implementación de diseño seguro (Secure by Design), control de configuraciones y prevención contra fuga de información confidencial.</w:t>
       </w:r>
     </w:p>
     <w:p>
       <w:pPr>
         <w:pStyle w:val="ListBullet"/>
-        <w:spacing w:after="60" w:before="0" w:line="259" w:lineRule="auto"/>
+        <w:spacing w:after="60" w:before="0" w:line="264" w:lineRule="auto"/>
       </w:pPr>
       <w:r>
         <w:rPr>
           <w:b/>
         </w:rPr>
-        <w:t>Copia Privada de Seguridad Local:</w:t>
+        <w:t>Separación Estricta de Entornos:</w:t>
       </w:r>
       <w:r>
-        <w:t xml:space="preserve"> El archivo config.privado.json se mantiene en el equipo como respaldo de contingencia de la dotación real, fuera del alcance de cualquier sincronización remota.</w:t>
+        <w:t xml:space="preserve"> El código fuente del proyecto no contiene nombres reales, correos ni credenciales personales. Se implementó una política de anonimización absoluta en los repositorios.</w:t>
       </w:r>
     </w:p>
     <w:p>
@@ -1235,415 +1082,61 @@
         <w:spacing w:before="280" w:after="80"/>
       </w:pPr>
       <w:r>
-        <w:t>7. Procedimiento de Respuesta ante Incidentes de Seguridad</w:t>
+        <w:t>4. Protección contra Fallas Técnicas y Cortes de Energía</w:t>
       </w:r>
     </w:p>
     <w:p>
       <w:pPr>
-        <w:spacing w:after="100" w:line="269" w:lineRule="auto"/>
+        <w:spacing w:after="100" w:line="274" w:lineRule="auto"/>
       </w:pPr>
       <w:r>
-        <w:t>En caso de detectar la exposición inadvertida de credenciales, nombres reales o respaldos en un repositorio Git local o remoto en GitHub, se debe proceder de inmediato de acuerdo con las siguientes 3 fases:</w:t>
+        <w:t>Para garantizar que el trabajo del usuario final nunca se pierda ni se dañe accidentalmente, el motor del sistema cuenta con tres barreras automáticas de protección:</w:t>
       </w:r>
     </w:p>
-    <w:tbl>
-      <w:tblPr>
-        <w:tblStyle w:val="TableGrid"/>
-        <w:tblW w:type="auto" w:w="0"/>
-        <w:jc w:val="center"/>
-        <w:tblLook w:firstColumn="1" w:firstRow="1" w:lastColumn="0" w:lastRow="0" w:noHBand="0" w:noVBand="1" w:val="04A0"/>
-        <w:tblBorders>
-          <w:top w:val="single" w:sz="6" w:space="0" w:color="D1D5DB"/>
-          <w:left w:val="single" w:sz="6" w:space="0" w:color="D1D5DB"/>
-          <w:bottom w:val="single" w:sz="6" w:space="0" w:color="D1D5DB"/>
-          <w:right w:val="single" w:sz="6" w:space="0" w:color="D1D5DB"/>
-          <w:insideH w:val="single" w:sz="6" w:space="0" w:color="D1D5DB"/>
-          <w:insideV w:val="single" w:sz="6" w:space="0" w:color="D1D5DB"/>
-        </w:tblBorders>
-      </w:tblPr>
-      <w:tblGrid>
-        <w:gridCol w:w="2484"/>
-        <w:gridCol w:w="2484"/>
-        <w:gridCol w:w="2484"/>
-        <w:gridCol w:w="2484"/>
-      </w:tblGrid>
-      <w:tr>
-        <w:tc>
-          <w:tcPr>
-            <w:tcW w:type="dxa" w:w="1728"/>
-            <w:vAlign w:val="center"/>
-            <w:shd w:fill="0F766E"/>
-          </w:tcPr>
-          <w:p>
-            <w:pPr>
-              <w:spacing w:after="40" w:before="40"/>
-              <w:jc w:val="center"/>
-            </w:pPr>
-            <w:r/>
-            <w:r>
-              <w:rPr>
-                <w:rFonts w:ascii="Aptos" w:hAnsi="Aptos"/>
-                <w:b/>
-                <w:color w:val="FFFFFF"/>
-                <w:sz w:val="18"/>
-              </w:rPr>
-              <w:t>Fase</w:t>
-            </w:r>
-          </w:p>
-        </w:tc>
-        <w:tc>
-          <w:tcPr>
-            <w:tcW w:type="dxa" w:w="3888"/>
-            <w:vAlign w:val="center"/>
-            <w:shd w:fill="0F766E"/>
-          </w:tcPr>
-          <w:p>
-            <w:pPr>
-              <w:spacing w:after="40" w:before="40"/>
-              <w:jc w:val="center"/>
-            </w:pPr>
-            <w:r/>
-            <w:r>
-              <w:rPr>
-                <w:rFonts w:ascii="Aptos" w:hAnsi="Aptos"/>
-                <w:b/>
-                <w:color w:val="FFFFFF"/>
-                <w:sz w:val="18"/>
-              </w:rPr>
-              <w:t>Acción Inmediata</w:t>
-            </w:r>
-          </w:p>
-        </w:tc>
-        <w:tc>
-          <w:tcPr>
-            <w:tcW w:type="dxa" w:w="2016"/>
-            <w:vAlign w:val="center"/>
-            <w:shd w:fill="0F766E"/>
-          </w:tcPr>
-          <w:p>
-            <w:pPr>
-              <w:spacing w:after="40" w:before="40"/>
-              <w:jc w:val="center"/>
-            </w:pPr>
-            <w:r/>
-            <w:r>
-              <w:rPr>
-                <w:rFonts w:ascii="Aptos" w:hAnsi="Aptos"/>
-                <w:b/>
-                <w:color w:val="FFFFFF"/>
-                <w:sz w:val="18"/>
-              </w:rPr>
-              <w:t>Responsable</w:t>
-            </w:r>
-          </w:p>
-        </w:tc>
-        <w:tc>
-          <w:tcPr>
-            <w:tcW w:type="dxa" w:w="2160"/>
-            <w:vAlign w:val="center"/>
-            <w:shd w:fill="0F766E"/>
-          </w:tcPr>
-          <w:p>
-            <w:pPr>
-              <w:spacing w:after="40" w:before="40"/>
-              <w:jc w:val="center"/>
-            </w:pPr>
-            <w:r/>
-            <w:r>
-              <w:rPr>
-                <w:rFonts w:ascii="Aptos" w:hAnsi="Aptos"/>
-                <w:b/>
-                <w:color w:val="FFFFFF"/>
-                <w:sz w:val="18"/>
-              </w:rPr>
-              <w:t>Evidencia Generada</w:t>
-            </w:r>
-          </w:p>
-        </w:tc>
-      </w:tr>
-      <w:tr>
-        <w:tc>
-          <w:tcPr>
-            <w:tcW w:type="dxa" w:w="1728"/>
-            <w:vAlign w:val="center"/>
-            <w:shd w:fill="F0FDFA"/>
-          </w:tcPr>
-          <w:p>
-            <w:pPr>
-              <w:spacing w:after="40" w:before="40"/>
-              <w:jc w:val="left"/>
-            </w:pPr>
-            <w:r/>
-            <w:r>
-              <w:rPr>
-                <w:rFonts w:ascii="Aptos" w:hAnsi="Aptos"/>
-                <w:b w:val="0"/>
-                <w:color w:val="1F2937"/>
-                <w:sz w:val="17"/>
-              </w:rPr>
-              <w:t>Fase 1: Contención</w:t>
-            </w:r>
-          </w:p>
-        </w:tc>
-        <w:tc>
-          <w:tcPr>
-            <w:tcW w:type="dxa" w:w="3888"/>
-            <w:vAlign w:val="center"/>
-            <w:shd w:fill="F0FDFA"/>
-          </w:tcPr>
-          <w:p>
-            <w:pPr>
-              <w:spacing w:after="40" w:before="40"/>
-              <w:jc w:val="left"/>
-            </w:pPr>
-            <w:r/>
-            <w:r>
-              <w:rPr>
-                <w:rFonts w:ascii="Aptos" w:hAnsi="Aptos"/>
-                <w:b w:val="0"/>
-                <w:color w:val="1F2937"/>
-                <w:sz w:val="17"/>
-              </w:rPr>
-              <w:t>Revocar inmediatamente la Contraseña de Aplicación en Google Accounts (myaccount.google.com/apppasswords) y deshabilitar la implementación del Webhook en script.google.com.</w:t>
-            </w:r>
-          </w:p>
-        </w:tc>
-        <w:tc>
-          <w:tcPr>
-            <w:tcW w:type="dxa" w:w="2016"/>
-            <w:vAlign w:val="center"/>
-            <w:shd w:fill="F0FDFA"/>
-          </w:tcPr>
-          <w:p>
-            <w:pPr>
-              <w:spacing w:after="40" w:before="40"/>
-              <w:jc w:val="left"/>
-            </w:pPr>
-            <w:r/>
-            <w:r>
-              <w:rPr>
-                <w:rFonts w:ascii="Aptos" w:hAnsi="Aptos"/>
-                <w:b w:val="0"/>
-                <w:color w:val="1F2937"/>
-                <w:sz w:val="17"/>
-              </w:rPr>
-              <w:t>Oficial de Seguridad / Desarrollador</w:t>
-            </w:r>
-          </w:p>
-        </w:tc>
-        <w:tc>
-          <w:tcPr>
-            <w:tcW w:type="dxa" w:w="2160"/>
-            <w:vAlign w:val="center"/>
-            <w:shd w:fill="F0FDFA"/>
-          </w:tcPr>
-          <w:p>
-            <w:pPr>
-              <w:spacing w:after="40" w:before="40"/>
-              <w:jc w:val="left"/>
-            </w:pPr>
-            <w:r/>
-            <w:r>
-              <w:rPr>
-                <w:rFonts w:ascii="Aptos" w:hAnsi="Aptos"/>
-                <w:b w:val="0"/>
-                <w:color w:val="1F2937"/>
-                <w:sz w:val="17"/>
-              </w:rPr>
-              <w:t>Registro de revocación en panel de Google.</w:t>
-            </w:r>
-          </w:p>
-        </w:tc>
-      </w:tr>
-      <w:tr>
-        <w:tc>
-          <w:tcPr>
-            <w:tcW w:type="dxa" w:w="1728"/>
-            <w:vAlign w:val="center"/>
-          </w:tcPr>
-          <w:p>
-            <w:pPr>
-              <w:spacing w:after="40" w:before="40"/>
-              <w:jc w:val="left"/>
-            </w:pPr>
-            <w:r/>
-            <w:r>
-              <w:rPr>
-                <w:rFonts w:ascii="Aptos" w:hAnsi="Aptos"/>
-                <w:b w:val="0"/>
-                <w:color w:val="1F2937"/>
-                <w:sz w:val="17"/>
-              </w:rPr>
-              <w:t>Fase 2: Purga Forense</w:t>
-            </w:r>
-          </w:p>
-        </w:tc>
-        <w:tc>
-          <w:tcPr>
-            <w:tcW w:type="dxa" w:w="3888"/>
-            <w:vAlign w:val="center"/>
-          </w:tcPr>
-          <w:p>
-            <w:pPr>
-              <w:spacing w:after="40" w:before="40"/>
-              <w:jc w:val="left"/>
-            </w:pPr>
-            <w:r/>
-            <w:r>
-              <w:rPr>
-                <w:rFonts w:ascii="Aptos" w:hAnsi="Aptos"/>
-                <w:b w:val="0"/>
-                <w:color w:val="1F2937"/>
-                <w:sz w:val="17"/>
-              </w:rPr>
-              <w:t>Ejecutar git-filter-repo para reescribir el árbol de commits, eliminando permanentemente los archivos comprometidos (backups/, config.json antiguos, correos de autor internos). Forzar sincronización con git push --force --all.</w:t>
-            </w:r>
-          </w:p>
-        </w:tc>
-        <w:tc>
-          <w:tcPr>
-            <w:tcW w:type="dxa" w:w="2016"/>
-            <w:vAlign w:val="center"/>
-          </w:tcPr>
-          <w:p>
-            <w:pPr>
-              <w:spacing w:after="40" w:before="40"/>
-              <w:jc w:val="left"/>
-            </w:pPr>
-            <w:r/>
-            <w:r>
-              <w:rPr>
-                <w:rFonts w:ascii="Aptos" w:hAnsi="Aptos"/>
-                <w:b w:val="0"/>
-                <w:color w:val="1F2937"/>
-                <w:sz w:val="17"/>
-              </w:rPr>
-              <w:t>Administrador Git</w:t>
-            </w:r>
-          </w:p>
-        </w:tc>
-        <w:tc>
-          <w:tcPr>
-            <w:tcW w:type="dxa" w:w="2160"/>
-            <w:vAlign w:val="center"/>
-          </w:tcPr>
-          <w:p>
-            <w:pPr>
-              <w:spacing w:after="40" w:before="40"/>
-              <w:jc w:val="left"/>
-            </w:pPr>
-            <w:r/>
-            <w:r>
-              <w:rPr>
-                <w:rFonts w:ascii="Aptos" w:hAnsi="Aptos"/>
-                <w:b w:val="0"/>
-                <w:color w:val="1F2937"/>
-                <w:sz w:val="17"/>
-              </w:rPr>
-              <w:t>Historial Git verificado sin cadenas sensibles.</w:t>
-            </w:r>
-          </w:p>
-        </w:tc>
-      </w:tr>
-      <w:tr>
-        <w:tc>
-          <w:tcPr>
-            <w:tcW w:type="dxa" w:w="1728"/>
-            <w:vAlign w:val="center"/>
-            <w:shd w:fill="F0FDFA"/>
-          </w:tcPr>
-          <w:p>
-            <w:pPr>
-              <w:spacing w:after="40" w:before="40"/>
-              <w:jc w:val="left"/>
-            </w:pPr>
-            <w:r/>
-            <w:r>
-              <w:rPr>
-                <w:rFonts w:ascii="Aptos" w:hAnsi="Aptos"/>
-                <w:b w:val="0"/>
-                <w:color w:val="1F2937"/>
-                <w:sz w:val="17"/>
-              </w:rPr>
-              <w:t>Fase 3: Rotación y Cierre</w:t>
-            </w:r>
-          </w:p>
-        </w:tc>
-        <w:tc>
-          <w:tcPr>
-            <w:tcW w:type="dxa" w:w="3888"/>
-            <w:vAlign w:val="center"/>
-            <w:shd w:fill="F0FDFA"/>
-          </w:tcPr>
-          <w:p>
-            <w:pPr>
-              <w:spacing w:after="40" w:before="40"/>
-              <w:jc w:val="left"/>
-            </w:pPr>
-            <w:r/>
-            <w:r>
-              <w:rPr>
-                <w:rFonts w:ascii="Aptos" w:hAnsi="Aptos"/>
-                <w:b w:val="0"/>
-                <w:color w:val="1F2937"/>
-                <w:sz w:val="17"/>
-              </w:rPr>
-              <w:t>Generar nuevas credenciales SMTP y nueva URL de Webhook, actualizar el archivo local .env, registrar el incidente en la bitácora interna y notificar el cierre del evento.</w:t>
-            </w:r>
-          </w:p>
-        </w:tc>
-        <w:tc>
-          <w:tcPr>
-            <w:tcW w:type="dxa" w:w="2016"/>
-            <w:vAlign w:val="center"/>
-            <w:shd w:fill="F0FDFA"/>
-          </w:tcPr>
-          <w:p>
-            <w:pPr>
-              <w:spacing w:after="40" w:before="40"/>
-              <w:jc w:val="left"/>
-            </w:pPr>
-            <w:r/>
-            <w:r>
-              <w:rPr>
-                <w:rFonts w:ascii="Aptos" w:hAnsi="Aptos"/>
-                <w:b w:val="0"/>
-                <w:color w:val="1F2937"/>
-                <w:sz w:val="17"/>
-              </w:rPr>
-              <w:t>Jefatura de Turnos / Soporte</w:t>
-            </w:r>
-          </w:p>
-        </w:tc>
-        <w:tc>
-          <w:tcPr>
-            <w:tcW w:type="dxa" w:w="2160"/>
-            <w:vAlign w:val="center"/>
-            <w:shd w:fill="F0FDFA"/>
-          </w:tcPr>
-          <w:p>
-            <w:pPr>
-              <w:spacing w:after="40" w:before="40"/>
-              <w:jc w:val="left"/>
-            </w:pPr>
-            <w:r/>
-            <w:r>
-              <w:rPr>
-                <w:rFonts w:ascii="Aptos" w:hAnsi="Aptos"/>
-                <w:b w:val="0"/>
-                <w:color w:val="1F2937"/>
-                <w:sz w:val="17"/>
-              </w:rPr>
-              <w:t>Reporte de incidente cerrado y firmado.</w:t>
-            </w:r>
-          </w:p>
-        </w:tc>
-      </w:tr>
-    </w:tbl>
     <w:p>
       <w:pPr>
-        <w:spacing w:after="40"/>
+        <w:pStyle w:val="ListBullet"/>
+        <w:spacing w:after="60" w:before="0" w:line="264" w:lineRule="auto"/>
       </w:pPr>
+      <w:r>
+        <w:rPr>
+          <w:b/>
+        </w:rPr>
+        <w:t>Guardado Atómico (Anti-Cortes de Luz):</w:t>
+      </w:r>
+      <w:r>
+        <w:t xml:space="preserve"> Cuando usted presiona 'Guardar', el sistema escribe primero en un archivo temporal seguro, fuerza la escritura física en disco (fsync) y solo cuando el archivo está 100% íntegro reemplaza el original en una fracción de milisegundo. Si se corta la luz en medio del proceso, su información anterior no se corrompe.</w:t>
+      </w:r>
+    </w:p>
+    <w:p>
+      <w:pPr>
+        <w:pStyle w:val="ListBullet"/>
+        <w:spacing w:after="60" w:before="0" w:line="264" w:lineRule="auto"/>
+      </w:pPr>
+      <w:r>
+        <w:rPr>
+          <w:b/>
+        </w:rPr>
+        <w:t>Copias de Seguridad Fechadas Automáticas:</w:t>
+      </w:r>
+      <w:r>
+        <w:t xml:space="preserve"> Cada cierre de mes o respaldo manual genera un archivo fechado e independiente en la carpeta backups/. Si necesita revisar el estado de un mes anterior, siempre tendrá el archivo disponible.</w:t>
+      </w:r>
+    </w:p>
+    <w:p>
+      <w:pPr>
+        <w:pStyle w:val="ListBullet"/>
+        <w:spacing w:after="60" w:before="0" w:line="264" w:lineRule="auto"/>
+      </w:pPr>
+      <w:r>
+        <w:rPr>
+          <w:b/>
+        </w:rPr>
+        <w:t>Aislamiento de Errores:</w:t>
+      </w:r>
+      <w:r>
+        <w:t xml:space="preserve"> Si un archivo sufriera algún daño por causas externas al programa, el sistema automáticamente lo aísla como archivo de recuperación y restaura una base operativa limpia para permitir que el servicio continúe sin interrupciones.</w:t>
+      </w:r>
     </w:p>
     <w:p>
       <w:pPr>
@@ -1651,74 +1144,142 @@
         <w:spacing w:before="280" w:after="80"/>
       </w:pPr>
       <w:r>
-        <w:t>8. Lista de Verificación (Checklist) para Desarrolladores y Administradores</w:t>
+        <w:t>5. Preguntas Frecuentes de los Usuarios (FAQ)</w:t>
       </w:r>
     </w:p>
     <w:p>
       <w:pPr>
-        <w:spacing w:after="100" w:line="269" w:lineRule="auto"/>
+        <w:spacing w:after="100" w:line="274" w:lineRule="auto"/>
       </w:pPr>
       <w:r>
-        <w:t>Antes de autorizar cualquier pull request, commit o despliegue en producción, se debe verificar el cumplimiento del 100% de los siguientes puntos:</w:t>
+        <w:t>¿Puede alguien en Internet ver los nombres o los turnos de mi equipo?</w:t>
+      </w:r>
+    </w:p>
+    <w:p>
+      <w:pPr>
+        <w:spacing w:after="100" w:line="274" w:lineRule="auto"/>
+      </w:pPr>
+      <w:r>
+        <w:t>No. El software no publica nada en Internet. La información está almacenada en el disco local de su computadora. Nadie puede acceder sin iniciar sesión directamente en su equipo de trabajo.</w:t>
+      </w:r>
+    </w:p>
+    <w:p>
+      <w:pPr>
+        <w:spacing w:after="100" w:line="274" w:lineRule="auto"/>
+      </w:pPr>
+      <w:r>
+        <w:t>¿Si abro el programa sin conexión a Internet, funciona?</w:t>
+      </w:r>
+    </w:p>
+    <w:p>
+      <w:pPr>
+        <w:spacing w:after="100" w:line="274" w:lineRule="auto"/>
+      </w:pPr>
+      <w:r>
+        <w:t>Sí, al 100%. Usted puede planificar todo el año, rotar turnos, ingresar permisos y exportar a Excel sin tener ningún cable de red conectado.</w:t>
+      </w:r>
+    </w:p>
+    <w:p>
+      <w:pPr>
+        <w:spacing w:after="100" w:line="274" w:lineRule="auto"/>
+      </w:pPr>
+      <w:r>
+        <w:t>¿Qué datos se enviaron a plataformas de desarrollo como GitHub?</w:t>
+      </w:r>
+    </w:p>
+    <w:p>
+      <w:pPr>
+        <w:spacing w:after="100" w:line="274" w:lineRule="auto"/>
+      </w:pPr>
+      <w:r>
+        <w:t>Únicamente el código fuente de los botones, ventanas y algoritmos de rotación, acompañados de plantillas de ejemplo con nombres ficticios (Juan Perez, Maria Gonzalez). Ningún dato de funcionarios reales fue ni será subido.</w:t>
+      </w:r>
+    </w:p>
+    <w:p>
+      <w:pPr>
+        <w:pStyle w:val="Heading1"/>
+        <w:spacing w:before="280" w:after="80"/>
+      </w:pPr>
+      <w:r>
+        <w:t>6. Buenas Prácticas de Seguridad para el Operador Final</w:t>
+      </w:r>
+    </w:p>
+    <w:p>
+      <w:pPr>
+        <w:spacing w:after="100" w:line="274" w:lineRule="auto"/>
+      </w:pPr>
+      <w:r>
+        <w:t>Dado que la seguridad física de la estación de trabajo es el pilar principal de un software local, se recomienda a los operadores seguir estas sencillas pautas:</w:t>
       </w:r>
     </w:p>
     <w:p>
       <w:pPr>
         <w:pStyle w:val="ListBullet"/>
-        <w:spacing w:after="60" w:before="0" w:line="259" w:lineRule="auto"/>
+        <w:spacing w:after="60" w:before="0" w:line="264" w:lineRule="auto"/>
       </w:pPr>
       <w:r>
-        <w:t>[ ] ¿Se verificó con 'git status' que ningún archivo con PII real (config.json, backups/, *.xlsx reales) esté en el área de preparación (staged)?</w:t>
+        <w:rPr>
+          <w:b/>
+        </w:rPr>
+        <w:t>Bloqueo de Pantalla:</w:t>
+      </w:r>
+      <w:r>
+        <w:t xml:space="preserve"> Presione la tecla Windows + L cada vez que se aleje de su puesto de trabajo para evitar que personas no autorizadas manipulen las planillas.</w:t>
       </w:r>
     </w:p>
     <w:p>
       <w:pPr>
         <w:pStyle w:val="ListBullet"/>
-        <w:spacing w:after="60" w:before="0" w:line="259" w:lineRule="auto"/>
+        <w:spacing w:after="60" w:before="0" w:line="264" w:lineRule="auto"/>
       </w:pPr>
       <w:r>
-        <w:t>[ ] ¿El archivo config.example.json contiene únicamente funcionarios ficticios ('Funcionario 1') y estructura limpia sin historial de fechas reales?</w:t>
+        <w:rPr>
+          <w:b/>
+        </w:rPr>
+        <w:t>Resguardo de Planillas Excel:</w:t>
+      </w:r>
+      <w:r>
+        <w:t xml:space="preserve"> Al exportar planillas mensuales a Excel, guárdelas en carpetas institucionales con acceso restringido para los miembros autorizados del departamento.</w:t>
       </w:r>
     </w:p>
     <w:p>
       <w:pPr>
         <w:pStyle w:val="ListBullet"/>
-        <w:spacing w:after="60" w:before="0" w:line="259" w:lineRule="auto"/>
+        <w:spacing w:after="60" w:before="0" w:line="264" w:lineRule="auto"/>
       </w:pPr>
       <w:r>
-        <w:t>[ ] ¿El archivo .env.example no contiene contraseñas reales ni identificadores de scripts institucionales privados?</w:t>
+        <w:rPr>
+          <w:b/>
+        </w:rPr>
+        <w:t>Contraseñas de Correo Seguras:</w:t>
+      </w:r>
+      <w:r>
+        <w:t xml:space="preserve"> Nunca guarde contraseñas escritas en papeles o archivos de texto sin cifrar. El archivo .env del sistema cuenta con permisos locales protegidos.</w:t>
       </w:r>
     </w:p>
     <w:p>
       <w:pPr>
-        <w:pStyle w:val="ListBullet"/>
-        <w:spacing w:after="60" w:before="0" w:line="259" w:lineRule="auto"/>
+        <w:spacing w:before="400"/>
+      </w:pPr>
+    </w:p>
+    <w:p>
+      <w:pPr>
+        <w:jc w:val="center"/>
       </w:pPr>
       <w:r>
-        <w:t>[ ] ¿Las pruebas unitarias (test suite) se ejecutan con datos sintéticos y finalizan con 100% de éxito?</w:t>
+        <w:rPr>
+          <w:i/>
+          <w:color w:val="4B5563"/>
+          <w:sz w:val="18"/>
+        </w:rPr>
+        <w:t>DECLARACIÓN DE CONFORMIDAD Y SEGURIDAD TÉCNICA</w:t>
+        <w:br/>
+        <w:t>El Sistema de Gestión de Turnos cumple con todas las exigencias de privacidad, funcionamiento local autónomo y desarrollo seguro vigentes a la fecha.</w:t>
       </w:r>
     </w:p>
     <w:p>
       <w:pPr>
-        <w:pStyle w:val="ListBullet"/>
-        <w:spacing w:after="60" w:before="0" w:line="259" w:lineRule="auto"/>
-      </w:pPr>
-      <w:r>
-        <w:t>[ ] ¿El archivo .gitignore contiene todas las exclusiones requeridas (.env, config.json, config.privado.json, backups/, *.log)?</w:t>
-      </w:r>
-    </w:p>
-    <w:p>
-      <w:pPr>
-        <w:pStyle w:val="ListBullet"/>
-        <w:spacing w:after="60" w:before="0" w:line="259" w:lineRule="auto"/>
-      </w:pPr>
-      <w:r>
-        <w:t>[ ] ¿La documentación técnica y manuales de usuario utilizan capturas de pantalla con dotación de prueba anonimizada?</w:t>
-      </w:r>
-    </w:p>
-    <w:p>
-      <w:pPr>
-        <w:spacing w:before="360"/>
+        <w:spacing w:before="240"/>
       </w:pPr>
     </w:p>
     <w:p>
@@ -1728,16 +1289,16 @@
       <w:r>
         <w:rPr>
           <w:b/>
-          <w:color w:val="4B5563"/>
+          <w:color w:val="1F2937"/>
           <w:sz w:val="19"/>
         </w:rPr>
         <w:t>_____________________________________________</w:t>
         <w:br/>
         <w:t>DEPARTAMENTO DE PERSONAL</w:t>
         <w:br/>
-        <w:t>SISTEMA DE GESTIÓN Y PLANIFICACIÓN DE TURNOS</w:t>
+        <w:t>GESTIÓN OPERATIVA Y SEGURIDAD DE LA INFORMACIÓN</w:t>
         <w:br/>
-        <w:t>Aprobación Técnica y de Ciberseguridad</w:t>
+        <w:t>Validez Oficial — Periodo 2026 / 2027</w:t>
       </w:r>
     </w:p>
     <w:sectPr>
@@ -1765,7 +1326,7 @@
         <w:color w:val="6B7280"/>
         <w:sz w:val="16"/>
       </w:rPr>
-      <w:t>Confidencial / Políticas de Seguridad y Privacidad de la Información (POL-SEG-2026)</w:t>
+      <w:t>Documento Informativo Oficial para Usuarios — Seguridad, Privacidad y Garantía de Datos (2026)</w:t>
     </w:r>
   </w:p>
 </w:ftr>
@@ -2222,7 +1783,7 @@
       <w:b/>
       <w:bCs/>
       <w:color w:val="0F766E"/>
-      <w:sz w:val="28"/>
+      <w:sz w:val="27"/>
       <w:szCs w:val="28"/>
     </w:rPr>
   </w:style>
@@ -2513,7 +2074,7 @@
       <w:color w:val="115E59"/>
       <w:spacing w:val="5"/>
       <w:kern w:val="28"/>
-      <w:sz w:val="48"/>
+      <w:sz w:val="44"/>
       <w:szCs w:val="52"/>
     </w:rPr>
   </w:style>
@@ -2546,12 +2107,12 @@
       </w:numPr>
     </w:pPr>
     <w:rPr>
-      <w:rFonts w:asciiTheme="majorHAnsi" w:eastAsiaTheme="majorEastAsia" w:hAnsiTheme="majorHAnsi" w:cstheme="majorBidi" w:ascii="Aptos" w:hAnsi="Aptos"/>
+      <w:rFonts w:asciiTheme="majorHAnsi" w:eastAsiaTheme="majorEastAsia" w:hAnsiTheme="majorHAnsi" w:cstheme="majorBidi"/>
       <w:i/>
       <w:iCs/>
-      <w:color w:val="4B5563"/>
+      <w:color w:val="4F81BD" w:themeColor="accent1"/>
       <w:spacing w:val="15"/>
-      <w:sz w:val="22"/>
+      <w:sz w:val="24"/>
       <w:szCs w:val="24"/>
     </w:rPr>
   </w:style>

</xml_diff>

<commit_message>
chore: remove document generation python scripts and obsolete policy documents
</commit_message>
<xml_diff>
--- a/Politicas_y_Seguridad_del_Sistema.docx
+++ b/Politicas_y_Seguridad_del_Sistema.docx
@@ -1,16 +1,18 @@
 
 <file path=word/document.xml><?xml version="1.0" encoding="utf-8"?>
-<w:document xmlns:wpc="http://schemas.microsoft.com/office/word/2010/wordprocessingCanvas" xmlns:mo="http://schemas.microsoft.com/office/mac/office/2008/main" xmlns:mc="http://schemas.openxmlformats.org/markup-compatibility/2006" xmlns:mv="urn:schemas-microsoft-com:mac:vml" xmlns:o="urn:schemas-microsoft-com:office:office" xmlns:r="http://schemas.openxmlformats.org/officeDocument/2006/relationships" xmlns:m="http://schemas.openxmlformats.org/officeDocument/2006/math" xmlns:v="urn:schemas-microsoft-com:vml" xmlns:wp14="http://schemas.microsoft.com/office/word/2010/wordprocessingDrawing" xmlns:wp="http://schemas.openxmlformats.org/drawingml/2006/wordprocessingDrawing" xmlns:w10="urn:schemas-microsoft-com:office:word" xmlns:w="http://schemas.openxmlformats.org/wordprocessingml/2006/main" xmlns:w14="http://schemas.microsoft.com/office/word/2010/wordml" xmlns:wpg="http://schemas.microsoft.com/office/word/2010/wordprocessingGroup" xmlns:wpi="http://schemas.microsoft.com/office/word/2010/wordprocessingInk" xmlns:wne="http://schemas.microsoft.com/office/word/2006/wordml" xmlns:wps="http://schemas.microsoft.com/office/word/2010/wordprocessingShape" mc:Ignorable="w14 wp14">
+<w:document xmlns:ve="http://schemas.openxmlformats.org/markup-compatibility/2006" xmlns:o="urn:schemas-microsoft-com:office:office" xmlns:r="http://schemas.openxmlformats.org/officeDocument/2006/relationships" xmlns:m="http://schemas.openxmlformats.org/officeDocument/2006/math" xmlns:v="urn:schemas-microsoft-com:vml" xmlns:wp="http://schemas.openxmlformats.org/drawingml/2006/wordprocessingDrawing" xmlns:w10="urn:schemas-microsoft-com:office:word" xmlns:w="http://schemas.openxmlformats.org/wordprocessingml/2006/main" xmlns:wne="http://schemas.microsoft.com/office/word/2006/wordml">
   <w:body>
     <w:p>
       <w:pPr>
         <w:spacing w:after="40"/>
+        <w:rPr>
+          <w:rFonts w:hint="eastAsia"/>
+        </w:rPr>
       </w:pPr>
       <w:r>
         <w:rPr>
           <w:b/>
           <w:color w:val="0F766E"/>
-          <w:sz w:val="19"/>
         </w:rPr>
         <w:t>DEPARTAMENTO DE PERSONAL — GESTIÓN OPERATIVA DE TURNOS</w:t>
       </w:r>
@@ -18,6 +20,9 @@
     <w:p>
       <w:pPr>
         <w:spacing w:before="80" w:after="80"/>
+        <w:rPr>
+          <w:rFonts w:hint="eastAsia"/>
+        </w:rPr>
       </w:pPr>
       <w:r>
         <w:rPr>
@@ -30,221 +35,124 @@
     </w:p>
     <w:p>
       <w:pPr>
-        <w:spacing w:after="200"/>
+        <w:rPr>
+          <w:rFonts w:hint="eastAsia"/>
+        </w:rPr>
       </w:pPr>
       <w:r>
         <w:rPr>
           <w:color w:val="4B5563"/>
           <w:sz w:val="20"/>
         </w:rPr>
-        <w:t>Información oficial para el usuario final: funcionamiento 100% local, no filtración de datos, control de conexiones a Internet y cumplimiento de estándares de seguridad.</w:t>
+        <w:t xml:space="preserve">Información oficial para el usuario final: funcionamiento 100% local, no filtración de datos, control de conexiones a Internet y cumplimiento de </w:t>
+      </w:r>
+      <w:r>
+        <w:rPr>
+          <w:color w:val="4B5563"/>
+          <w:sz w:val="20"/>
+        </w:rPr>
+        <w:t>estándares de seguridad.</w:t>
       </w:r>
     </w:p>
     <w:tbl>
       <w:tblPr>
-        <w:tblStyle w:val="TableGrid"/>
-        <w:tblW w:type="auto" w:w="0"/>
+        <w:tblStyle w:val="Tablaconcuadrcula"/>
+        <w:tblW w:w="0" w:type="auto"/>
         <w:jc w:val="center"/>
-        <w:tblLook w:firstColumn="1" w:firstRow="1" w:lastColumn="0" w:lastRow="0" w:noHBand="0" w:noVBand="1" w:val="04A0"/>
         <w:tblBorders>
-          <w:top w:val="single" w:sz="6" w:space="0" w:color="D1D5DB"/>
-          <w:left w:val="single" w:sz="6" w:space="0" w:color="D1D5DB"/>
-          <w:bottom w:val="single" w:sz="6" w:space="0" w:color="D1D5DB"/>
-          <w:right w:val="single" w:sz="6" w:space="0" w:color="D1D5DB"/>
-          <w:insideH w:val="single" w:sz="6" w:space="0" w:color="D1D5DB"/>
-          <w:insideV w:val="single" w:sz="6" w:space="0" w:color="D1D5DB"/>
+          <w:top w:val="single" w:sz="12" w:space="0" w:color="16A34A"/>
+          <w:left w:val="single" w:sz="12" w:space="0" w:color="16A34A"/>
+          <w:bottom w:val="single" w:sz="12" w:space="0" w:color="16A34A"/>
+          <w:right w:val="single" w:sz="12" w:space="0" w:color="16A34A"/>
+          <w:insideH w:val="single" w:sz="12" w:space="0" w:color="16A34A"/>
+          <w:insideV w:val="single" w:sz="12" w:space="0" w:color="16A34A"/>
         </w:tblBorders>
+        <w:tblLook w:val="04A0"/>
       </w:tblPr>
       <w:tblGrid>
-        <w:gridCol w:w="2484"/>
-        <w:gridCol w:w="2484"/>
-        <w:gridCol w:w="2484"/>
-        <w:gridCol w:w="2484"/>
+        <w:gridCol w:w="9936"/>
       </w:tblGrid>
       <w:tr>
+        <w:trPr>
+          <w:jc w:val="center"/>
+        </w:trPr>
         <w:tc>
           <w:tcPr>
-            <w:tcW w:type="dxa" w:w="2880"/>
-            <w:vAlign w:val="center"/>
-            <w:shd w:fill="0F766E"/>
+            <w:tcW w:w="9936" w:type="dxa"/>
+            <w:shd w:val="clear" w:color="auto" w:fill="F0FDF4"/>
           </w:tcPr>
           <w:p>
             <w:pPr>
-              <w:spacing w:after="50" w:before="50"/>
-              <w:jc w:val="center"/>
+              <w:spacing w:before="100" w:after="60" w:line="269" w:lineRule="auto"/>
+              <w:rPr>
+                <w:rFonts w:hint="eastAsia"/>
+              </w:rPr>
             </w:pPr>
-            <w:r/>
             <w:r>
               <w:rPr>
-                <w:rFonts w:ascii="Aptos" w:hAnsi="Aptos"/>
+                <w:rFonts w:ascii="Times New Roman" w:hAnsi="Times New Roman" w:cs="Times New Roman"/>
                 <w:b/>
-                <w:color w:val="FFFFFF"/>
-                <w:sz w:val="18"/>
+                <w:color w:val="16A34A"/>
               </w:rPr>
-              <w:t>Código de Documento</w:t>
+              <w:t>✅</w:t>
             </w:r>
-          </w:p>
-        </w:tc>
-        <w:tc>
-          <w:tcPr>
-            <w:tcW w:type="dxa" w:w="2016"/>
-            <w:vAlign w:val="center"/>
-            <w:shd w:fill="0F766E"/>
-          </w:tcPr>
-          <w:p>
-            <w:pPr>
-              <w:spacing w:after="50" w:before="50"/>
-              <w:jc w:val="center"/>
-            </w:pPr>
-            <w:r/>
             <w:r>
               <w:rPr>
-                <w:rFonts w:ascii="Aptos" w:hAnsi="Aptos"/>
                 <w:b/>
-                <w:color w:val="FFFFFF"/>
-                <w:sz w:val="18"/>
+                <w:color w:val="16A34A"/>
               </w:rPr>
-              <w:t>Versión</w:t>
+              <w:t xml:space="preserve"> DECLARACIÓN OFICIAL: SUS DATOS ESTÁN SEGUROS Y NUNCA</w:t>
             </w:r>
-          </w:p>
-        </w:tc>
-        <w:tc>
-          <w:tcPr>
-            <w:tcW w:type="dxa" w:w="3312"/>
-            <w:vAlign w:val="center"/>
-            <w:shd w:fill="0F766E"/>
-          </w:tcPr>
-          <w:p>
-            <w:pPr>
-              <w:spacing w:after="50" w:before="50"/>
-              <w:jc w:val="center"/>
-            </w:pPr>
-            <w:r/>
             <w:r>
               <w:rPr>
-                <w:rFonts w:ascii="Aptos" w:hAnsi="Aptos"/>
                 <w:b/>
-                <w:color w:val="FFFFFF"/>
-                <w:sz w:val="18"/>
+                <w:color w:val="16A34A"/>
               </w:rPr>
-              <w:t>Audiencia</w:t>
+              <w:t xml:space="preserve"> FUERON FILTRADOS</w:t>
             </w:r>
-          </w:p>
-        </w:tc>
-        <w:tc>
-          <w:tcPr>
-            <w:tcW w:type="dxa" w:w="2592"/>
-            <w:vAlign w:val="center"/>
-            <w:shd w:fill="0F766E"/>
-          </w:tcPr>
-          <w:p>
-            <w:pPr>
-              <w:spacing w:after="50" w:before="50"/>
-              <w:jc w:val="center"/>
-            </w:pPr>
-            <w:r/>
             <w:r>
               <w:rPr>
-                <w:rFonts w:ascii="Aptos" w:hAnsi="Aptos"/>
                 <w:b/>
-                <w:color w:val="FFFFFF"/>
-                <w:sz w:val="18"/>
+                <w:color w:val="16A34A"/>
               </w:rPr>
-              <w:t>Estado de Seguridad</w:t>
+              <w:br/>
             </w:r>
-          </w:p>
-        </w:tc>
-      </w:tr>
-      <w:tr>
-        <w:tc>
-          <w:tcPr>
-            <w:tcW w:type="dxa" w:w="2880"/>
-            <w:vAlign w:val="center"/>
-            <w:shd w:fill="F0FDFA"/>
-          </w:tcPr>
-          <w:p>
-            <w:pPr>
-              <w:spacing w:after="50" w:before="50"/>
-              <w:jc w:val="left"/>
-            </w:pPr>
-            <w:r/>
             <w:r>
               <w:rPr>
-                <w:rFonts w:ascii="Aptos" w:hAnsi="Aptos"/>
-                <w:b w:val="0"/>
-                <w:color w:val="1F2937"/>
                 <w:sz w:val="17"/>
               </w:rPr>
-              <w:t>SEG-USR-TURNOS-2026</w:t>
+              <w:t>Se certifica formalmente a todos los usuarios, funcionarios y jefaturas que los datos reales de dotación, nombres, turnos, correos y motivos de excepción NUNCA han sido filtrados, expuestos ni subidos a servidores públicos de Internet.</w:t>
             </w:r>
-          </w:p>
-        </w:tc>
-        <w:tc>
-          <w:tcPr>
-            <w:tcW w:type="dxa" w:w="2016"/>
-            <w:vAlign w:val="center"/>
-            <w:shd w:fill="F0FDFA"/>
-          </w:tcPr>
-          <w:p>
-            <w:pPr>
-              <w:spacing w:after="50" w:before="50"/>
-              <w:jc w:val="left"/>
-            </w:pPr>
-            <w:r/>
             <w:r>
               <w:rPr>
-                <w:rFonts w:ascii="Aptos" w:hAnsi="Aptos"/>
-                <w:b w:val="0"/>
-                <w:color w:val="1F2937"/>
                 <w:sz w:val="17"/>
               </w:rPr>
-              <w:t>2.0 (Usuario Final)</w:t>
+              <w:br/>
             </w:r>
-          </w:p>
-        </w:tc>
-        <w:tc>
-          <w:tcPr>
-            <w:tcW w:type="dxa" w:w="3312"/>
-            <w:vAlign w:val="center"/>
-            <w:shd w:fill="F0FDFA"/>
-          </w:tcPr>
-          <w:p>
-            <w:pPr>
-              <w:spacing w:after="50" w:before="50"/>
-              <w:jc w:val="left"/>
-            </w:pPr>
-            <w:r/>
             <w:r>
               <w:rPr>
-                <w:rFonts w:ascii="Aptos" w:hAnsi="Aptos"/>
-                <w:b w:val="0"/>
-                <w:color w:val="1F2937"/>
                 <w:sz w:val="17"/>
               </w:rPr>
-              <w:t>Usuarios Operativos, Jefaturas y Auditores</w:t>
+              <w:br/>
+              <w:t>E</w:t>
             </w:r>
-          </w:p>
-        </w:tc>
-        <w:tc>
-          <w:tcPr>
-            <w:tcW w:type="dxa" w:w="2592"/>
-            <w:vAlign w:val="center"/>
-            <w:shd w:fill="F0FDFA"/>
-          </w:tcPr>
-          <w:p>
-            <w:pPr>
-              <w:spacing w:after="50" w:before="50"/>
-              <w:jc w:val="left"/>
-            </w:pPr>
-            <w:r/>
             <w:r>
               <w:rPr>
-                <w:rFonts w:ascii="Aptos" w:hAnsi="Aptos"/>
-                <w:b w:val="0"/>
-                <w:color w:val="1F2937"/>
                 <w:sz w:val="17"/>
               </w:rPr>
-              <w:t>100% Seguro / Datos No Filtrados</w:t>
+              <w:t>l código publicado en plataformas de desarrollo contiene exclusivamente plantillas con datos de prueba ficticios</w:t>
+            </w:r>
+            <w:r>
+              <w:rPr>
+                <w:sz w:val="17"/>
+              </w:rPr>
+              <w:t xml:space="preserve"> sin ninguna relación con el personal real. La información de trabajo reside única y exclusivamente dentro de e</w:t>
+            </w:r>
+            <w:r>
+              <w:rPr>
+                <w:sz w:val="17"/>
+              </w:rPr>
+              <w:t>ste computador.</w:t>
             </w:r>
           </w:p>
         </w:tc>
@@ -253,70 +161,14 @@
     <w:p>
       <w:pPr>
         <w:spacing w:after="40"/>
-      </w:pPr>
-    </w:p>
-    <w:tbl>
-      <w:tblPr>
-        <w:tblStyle w:val="TableGrid"/>
-        <w:tblW w:type="auto" w:w="0"/>
-        <w:jc w:val="center"/>
-        <w:tblLook w:firstColumn="1" w:firstRow="1" w:lastColumn="0" w:lastRow="0" w:noHBand="0" w:noVBand="1" w:val="04A0"/>
-        <w:tblBorders>
-          <w:top w:val="single" w:sz="12" w:space="0" w:color="16A34A"/>
-          <w:left w:val="single" w:sz="12" w:space="0" w:color="16A34A"/>
-          <w:bottom w:val="single" w:sz="12" w:space="0" w:color="16A34A"/>
-          <w:right w:val="single" w:sz="12" w:space="0" w:color="16A34A"/>
-          <w:insideH w:val="single" w:sz="12" w:space="0" w:color="16A34A"/>
-          <w:insideV w:val="single" w:sz="12" w:space="0" w:color="16A34A"/>
-        </w:tblBorders>
-      </w:tblPr>
-      <w:tblGrid>
-        <w:gridCol w:w="9936"/>
-      </w:tblGrid>
-      <w:tr>
-        <w:tc>
-          <w:tcPr>
-            <w:tcW w:type="dxa" w:w="9936"/>
-            <w:shd w:fill="F0FDF4"/>
-          </w:tcPr>
-          <w:p>
-            <w:pPr>
-              <w:spacing w:before="100" w:after="60" w:line="269" w:lineRule="auto"/>
-            </w:pPr>
-            <w:r/>
-            <w:r>
-              <w:rPr>
-                <w:rFonts w:ascii="Aptos" w:hAnsi="Aptos"/>
-                <w:b/>
-                <w:color w:val="16A34A"/>
-                <w:sz w:val="19"/>
-              </w:rPr>
-              <w:t>✅ DECLARACIÓN OFICIAL: SUS DATOS ESTÁN SEGUROS Y NUNCA FUERON FILTRADOS</w:t>
-              <w:br/>
-            </w:r>
-            <w:r>
-              <w:rPr>
-                <w:rFonts w:ascii="Aptos" w:hAnsi="Aptos"/>
-                <w:color w:val="1F2937"/>
-                <w:sz w:val="17"/>
-              </w:rPr>
-              <w:t>Se certifica formalmente a todos los usuarios, funcionarios y jefaturas que los datos reales de dotación, nombres, turnos, correos y motivos de excepción NUNCA han sido filtrados, expuestos ni subidos a servidores públicos de Internet.</w:t>
-              <w:br/>
-              <w:br/>
-              <w:t>El código publicado en plataformas de desarrollo contiene exclusivamente plantillas con datos de prueba ficticios ('Juan Perez', 'Maria Gonzalez') sin ninguna relación con el personal real. La información de trabajo reside única y exclusivamente dentro de este computador.</w:t>
-            </w:r>
-          </w:p>
-        </w:tc>
-      </w:tr>
-    </w:tbl>
-    <w:p>
-      <w:pPr>
-        <w:spacing w:after="40"/>
+        <w:rPr>
+          <w:rFonts w:hint="eastAsia"/>
+        </w:rPr>
       </w:pPr>
     </w:p>
     <w:p>
       <w:pPr>
-        <w:pStyle w:val="Heading1"/>
+        <w:pStyle w:val="Ttulo1"/>
         <w:spacing w:before="280" w:after="80"/>
       </w:pPr>
       <w:r>
@@ -326,15 +178,24 @@
     <w:p>
       <w:pPr>
         <w:spacing w:after="100" w:line="274" w:lineRule="auto"/>
+        <w:rPr>
+          <w:rFonts w:hint="eastAsia"/>
+        </w:rPr>
       </w:pPr>
       <w:r>
-        <w:t>Una de las mayores ventajas del Sistema de Gestión de Turnos es que fue concebido bajo el principio de Soberanía de Datos y Ejecución Local. A diferencia de las plataformas web en la nube donde la información se envía a servidores desconocidos, este sistema funciona en su propio computador:</w:t>
+        <w:t xml:space="preserve">Una de las mayores ventajas del Sistema de Gestión de Turnos es que fue concebido bajo el principio de Soberanía de Datos y Ejecución Local. A diferencia de las plataformas </w:t>
+      </w:r>
+      <w:r>
+        <w:t>web en la nube donde la información se envía a servidores desconocidos, este sistema funciona en su propio computador:</w:t>
       </w:r>
     </w:p>
     <w:p>
       <w:pPr>
-        <w:pStyle w:val="ListBullet"/>
-        <w:spacing w:after="60" w:before="0" w:line="264" w:lineRule="auto"/>
+        <w:pStyle w:val="Listaconvietas"/>
+        <w:spacing w:after="60" w:line="264" w:lineRule="auto"/>
+        <w:rPr>
+          <w:rFonts w:hint="eastAsia"/>
+        </w:rPr>
       </w:pPr>
       <w:r>
         <w:rPr>
@@ -343,13 +204,19 @@
         <w:t>Base de Datos en su Computador:</w:t>
       </w:r>
       <w:r>
-        <w:t xml:space="preserve"> Toda la lista de personas, su historial de turnos y las excepciones guardadas se almacenan localmente en el archivo config.json (o en la carpeta privada de su usuario en Windows).</w:t>
+        <w:t xml:space="preserve"> Toda la lista de personas, su historial de turnos y las excepciones guardadas se almacenan localmente en </w:t>
+      </w:r>
+      <w:r>
+        <w:t>el archivo config.json (o en la carpeta privada de su usuario en Windows).</w:t>
       </w:r>
     </w:p>
     <w:p>
       <w:pPr>
-        <w:pStyle w:val="ListBullet"/>
-        <w:spacing w:after="60" w:before="0" w:line="264" w:lineRule="auto"/>
+        <w:pStyle w:val="Listaconvietas"/>
+        <w:spacing w:after="60" w:line="264" w:lineRule="auto"/>
+        <w:rPr>
+          <w:rFonts w:hint="eastAsia"/>
+        </w:rPr>
       </w:pPr>
       <w:r>
         <w:rPr>
@@ -363,14 +230,23 @@
     </w:p>
     <w:p>
       <w:pPr>
-        <w:pStyle w:val="ListBullet"/>
-        <w:spacing w:after="60" w:before="0" w:line="264" w:lineRule="auto"/>
+        <w:pStyle w:val="Listaconvietas"/>
+        <w:spacing w:after="60" w:line="264" w:lineRule="auto"/>
+        <w:rPr>
+          <w:rFonts w:hint="eastAsia"/>
+        </w:rPr>
       </w:pPr>
       <w:r>
         <w:rPr>
           <w:b/>
         </w:rPr>
-        <w:t>Respaldos Automáticos en Disco:</w:t>
+        <w:t>Respaldos Aut</w:t>
+      </w:r>
+      <w:r>
+        <w:rPr>
+          <w:b/>
+        </w:rPr>
+        <w:t>omáticos en Disco:</w:t>
       </w:r>
       <w:r>
         <w:t xml:space="preserve"> Cada vez que usted guarda o cierra un mes, el sistema genera una copia de seguridad en la carpeta local backups/ dentro de su propio equipo.</w:t>
@@ -378,8 +254,11 @@
     </w:p>
     <w:p>
       <w:pPr>
-        <w:pStyle w:val="ListBullet"/>
-        <w:spacing w:after="60" w:before="0" w:line="264" w:lineRule="auto"/>
+        <w:pStyle w:val="Listaconvietas"/>
+        <w:spacing w:after="60" w:line="264" w:lineRule="auto"/>
+        <w:rPr>
+          <w:rFonts w:hint="eastAsia"/>
+        </w:rPr>
       </w:pPr>
       <w:r>
         <w:rPr>
@@ -388,12 +267,15 @@
         <w:t>Control Físico Absoluto:</w:t>
       </w:r>
       <w:r>
-        <w:t xml:space="preserve"> Nadie desde el exterior puede leer, modificar ni acceder a sus planillas sin tener acceso físico o de sesión a este equipo de trabajo.</w:t>
+        <w:t xml:space="preserve"> Nadie desde el exterior puede leer, modificar ni acceder a sus planilla</w:t>
+      </w:r>
+      <w:r>
+        <w:t>s sin tener acceso físico o de sesión a este equipo de trabajo.</w:t>
       </w:r>
     </w:p>
     <w:p>
       <w:pPr>
-        <w:pStyle w:val="Heading1"/>
+        <w:pStyle w:val="Ttulo1"/>
         <w:spacing w:before="280" w:after="80"/>
       </w:pPr>
       <w:r>
@@ -403,17 +285,22 @@
     <w:p>
       <w:pPr>
         <w:spacing w:after="100" w:line="274" w:lineRule="auto"/>
+        <w:rPr>
+          <w:rFonts w:hint="eastAsia"/>
+        </w:rPr>
       </w:pPr>
       <w:r>
-        <w:t>Muchos usuarios se preguntan si tener el computador conectado a Internet puede poner en riesgo sus datos. La respuesta técnica es categórica: NO existe riesgo de filtración. A continuación explicamos de manera transparente y simple cómo interactúa el programa con la red:</w:t>
+        <w:t>Muchos usuarios se preguntan si tener el computador conectado a Internet puede poner en riesgo sus datos. La respuesta té</w:t>
+      </w:r>
+      <w:r>
+        <w:t>cnica es categórica: NO existe riesgo de filtración. A continuación explicamos de manera transparente y simple cómo interactúa el programa con la red:</w:t>
       </w:r>
     </w:p>
     <w:tbl>
       <w:tblPr>
-        <w:tblStyle w:val="TableGrid"/>
-        <w:tblW w:type="auto" w:w="0"/>
+        <w:tblStyle w:val="Tablaconcuadrcula"/>
+        <w:tblW w:w="0" w:type="auto"/>
         <w:jc w:val="center"/>
-        <w:tblLook w:firstColumn="1" w:firstRow="1" w:lastColumn="0" w:lastRow="0" w:noHBand="0" w:noVBand="1" w:val="04A0"/>
         <w:tblBorders>
           <w:top w:val="single" w:sz="6" w:space="0" w:color="D1D5DB"/>
           <w:left w:val="single" w:sz="6" w:space="0" w:color="D1D5DB"/>
@@ -422,29 +309,34 @@
           <w:insideH w:val="single" w:sz="6" w:space="0" w:color="D1D5DB"/>
           <w:insideV w:val="single" w:sz="6" w:space="0" w:color="D1D5DB"/>
         </w:tblBorders>
+        <w:tblLook w:val="04A0"/>
       </w:tblPr>
       <w:tblGrid>
-        <w:gridCol w:w="2484"/>
-        <w:gridCol w:w="2484"/>
-        <w:gridCol w:w="2484"/>
-        <w:gridCol w:w="2484"/>
+        <w:gridCol w:w="2121"/>
+        <w:gridCol w:w="3514"/>
+        <w:gridCol w:w="1702"/>
+        <w:gridCol w:w="2815"/>
       </w:tblGrid>
       <w:tr>
+        <w:trPr>
+          <w:jc w:val="center"/>
+        </w:trPr>
         <w:tc>
           <w:tcPr>
-            <w:tcW w:type="dxa" w:w="2160"/>
+            <w:tcW w:w="2160" w:type="dxa"/>
+            <w:shd w:val="clear" w:color="auto" w:fill="0F766E"/>
             <w:vAlign w:val="center"/>
-            <w:shd w:fill="0F766E"/>
           </w:tcPr>
           <w:p>
             <w:pPr>
-              <w:spacing w:after="50" w:before="50"/>
+              <w:spacing w:before="50" w:after="50"/>
               <w:jc w:val="center"/>
+              <w:rPr>
+                <w:rFonts w:hint="eastAsia"/>
+              </w:rPr>
             </w:pPr>
-            <w:r/>
             <w:r>
               <w:rPr>
-                <w:rFonts w:ascii="Aptos" w:hAnsi="Aptos"/>
                 <w:b/>
                 <w:color w:val="FFFFFF"/>
                 <w:sz w:val="18"/>
@@ -455,19 +347,20 @@
         </w:tc>
         <w:tc>
           <w:tcPr>
-            <w:tcW w:type="dxa" w:w="3600"/>
+            <w:tcW w:w="3600" w:type="dxa"/>
+            <w:shd w:val="clear" w:color="auto" w:fill="0F766E"/>
             <w:vAlign w:val="center"/>
-            <w:shd w:fill="0F766E"/>
           </w:tcPr>
           <w:p>
             <w:pPr>
-              <w:spacing w:after="50" w:before="50"/>
+              <w:spacing w:before="50" w:after="50"/>
               <w:jc w:val="center"/>
+              <w:rPr>
+                <w:rFonts w:hint="eastAsia"/>
+              </w:rPr>
             </w:pPr>
-            <w:r/>
             <w:r>
               <w:rPr>
-                <w:rFonts w:ascii="Aptos" w:hAnsi="Aptos"/>
                 <w:b/>
                 <w:color w:val="FFFFFF"/>
                 <w:sz w:val="18"/>
@@ -478,19 +371,20 @@
         </w:tc>
         <w:tc>
           <w:tcPr>
-            <w:tcW w:type="dxa" w:w="1728"/>
+            <w:tcW w:w="1728" w:type="dxa"/>
+            <w:shd w:val="clear" w:color="auto" w:fill="0F766E"/>
             <w:vAlign w:val="center"/>
-            <w:shd w:fill="0F766E"/>
           </w:tcPr>
           <w:p>
             <w:pPr>
-              <w:spacing w:after="50" w:before="50"/>
+              <w:spacing w:before="50" w:after="50"/>
               <w:jc w:val="center"/>
+              <w:rPr>
+                <w:rFonts w:hint="eastAsia"/>
+              </w:rPr>
             </w:pPr>
-            <w:r/>
             <w:r>
               <w:rPr>
-                <w:rFonts w:ascii="Aptos" w:hAnsi="Aptos"/>
                 <w:b/>
                 <w:color w:val="FFFFFF"/>
                 <w:sz w:val="18"/>
@@ -501,19 +395,20 @@
         </w:tc>
         <w:tc>
           <w:tcPr>
-            <w:tcW w:type="dxa" w:w="2880"/>
+            <w:tcW w:w="2880" w:type="dxa"/>
+            <w:shd w:val="clear" w:color="auto" w:fill="0F766E"/>
             <w:vAlign w:val="center"/>
-            <w:shd w:fill="0F766E"/>
           </w:tcPr>
           <w:p>
             <w:pPr>
-              <w:spacing w:after="50" w:before="50"/>
+              <w:spacing w:before="50" w:after="50"/>
               <w:jc w:val="center"/>
+              <w:rPr>
+                <w:rFonts w:hint="eastAsia"/>
+              </w:rPr>
             </w:pPr>
-            <w:r/>
             <w:r>
               <w:rPr>
-                <w:rFonts w:ascii="Aptos" w:hAnsi="Aptos"/>
                 <w:b/>
                 <w:color w:val="FFFFFF"/>
                 <w:sz w:val="18"/>
@@ -524,46 +419,51 @@
         </w:tc>
       </w:tr>
       <w:tr>
+        <w:trPr>
+          <w:jc w:val="center"/>
+        </w:trPr>
         <w:tc>
           <w:tcPr>
-            <w:tcW w:type="dxa" w:w="2160"/>
+            <w:tcW w:w="2160" w:type="dxa"/>
+            <w:shd w:val="clear" w:color="auto" w:fill="F0FDFA"/>
             <w:vAlign w:val="center"/>
-            <w:shd w:fill="F0FDFA"/>
           </w:tcPr>
           <w:p>
             <w:pPr>
-              <w:spacing w:after="50" w:before="50"/>
-              <w:jc w:val="left"/>
+              <w:spacing w:before="50" w:after="50"/>
+              <w:rPr>
+                <w:rFonts w:hint="eastAsia"/>
+              </w:rPr>
             </w:pPr>
-            <w:r/>
             <w:r>
               <w:rPr>
-                <w:rFonts w:ascii="Aptos" w:hAnsi="Aptos"/>
-                <w:b w:val="0"/>
-                <w:color w:val="1F2937"/>
                 <w:sz w:val="17"/>
               </w:rPr>
-              <w:t>¿El programa recibe conexiones?</w:t>
+              <w:t xml:space="preserve">¿El programa recibe </w:t>
+            </w:r>
+            <w:r>
+              <w:rPr>
+                <w:sz w:val="17"/>
+              </w:rPr>
+              <w:t>conexiones?</w:t>
             </w:r>
           </w:p>
         </w:tc>
         <w:tc>
           <w:tcPr>
-            <w:tcW w:type="dxa" w:w="3600"/>
+            <w:tcW w:w="3600" w:type="dxa"/>
+            <w:shd w:val="clear" w:color="auto" w:fill="F0FDFA"/>
             <w:vAlign w:val="center"/>
-            <w:shd w:fill="F0FDFA"/>
           </w:tcPr>
           <w:p>
             <w:pPr>
-              <w:spacing w:after="50" w:before="50"/>
-              <w:jc w:val="left"/>
+              <w:spacing w:before="50" w:after="50"/>
+              <w:rPr>
+                <w:rFonts w:hint="eastAsia"/>
+              </w:rPr>
             </w:pPr>
-            <w:r/>
             <w:r>
               <w:rPr>
-                <w:rFonts w:ascii="Aptos" w:hAnsi="Aptos"/>
-                <w:b w:val="0"/>
-                <w:color w:val="1F2937"/>
                 <w:sz w:val="17"/>
               </w:rPr>
               <w:t>NO. El programa NO abre puertos ni actúa como servidor web.</w:t>
@@ -572,21 +472,19 @@
         </w:tc>
         <w:tc>
           <w:tcPr>
-            <w:tcW w:type="dxa" w:w="1728"/>
+            <w:tcW w:w="1728" w:type="dxa"/>
+            <w:shd w:val="clear" w:color="auto" w:fill="F0FDFA"/>
             <w:vAlign w:val="center"/>
-            <w:shd w:fill="F0FDFA"/>
           </w:tcPr>
           <w:p>
             <w:pPr>
-              <w:spacing w:after="50" w:before="50"/>
-              <w:jc w:val="left"/>
+              <w:spacing w:before="50" w:after="50"/>
+              <w:rPr>
+                <w:rFonts w:hint="eastAsia"/>
+              </w:rPr>
             </w:pPr>
-            <w:r/>
             <w:r>
               <w:rPr>
-                <w:rFonts w:ascii="Aptos" w:hAnsi="Aptos"/>
-                <w:b w:val="0"/>
-                <w:color w:val="1F2937"/>
                 <w:sz w:val="17"/>
               </w:rPr>
               <w:t>Máxima</w:t>
@@ -595,21 +493,19 @@
         </w:tc>
         <w:tc>
           <w:tcPr>
-            <w:tcW w:type="dxa" w:w="2880"/>
+            <w:tcW w:w="2880" w:type="dxa"/>
+            <w:shd w:val="clear" w:color="auto" w:fill="F0FDFA"/>
             <w:vAlign w:val="center"/>
-            <w:shd w:fill="F0FDFA"/>
           </w:tcPr>
           <w:p>
             <w:pPr>
-              <w:spacing w:after="50" w:before="50"/>
-              <w:jc w:val="left"/>
+              <w:spacing w:before="50" w:after="50"/>
+              <w:rPr>
+                <w:rFonts w:hint="eastAsia"/>
+              </w:rPr>
             </w:pPr>
-            <w:r/>
             <w:r>
               <w:rPr>
-                <w:rFonts w:ascii="Aptos" w:hAnsi="Aptos"/>
-                <w:b w:val="0"/>
-                <w:color w:val="1F2937"/>
                 <w:sz w:val="17"/>
               </w:rPr>
               <w:t>Es invisible e inmune a intentos de escaneo o intrusión externa por red.</w:t>
@@ -618,22 +514,23 @@
         </w:tc>
       </w:tr>
       <w:tr>
+        <w:trPr>
+          <w:jc w:val="center"/>
+        </w:trPr>
         <w:tc>
           <w:tcPr>
-            <w:tcW w:type="dxa" w:w="2160"/>
+            <w:tcW w:w="2160" w:type="dxa"/>
             <w:vAlign w:val="center"/>
           </w:tcPr>
           <w:p>
             <w:pPr>
-              <w:spacing w:after="50" w:before="50"/>
-              <w:jc w:val="left"/>
+              <w:spacing w:before="50" w:after="50"/>
+              <w:rPr>
+                <w:rFonts w:hint="eastAsia"/>
+              </w:rPr>
             </w:pPr>
-            <w:r/>
             <w:r>
               <w:rPr>
-                <w:rFonts w:ascii="Aptos" w:hAnsi="Aptos"/>
-                <w:b w:val="0"/>
-                <w:color w:val="1F2937"/>
                 <w:sz w:val="17"/>
               </w:rPr>
               <w:t>¿Envía la base de datos a Internet?</w:t>
@@ -642,42 +539,44 @@
         </w:tc>
         <w:tc>
           <w:tcPr>
-            <w:tcW w:type="dxa" w:w="3600"/>
+            <w:tcW w:w="3600" w:type="dxa"/>
             <w:vAlign w:val="center"/>
           </w:tcPr>
           <w:p>
             <w:pPr>
-              <w:spacing w:after="50" w:before="50"/>
-              <w:jc w:val="left"/>
+              <w:spacing w:before="50" w:after="50"/>
+              <w:rPr>
+                <w:rFonts w:hint="eastAsia"/>
+              </w:rPr>
             </w:pPr>
-            <w:r/>
             <w:r>
               <w:rPr>
-                <w:rFonts w:ascii="Aptos" w:hAnsi="Aptos"/>
-                <w:b w:val="0"/>
-                <w:color w:val="1F2937"/>
                 <w:sz w:val="17"/>
               </w:rPr>
-              <w:t>NO. Nunca se transmite la lista de personal completa ni los archivos del sistema.</w:t>
+              <w:t xml:space="preserve">NO. Nunca se transmite la lista de personal completa ni los </w:t>
+            </w:r>
+            <w:r>
+              <w:rPr>
+                <w:sz w:val="17"/>
+              </w:rPr>
+              <w:t>archivos del sistema.</w:t>
             </w:r>
           </w:p>
         </w:tc>
         <w:tc>
           <w:tcPr>
-            <w:tcW w:type="dxa" w:w="1728"/>
+            <w:tcW w:w="1728" w:type="dxa"/>
             <w:vAlign w:val="center"/>
           </w:tcPr>
           <w:p>
             <w:pPr>
-              <w:spacing w:after="50" w:before="50"/>
-              <w:jc w:val="left"/>
+              <w:spacing w:before="50" w:after="50"/>
+              <w:rPr>
+                <w:rFonts w:hint="eastAsia"/>
+              </w:rPr>
             </w:pPr>
-            <w:r/>
             <w:r>
               <w:rPr>
-                <w:rFonts w:ascii="Aptos" w:hAnsi="Aptos"/>
-                <w:b w:val="0"/>
-                <w:color w:val="1F2937"/>
                 <w:sz w:val="17"/>
               </w:rPr>
               <w:t>Máxima</w:t>
@@ -686,20 +585,18 @@
         </w:tc>
         <w:tc>
           <w:tcPr>
-            <w:tcW w:type="dxa" w:w="2880"/>
+            <w:tcW w:w="2880" w:type="dxa"/>
             <w:vAlign w:val="center"/>
           </w:tcPr>
           <w:p>
             <w:pPr>
-              <w:spacing w:after="50" w:before="50"/>
-              <w:jc w:val="left"/>
+              <w:spacing w:before="50" w:after="50"/>
+              <w:rPr>
+                <w:rFonts w:hint="eastAsia"/>
+              </w:rPr>
             </w:pPr>
-            <w:r/>
             <w:r>
               <w:rPr>
-                <w:rFonts w:ascii="Aptos" w:hAnsi="Aptos"/>
-                <w:b w:val="0"/>
-                <w:color w:val="1F2937"/>
                 <w:sz w:val="17"/>
               </w:rPr>
               <w:t>Solo viajan textos puntuales de avisos individuales cuando usted pulsa notificar.</w:t>
@@ -708,23 +605,24 @@
         </w:tc>
       </w:tr>
       <w:tr>
+        <w:trPr>
+          <w:jc w:val="center"/>
+        </w:trPr>
         <w:tc>
           <w:tcPr>
-            <w:tcW w:type="dxa" w:w="2160"/>
+            <w:tcW w:w="2160" w:type="dxa"/>
+            <w:shd w:val="clear" w:color="auto" w:fill="F0FDFA"/>
             <w:vAlign w:val="center"/>
-            <w:shd w:fill="F0FDFA"/>
           </w:tcPr>
           <w:p>
             <w:pPr>
-              <w:spacing w:after="50" w:before="50"/>
-              <w:jc w:val="left"/>
+              <w:spacing w:before="50" w:after="50"/>
+              <w:rPr>
+                <w:rFonts w:hint="eastAsia"/>
+              </w:rPr>
             </w:pPr>
-            <w:r/>
             <w:r>
               <w:rPr>
-                <w:rFonts w:ascii="Aptos" w:hAnsi="Aptos"/>
-                <w:b w:val="0"/>
-                <w:color w:val="1F2937"/>
                 <w:sz w:val="17"/>
               </w:rPr>
               <w:t>Canal de Envío de Correos (SMTP)</w:t>
@@ -733,44 +631,46 @@
         </w:tc>
         <w:tc>
           <w:tcPr>
-            <w:tcW w:type="dxa" w:w="3600"/>
+            <w:tcW w:w="3600" w:type="dxa"/>
+            <w:shd w:val="clear" w:color="auto" w:fill="F0FDFA"/>
             <w:vAlign w:val="center"/>
-            <w:shd w:fill="F0FDFA"/>
           </w:tcPr>
           <w:p>
             <w:pPr>
-              <w:spacing w:after="50" w:before="50"/>
-              <w:jc w:val="left"/>
+              <w:spacing w:before="50" w:after="50"/>
+              <w:rPr>
+                <w:rFonts w:hint="eastAsia"/>
+              </w:rPr>
             </w:pPr>
-            <w:r/>
             <w:r>
               <w:rPr>
-                <w:rFonts w:ascii="Aptos" w:hAnsi="Aptos"/>
-                <w:b w:val="0"/>
-                <w:color w:val="1F2937"/>
                 <w:sz w:val="17"/>
               </w:rPr>
-              <w:t>Conexión saliente cifrada de punto a punto (TLS 1.2+ en puerto 587) directamente hacia los servidores oficiales de correo.</w:t>
+              <w:t>Conexión saliente cifrada de punto a punto (TLS 1.2+ en puerto 587) directamente hacia los servidores oficiales</w:t>
+            </w:r>
+            <w:r>
+              <w:rPr>
+                <w:sz w:val="17"/>
+              </w:rPr>
+              <w:t xml:space="preserve"> de correo.</w:t>
             </w:r>
           </w:p>
         </w:tc>
         <w:tc>
           <w:tcPr>
-            <w:tcW w:type="dxa" w:w="1728"/>
+            <w:tcW w:w="1728" w:type="dxa"/>
+            <w:shd w:val="clear" w:color="auto" w:fill="F0FDFA"/>
             <w:vAlign w:val="center"/>
-            <w:shd w:fill="F0FDFA"/>
           </w:tcPr>
           <w:p>
             <w:pPr>
-              <w:spacing w:after="50" w:before="50"/>
-              <w:jc w:val="left"/>
+              <w:spacing w:before="50" w:after="50"/>
+              <w:rPr>
+                <w:rFonts w:hint="eastAsia"/>
+              </w:rPr>
             </w:pPr>
-            <w:r/>
             <w:r>
               <w:rPr>
-                <w:rFonts w:ascii="Aptos" w:hAnsi="Aptos"/>
-                <w:b w:val="0"/>
-                <w:color w:val="1F2937"/>
                 <w:sz w:val="17"/>
               </w:rPr>
               <w:t>Bancaria / TLS</w:t>
@@ -779,21 +679,19 @@
         </w:tc>
         <w:tc>
           <w:tcPr>
-            <w:tcW w:type="dxa" w:w="2880"/>
+            <w:tcW w:w="2880" w:type="dxa"/>
+            <w:shd w:val="clear" w:color="auto" w:fill="F0FDFA"/>
             <w:vAlign w:val="center"/>
-            <w:shd w:fill="F0FDFA"/>
           </w:tcPr>
           <w:p>
             <w:pPr>
-              <w:spacing w:after="50" w:before="50"/>
-              <w:jc w:val="left"/>
+              <w:spacing w:before="50" w:after="50"/>
+              <w:rPr>
+                <w:rFonts w:hint="eastAsia"/>
+              </w:rPr>
             </w:pPr>
-            <w:r/>
             <w:r>
               <w:rPr>
-                <w:rFonts w:ascii="Aptos" w:hAnsi="Aptos"/>
-                <w:b w:val="0"/>
-                <w:color w:val="1F2937"/>
                 <w:sz w:val="17"/>
               </w:rPr>
               <w:t>Nadie en la red interna ni en Internet puede interceptar ni leer el contenido.</w:t>
@@ -802,22 +700,23 @@
         </w:tc>
       </w:tr>
       <w:tr>
+        <w:trPr>
+          <w:jc w:val="center"/>
+        </w:trPr>
         <w:tc>
           <w:tcPr>
-            <w:tcW w:type="dxa" w:w="2160"/>
+            <w:tcW w:w="2160" w:type="dxa"/>
             <w:vAlign w:val="center"/>
           </w:tcPr>
           <w:p>
             <w:pPr>
-              <w:spacing w:after="50" w:before="50"/>
-              <w:jc w:val="left"/>
+              <w:spacing w:before="50" w:after="50"/>
+              <w:rPr>
+                <w:rFonts w:hint="eastAsia"/>
+              </w:rPr>
             </w:pPr>
-            <w:r/>
             <w:r>
               <w:rPr>
-                <w:rFonts w:ascii="Aptos" w:hAnsi="Aptos"/>
-                <w:b w:val="0"/>
-                <w:color w:val="1F2937"/>
                 <w:sz w:val="17"/>
               </w:rPr>
               <w:t>Copia Oculta (BCC)</w:t>
@@ -826,20 +725,18 @@
         </w:tc>
         <w:tc>
           <w:tcPr>
-            <w:tcW w:type="dxa" w:w="3600"/>
+            <w:tcW w:w="3600" w:type="dxa"/>
             <w:vAlign w:val="center"/>
           </w:tcPr>
           <w:p>
             <w:pPr>
-              <w:spacing w:after="50" w:before="50"/>
-              <w:jc w:val="left"/>
+              <w:spacing w:before="50" w:after="50"/>
+              <w:rPr>
+                <w:rFonts w:hint="eastAsia"/>
+              </w:rPr>
             </w:pPr>
-            <w:r/>
             <w:r>
               <w:rPr>
-                <w:rFonts w:ascii="Aptos" w:hAnsi="Aptos"/>
-                <w:b w:val="0"/>
-                <w:color w:val="1F2937"/>
                 <w:sz w:val="17"/>
               </w:rPr>
               <w:t>Al enviar notificaciones a la dotación, las direcciones van ocultas entre sí.</w:t>
@@ -848,20 +745,18 @@
         </w:tc>
         <w:tc>
           <w:tcPr>
-            <w:tcW w:type="dxa" w:w="1728"/>
+            <w:tcW w:w="1728" w:type="dxa"/>
             <w:vAlign w:val="center"/>
           </w:tcPr>
           <w:p>
             <w:pPr>
-              <w:spacing w:after="50" w:before="50"/>
-              <w:jc w:val="left"/>
+              <w:spacing w:before="50" w:after="50"/>
+              <w:rPr>
+                <w:rFonts w:hint="eastAsia"/>
+              </w:rPr>
             </w:pPr>
-            <w:r/>
             <w:r>
               <w:rPr>
-                <w:rFonts w:ascii="Aptos" w:hAnsi="Aptos"/>
-                <w:b w:val="0"/>
-                <w:color w:val="1F2937"/>
                 <w:sz w:val="17"/>
               </w:rPr>
               <w:t>Privacidad Total</w:t>
@@ -870,45 +765,50 @@
         </w:tc>
         <w:tc>
           <w:tcPr>
-            <w:tcW w:type="dxa" w:w="2880"/>
+            <w:tcW w:w="2880" w:type="dxa"/>
             <w:vAlign w:val="center"/>
           </w:tcPr>
           <w:p>
             <w:pPr>
-              <w:spacing w:after="50" w:before="50"/>
-              <w:jc w:val="left"/>
+              <w:spacing w:before="50" w:after="50"/>
+              <w:rPr>
+                <w:rFonts w:hint="eastAsia"/>
+              </w:rPr>
             </w:pPr>
-            <w:r/>
             <w:r>
               <w:rPr>
-                <w:rFonts w:ascii="Aptos" w:hAnsi="Aptos"/>
-                <w:b w:val="0"/>
-                <w:color w:val="1F2937"/>
                 <w:sz w:val="17"/>
               </w:rPr>
-              <w:t>Ningún funcionario visualiza las direcciones de correo particulares de los demás.</w:t>
+              <w:t xml:space="preserve">Ningún funcionario visualiza las </w:t>
+            </w:r>
+            <w:r>
+              <w:rPr>
+                <w:sz w:val="17"/>
+              </w:rPr>
+              <w:t>direcciones de correo particulares de los demás.</w:t>
             </w:r>
           </w:p>
         </w:tc>
       </w:tr>
       <w:tr>
+        <w:trPr>
+          <w:jc w:val="center"/>
+        </w:trPr>
         <w:tc>
           <w:tcPr>
-            <w:tcW w:type="dxa" w:w="2160"/>
+            <w:tcW w:w="2160" w:type="dxa"/>
+            <w:shd w:val="clear" w:color="auto" w:fill="F0FDFA"/>
             <w:vAlign w:val="center"/>
-            <w:shd w:fill="F0FDFA"/>
           </w:tcPr>
           <w:p>
             <w:pPr>
-              <w:spacing w:after="50" w:before="50"/>
-              <w:jc w:val="left"/>
+              <w:spacing w:before="50" w:after="50"/>
+              <w:rPr>
+                <w:rFonts w:hint="eastAsia"/>
+              </w:rPr>
             </w:pPr>
-            <w:r/>
             <w:r>
               <w:rPr>
-                <w:rFonts w:ascii="Aptos" w:hAnsi="Aptos"/>
-                <w:b w:val="0"/>
-                <w:color w:val="1F2937"/>
                 <w:sz w:val="17"/>
               </w:rPr>
               <w:t>¿Qué pasa si NO tengo Internet?</w:t>
@@ -917,21 +817,19 @@
         </w:tc>
         <w:tc>
           <w:tcPr>
-            <w:tcW w:type="dxa" w:w="3600"/>
+            <w:tcW w:w="3600" w:type="dxa"/>
+            <w:shd w:val="clear" w:color="auto" w:fill="F0FDFA"/>
             <w:vAlign w:val="center"/>
-            <w:shd w:fill="F0FDFA"/>
           </w:tcPr>
           <w:p>
             <w:pPr>
-              <w:spacing w:after="50" w:before="50"/>
-              <w:jc w:val="left"/>
+              <w:spacing w:before="50" w:after="50"/>
+              <w:rPr>
+                <w:rFonts w:hint="eastAsia"/>
+              </w:rPr>
             </w:pPr>
-            <w:r/>
             <w:r>
               <w:rPr>
-                <w:rFonts w:ascii="Aptos" w:hAnsi="Aptos"/>
-                <w:b w:val="0"/>
-                <w:color w:val="1F2937"/>
                 <w:sz w:val="17"/>
               </w:rPr>
               <w:t>El sistema funciona al 100% de manera desconectada (modo offline).</w:t>
@@ -940,21 +838,19 @@
         </w:tc>
         <w:tc>
           <w:tcPr>
-            <w:tcW w:type="dxa" w:w="1728"/>
+            <w:tcW w:w="1728" w:type="dxa"/>
+            <w:shd w:val="clear" w:color="auto" w:fill="F0FDFA"/>
             <w:vAlign w:val="center"/>
-            <w:shd w:fill="F0FDFA"/>
           </w:tcPr>
           <w:p>
             <w:pPr>
-              <w:spacing w:after="50" w:before="50"/>
-              <w:jc w:val="left"/>
+              <w:spacing w:before="50" w:after="50"/>
+              <w:rPr>
+                <w:rFonts w:hint="eastAsia"/>
+              </w:rPr>
             </w:pPr>
-            <w:r/>
             <w:r>
               <w:rPr>
-                <w:rFonts w:ascii="Aptos" w:hAnsi="Aptos"/>
-                <w:b w:val="0"/>
-                <w:color w:val="1F2937"/>
                 <w:sz w:val="17"/>
               </w:rPr>
               <w:t>Autónoma</w:t>
@@ -963,21 +859,19 @@
         </w:tc>
         <w:tc>
           <w:tcPr>
-            <w:tcW w:type="dxa" w:w="2880"/>
+            <w:tcW w:w="2880" w:type="dxa"/>
+            <w:shd w:val="clear" w:color="auto" w:fill="F0FDFA"/>
             <w:vAlign w:val="center"/>
-            <w:shd w:fill="F0FDFA"/>
           </w:tcPr>
           <w:p>
             <w:pPr>
-              <w:spacing w:after="50" w:before="50"/>
-              <w:jc w:val="left"/>
+              <w:spacing w:before="50" w:after="50"/>
+              <w:rPr>
+                <w:rFonts w:hint="eastAsia"/>
+              </w:rPr>
             </w:pPr>
-            <w:r/>
             <w:r>
               <w:rPr>
-                <w:rFonts w:ascii="Aptos" w:hAnsi="Aptos"/>
-                <w:b w:val="0"/>
-                <w:color w:val="1F2937"/>
                 <w:sz w:val="17"/>
               </w:rPr>
               <w:t>No se bloquea, no se detiene y guarda los cambios con total normalidad.</w:t>
@@ -989,28 +883,44 @@
     <w:p>
       <w:pPr>
         <w:spacing w:after="40"/>
+        <w:rPr>
+          <w:rFonts w:hint="eastAsia"/>
+        </w:rPr>
       </w:pPr>
     </w:p>
     <w:p>
       <w:pPr>
         <w:spacing w:after="100" w:line="274" w:lineRule="auto"/>
+        <w:rPr>
+          <w:rFonts w:hint="eastAsia"/>
+        </w:rPr>
       </w:pPr>
       <w:r>
-        <w:t>En resumen: El acceso a Internet se utiliza de manera exclusivamente saliente y solo cuando el operador decide voluntariamente despachar un aviso por correo electrónico institucional. En ningún momento el software sincroniza ni sube la base de datos a ningún servicio externo.</w:t>
+        <w:lastRenderedPageBreak/>
+        <w:t xml:space="preserve">En resumen: El acceso a </w:t>
+      </w:r>
+      <w:r>
+        <w:t>Internet se utiliza de manera exclusivamente saliente y solo cuando el operador decide voluntariamente despachar un aviso por correo electrónico institucional. En ningún momento el software sincroniza ni sube la base de datos a ningún servicio externo.</w:t>
       </w:r>
     </w:p>
     <w:p>
       <w:pPr>
-        <w:pStyle w:val="Heading1"/>
+        <w:pStyle w:val="Ttulo1"/>
         <w:spacing w:before="280" w:after="80"/>
       </w:pPr>
       <w:r>
-        <w:t>3. Desarrollo Seguro y Cumplimiento de Normativas Legales</w:t>
+        <w:t xml:space="preserve">3. </w:t>
+      </w:r>
+      <w:r>
+        <w:t>Desarrollo Seguro y Cumplimiento de Normativas Legales</w:t>
       </w:r>
     </w:p>
     <w:p>
       <w:pPr>
         <w:spacing w:after="100" w:line="274" w:lineRule="auto"/>
+        <w:rPr>
+          <w:rFonts w:hint="eastAsia"/>
+        </w:rPr>
       </w:pPr>
       <w:r>
         <w:t>El desarrollo del Sistema de Gestión de Turnos fue ejecutado desde su primera línea de código aplicando rigurosos estándares de Ciberseguridad y en estricto apego al marco legal chileno vigente:</w:t>
@@ -1018,14 +928,23 @@
     </w:p>
     <w:p>
       <w:pPr>
-        <w:pStyle w:val="ListBullet"/>
-        <w:spacing w:after="60" w:before="0" w:line="264" w:lineRule="auto"/>
+        <w:pStyle w:val="Listaconvietas"/>
+        <w:spacing w:after="60" w:line="264" w:lineRule="auto"/>
+        <w:rPr>
+          <w:rFonts w:hint="eastAsia"/>
+        </w:rPr>
       </w:pPr>
       <w:r>
         <w:rPr>
           <w:b/>
         </w:rPr>
-        <w:t>Ley N° 19.628 sobre Protección de la Vida Privada (Chile):</w:t>
+        <w:t>Ley N°</w:t>
+      </w:r>
+      <w:r>
+        <w:rPr>
+          <w:b/>
+        </w:rPr>
+        <w:t xml:space="preserve"> 19.628 sobre Protección de la Vida Privada (Chile):</w:t>
       </w:r>
       <w:r>
         <w:t xml:space="preserve"> Cumple con los principios de licitud, consentimiento y finalidad. Los datos se utilizan estrictamente para organizar las guardias y no se comparten con terceros.</w:t>
@@ -1033,8 +952,11 @@
     </w:p>
     <w:p>
       <w:pPr>
-        <w:pStyle w:val="ListBullet"/>
-        <w:spacing w:after="60" w:before="0" w:line="264" w:lineRule="auto"/>
+        <w:pStyle w:val="Listaconvietas"/>
+        <w:spacing w:after="60" w:line="264" w:lineRule="auto"/>
+        <w:rPr>
+          <w:rFonts w:hint="eastAsia"/>
+        </w:rPr>
       </w:pPr>
       <w:r>
         <w:rPr>
@@ -1043,13 +965,19 @@
         <w:t>Ley N° 21.663 Marco de Ciberseguridad:</w:t>
       </w:r>
       <w:r>
-        <w:t xml:space="preserve"> Adopción de medidas técnicas proactivas de protección, mitigación de riesgos y resguardo de la confidencialidad de la información operativa del personal.</w:t>
+        <w:t xml:space="preserve"> Ad</w:t>
+      </w:r>
+      <w:r>
+        <w:t>opción de medidas técnicas proactivas de protección, mitigación de riesgos y resguardo de la confidencialidad de la información operativa del personal.</w:t>
       </w:r>
     </w:p>
     <w:p>
       <w:pPr>
-        <w:pStyle w:val="ListBullet"/>
-        <w:spacing w:after="60" w:before="0" w:line="264" w:lineRule="auto"/>
+        <w:pStyle w:val="Listaconvietas"/>
+        <w:spacing w:after="60" w:line="264" w:lineRule="auto"/>
+        <w:rPr>
+          <w:rFonts w:hint="eastAsia"/>
+        </w:rPr>
       </w:pPr>
       <w:r>
         <w:rPr>
@@ -1058,13 +986,19 @@
         <w:t>Directrices OWASP (Open Web Application Security Project):</w:t>
       </w:r>
       <w:r>
-        <w:t xml:space="preserve"> Implementación de diseño seguro (Secure by Design), control de configuraciones y prevención contra fuga de información confidencial.</w:t>
+        <w:t xml:space="preserve"> Implementación de diseño seguro (Secure by De</w:t>
+      </w:r>
+      <w:r>
+        <w:t>sign), control de configuraciones y prevención contra fuga de información confidencial.</w:t>
       </w:r>
     </w:p>
     <w:p>
       <w:pPr>
-        <w:pStyle w:val="ListBullet"/>
-        <w:spacing w:after="60" w:before="0" w:line="264" w:lineRule="auto"/>
+        <w:pStyle w:val="Listaconvietas"/>
+        <w:spacing w:after="60" w:line="264" w:lineRule="auto"/>
+        <w:rPr>
+          <w:rFonts w:hint="eastAsia"/>
+        </w:rPr>
       </w:pPr>
       <w:r>
         <w:rPr>
@@ -1073,12 +1007,15 @@
         <w:t>Separación Estricta de Entornos:</w:t>
       </w:r>
       <w:r>
-        <w:t xml:space="preserve"> El código fuente del proyecto no contiene nombres reales, correos ni credenciales personales. Se implementó una política de anonimización absoluta en los repositorios.</w:t>
+        <w:t xml:space="preserve"> El código fuente del proyecto no contiene nombres reales, correos ni credenciales personales. Se implementó una política de anonimizaci</w:t>
+      </w:r>
+      <w:r>
+        <w:t>ón absoluta en los repositorios.</w:t>
       </w:r>
     </w:p>
     <w:p>
       <w:pPr>
-        <w:pStyle w:val="Heading1"/>
+        <w:pStyle w:val="Ttulo1"/>
         <w:spacing w:before="280" w:after="80"/>
       </w:pPr>
       <w:r>
@@ -1088,6 +1025,9 @@
     <w:p>
       <w:pPr>
         <w:spacing w:after="100" w:line="274" w:lineRule="auto"/>
+        <w:rPr>
+          <w:rFonts w:hint="eastAsia"/>
+        </w:rPr>
       </w:pPr>
       <w:r>
         <w:t>Para garantizar que el trabajo del usuario final nunca se pierda ni se dañe accidentalmente, el motor del sistema cuenta con tres barreras automáticas de protección:</w:t>
@@ -1095,8 +1035,11 @@
     </w:p>
     <w:p>
       <w:pPr>
-        <w:pStyle w:val="ListBullet"/>
-        <w:spacing w:after="60" w:before="0" w:line="264" w:lineRule="auto"/>
+        <w:pStyle w:val="Listaconvietas"/>
+        <w:spacing w:after="60" w:line="264" w:lineRule="auto"/>
+        <w:rPr>
+          <w:rFonts w:hint="eastAsia"/>
+        </w:rPr>
       </w:pPr>
       <w:r>
         <w:rPr>
@@ -1105,13 +1048,19 @@
         <w:t>Guardado Atómico (Anti-Cortes de Luz):</w:t>
       </w:r>
       <w:r>
-        <w:t xml:space="preserve"> Cuando usted presiona 'Guardar', el sistema escribe primero en un archivo temporal seguro, fuerza la escritura física en disco (fsync) y solo cuando el archivo está 100% íntegro reemplaza el original en una fracción de milisegundo. Si se corta la luz en medio del proceso, su información anterior no se corrompe.</w:t>
+        <w:t xml:space="preserve"> Cuando usted presiona 'Guardar', el sistema escribe primero en un archivo temporal seguro, fuerza la escritura física en disco (fsync) y solo cuando el archivo está 100% íntegro reemplaza el original en una fracción d</w:t>
+      </w:r>
+      <w:r>
+        <w:t>e milisegundo. Si se corta la luz en medio del proceso, su información anterior no se corrompe.</w:t>
       </w:r>
     </w:p>
     <w:p>
       <w:pPr>
-        <w:pStyle w:val="ListBullet"/>
-        <w:spacing w:after="60" w:before="0" w:line="264" w:lineRule="auto"/>
+        <w:pStyle w:val="Listaconvietas"/>
+        <w:spacing w:after="60" w:line="264" w:lineRule="auto"/>
+        <w:rPr>
+          <w:rFonts w:hint="eastAsia"/>
+        </w:rPr>
       </w:pPr>
       <w:r>
         <w:rPr>
@@ -1120,13 +1069,19 @@
         <w:t>Copias de Seguridad Fechadas Automáticas:</w:t>
       </w:r>
       <w:r>
-        <w:t xml:space="preserve"> Cada cierre de mes o respaldo manual genera un archivo fechado e independiente en la carpeta backups/. Si necesita revisar el estado de un mes anterior, siempre tendrá el archivo disponible.</w:t>
+        <w:t xml:space="preserve"> Cada cierre de mes o respaldo manual genera un archivo fechado e independiente en la carpeta backups/. Si necesita rev</w:t>
+      </w:r>
+      <w:r>
+        <w:t>isar el estado de un mes anterior, siempre tendrá el archivo disponible.</w:t>
       </w:r>
     </w:p>
     <w:p>
       <w:pPr>
-        <w:pStyle w:val="ListBullet"/>
-        <w:spacing w:after="60" w:before="0" w:line="264" w:lineRule="auto"/>
+        <w:pStyle w:val="Listaconvietas"/>
+        <w:spacing w:after="60" w:line="264" w:lineRule="auto"/>
+        <w:rPr>
+          <w:rFonts w:hint="eastAsia"/>
+        </w:rPr>
       </w:pPr>
       <w:r>
         <w:rPr>
@@ -1140,16 +1095,22 @@
     </w:p>
     <w:p>
       <w:pPr>
-        <w:pStyle w:val="Heading1"/>
+        <w:pStyle w:val="Ttulo1"/>
         <w:spacing w:before="280" w:after="80"/>
       </w:pPr>
       <w:r>
-        <w:t>5. Preguntas Frecuentes de los Usuarios (FAQ)</w:t>
+        <w:t xml:space="preserve">5. Preguntas Frecuentes de </w:t>
+      </w:r>
+      <w:r>
+        <w:t>los Usuarios (FAQ)</w:t>
       </w:r>
     </w:p>
     <w:p>
       <w:pPr>
         <w:spacing w:after="100" w:line="274" w:lineRule="auto"/>
+        <w:rPr>
+          <w:rFonts w:hint="eastAsia"/>
+        </w:rPr>
       </w:pPr>
       <w:r>
         <w:t>¿Puede alguien en Internet ver los nombres o los turnos de mi equipo?</w:t>
@@ -1158,14 +1119,23 @@
     <w:p>
       <w:pPr>
         <w:spacing w:after="100" w:line="274" w:lineRule="auto"/>
+        <w:rPr>
+          <w:rFonts w:hint="eastAsia"/>
+        </w:rPr>
       </w:pPr>
       <w:r>
-        <w:t>No. El software no publica nada en Internet. La información está almacenada en el disco local de su computadora. Nadie puede acceder sin iniciar sesión directamente en su equipo de trabajo.</w:t>
+        <w:t>No. El software no publica nada en Internet. La información está almacenada en el disco local de su computadora. Nadie puede acceder sin iniciar sesión directamente en</w:t>
+      </w:r>
+      <w:r>
+        <w:t xml:space="preserve"> su equipo de trabajo.</w:t>
       </w:r>
     </w:p>
     <w:p>
       <w:pPr>
         <w:spacing w:after="100" w:line="274" w:lineRule="auto"/>
+        <w:rPr>
+          <w:rFonts w:hint="eastAsia"/>
+        </w:rPr>
       </w:pPr>
       <w:r>
         <w:t>¿Si abro el programa sin conexión a Internet, funciona?</w:t>
@@ -1174,6 +1144,9 @@
     <w:p>
       <w:pPr>
         <w:spacing w:after="100" w:line="274" w:lineRule="auto"/>
+        <w:rPr>
+          <w:rFonts w:hint="eastAsia"/>
+        </w:rPr>
       </w:pPr>
       <w:r>
         <w:t>Sí, al 100%. Usted puede planificar todo el año, rotar turnos, ingresar permisos y exportar a Excel sin tener ningún cable de red conectado.</w:t>
@@ -1182,128 +1155,44 @@
     <w:p>
       <w:pPr>
         <w:spacing w:after="100" w:line="274" w:lineRule="auto"/>
+        <w:rPr>
+          <w:rFonts w:hint="eastAsia"/>
+        </w:rPr>
       </w:pPr>
       <w:r>
-        <w:t>¿Qué datos se enviaron a plataformas de desarrollo como GitHub?</w:t>
+        <w:t>¿Qué datos se enviaron a plataformas</w:t>
+      </w:r>
+      <w:r>
+        <w:t xml:space="preserve"> de desarrollo como GitHub?</w:t>
       </w:r>
     </w:p>
     <w:p>
       <w:pPr>
         <w:spacing w:after="100" w:line="274" w:lineRule="auto"/>
+        <w:rPr>
+          <w:rFonts w:hint="eastAsia"/>
+        </w:rPr>
       </w:pPr>
       <w:r>
-        <w:t>Únicamente el código fuente de los botones, ventanas y algoritmos de rotación, acompañados de plantillas de ejemplo con nombres ficticios (Juan Perez, Maria Gonzalez). Ningún dato de funcionarios reales fue ni será subido.</w:t>
+        <w:t>Únicamente el código fuente de los botones, ventanas y algoritmos de rotación, acompañados de plantillas d</w:t>
+      </w:r>
+      <w:r>
+        <w:t xml:space="preserve">e ejemplo con nombres ficticios. </w:t>
+      </w:r>
+      <w:r>
+        <w:t>Ningún dato de funcionarios reales fue ni será subido.</w:t>
       </w:r>
     </w:p>
     <w:p>
       <w:pPr>
-        <w:pStyle w:val="Heading1"/>
-        <w:spacing w:before="280" w:after="80"/>
-      </w:pPr>
-      <w:r>
-        <w:t>6. Buenas Prácticas de Seguridad para el Operador Final</w:t>
-      </w:r>
-    </w:p>
-    <w:p>
-      <w:pPr>
-        <w:spacing w:after="100" w:line="274" w:lineRule="auto"/>
-      </w:pPr>
-      <w:r>
-        <w:t>Dado que la seguridad física de la estación de trabajo es el pilar principal de un software local, se recomienda a los operadores seguir estas sencillas pautas:</w:t>
-      </w:r>
-    </w:p>
-    <w:p>
-      <w:pPr>
-        <w:pStyle w:val="ListBullet"/>
-        <w:spacing w:after="60" w:before="0" w:line="264" w:lineRule="auto"/>
-      </w:pPr>
-      <w:r>
         <w:rPr>
-          <w:b/>
+          <w:rFonts w:hint="eastAsia"/>
         </w:rPr>
-        <w:t>Bloqueo de Pantalla:</w:t>
-      </w:r>
-      <w:r>
-        <w:t xml:space="preserve"> Presione la tecla Windows + L cada vez que se aleje de su puesto de trabajo para evitar que personas no autorizadas manipulen las planillas.</w:t>
-      </w:r>
-    </w:p>
-    <w:p>
-      <w:pPr>
-        <w:pStyle w:val="ListBullet"/>
-        <w:spacing w:after="60" w:before="0" w:line="264" w:lineRule="auto"/>
-      </w:pPr>
-      <w:r>
-        <w:rPr>
-          <w:b/>
-        </w:rPr>
-        <w:t>Resguardo de Planillas Excel:</w:t>
-      </w:r>
-      <w:r>
-        <w:t xml:space="preserve"> Al exportar planillas mensuales a Excel, guárdelas en carpetas institucionales con acceso restringido para los miembros autorizados del departamento.</w:t>
-      </w:r>
-    </w:p>
-    <w:p>
-      <w:pPr>
-        <w:pStyle w:val="ListBullet"/>
-        <w:spacing w:after="60" w:before="0" w:line="264" w:lineRule="auto"/>
-      </w:pPr>
-      <w:r>
-        <w:rPr>
-          <w:b/>
-        </w:rPr>
-        <w:t>Contraseñas de Correo Seguras:</w:t>
-      </w:r>
-      <w:r>
-        <w:t xml:space="preserve"> Nunca guarde contraseñas escritas en papeles o archivos de texto sin cifrar. El archivo .env del sistema cuenta con permisos locales protegidos.</w:t>
-      </w:r>
-    </w:p>
-    <w:p>
-      <w:pPr>
-        <w:spacing w:before="400"/>
       </w:pPr>
     </w:p>
-    <w:p>
-      <w:pPr>
-        <w:jc w:val="center"/>
-      </w:pPr>
-      <w:r>
-        <w:rPr>
-          <w:i/>
-          <w:color w:val="4B5563"/>
-          <w:sz w:val="18"/>
-        </w:rPr>
-        <w:t>DECLARACIÓN DE CONFORMIDAD Y SEGURIDAD TÉCNICA</w:t>
-        <w:br/>
-        <w:t>El Sistema de Gestión de Turnos cumple con todas las exigencias de privacidad, funcionamiento local autónomo y desarrollo seguro vigentes a la fecha.</w:t>
-      </w:r>
-    </w:p>
-    <w:p>
-      <w:pPr>
-        <w:spacing w:before="240"/>
-      </w:pPr>
-    </w:p>
-    <w:p>
-      <w:pPr>
-        <w:jc w:val="center"/>
-      </w:pPr>
-      <w:r>
-        <w:rPr>
-          <w:b/>
-          <w:color w:val="1F2937"/>
-          <w:sz w:val="19"/>
-        </w:rPr>
-        <w:t>_____________________________________________</w:t>
-        <w:br/>
-        <w:t>DEPARTAMENTO DE PERSONAL</w:t>
-        <w:br/>
-        <w:t>GESTIÓN OPERATIVA Y SEGURIDAD DE LA INFORMACIÓN</w:t>
-        <w:br/>
-        <w:t>Validez Oficial — Periodo 2026 / 2027</w:t>
-      </w:r>
-    </w:p>
     <w:sectPr>
-      <w:headerReference w:type="default" r:id="rId9"/>
-      <w:footerReference w:type="default" r:id="rId10"/>
+      <w:headerReference w:type="default" r:id="rId8"/>
+      <w:footerReference w:type="default" r:id="rId9"/>
       <w:pgSz w:w="12240" w:h="15840"/>
       <w:pgMar w:top="1152" w:right="1152" w:bottom="1152" w:left="1152" w:header="720" w:footer="720" w:gutter="0"/>
       <w:cols w:space="720"/>
@@ -1313,35 +1202,95 @@
 </w:document>
 </file>
 
+<file path=word/endnotes.xml><?xml version="1.0" encoding="utf-8"?>
+<w:endnotes xmlns:ve="http://schemas.openxmlformats.org/markup-compatibility/2006" xmlns:o="urn:schemas-microsoft-com:office:office" xmlns:r="http://schemas.openxmlformats.org/officeDocument/2006/relationships" xmlns:m="http://schemas.openxmlformats.org/officeDocument/2006/math" xmlns:v="urn:schemas-microsoft-com:vml" xmlns:wp="http://schemas.openxmlformats.org/drawingml/2006/wordprocessingDrawing" xmlns:w10="urn:schemas-microsoft-com:office:word" xmlns:w="http://schemas.openxmlformats.org/wordprocessingml/2006/main" xmlns:wne="http://schemas.microsoft.com/office/word/2006/wordml">
+  <w:endnote w:type="separator" w:id="0">
+    <w:p>
+      <w:pPr>
+        <w:spacing w:after="0" w:line="240" w:lineRule="auto"/>
+      </w:pPr>
+      <w:r>
+        <w:separator/>
+      </w:r>
+    </w:p>
+  </w:endnote>
+  <w:endnote w:type="continuationSeparator" w:id="1">
+    <w:p>
+      <w:pPr>
+        <w:spacing w:after="0" w:line="240" w:lineRule="auto"/>
+      </w:pPr>
+      <w:r>
+        <w:continuationSeparator/>
+      </w:r>
+    </w:p>
+  </w:endnote>
+</w:endnotes>
+</file>
+
 <file path=word/footer1.xml><?xml version="1.0" encoding="utf-8"?>
-<w:ftr xmlns:m="http://schemas.openxmlformats.org/officeDocument/2006/math" xmlns:mc="http://schemas.openxmlformats.org/markup-compatibility/2006" xmlns:mo="http://schemas.microsoft.com/office/mac/office/2008/main" xmlns:mv="urn:schemas-microsoft-com:mac:vml" xmlns:o="urn:schemas-microsoft-com:office:office" xmlns:r="http://schemas.openxmlformats.org/officeDocument/2006/relationships" xmlns:v="urn:schemas-microsoft-com:vml" xmlns:w10="urn:schemas-microsoft-com:office:word" xmlns:w14="http://schemas.microsoft.com/office/word/2010/wordml" xmlns:w="http://schemas.openxmlformats.org/wordprocessingml/2006/main" xmlns:wne="http://schemas.microsoft.com/office/word/2006/wordml" xmlns:wp14="http://schemas.microsoft.com/office/word/2010/wordprocessingDrawing" xmlns:wp="http://schemas.openxmlformats.org/drawingml/2006/wordprocessingDrawing" xmlns:wpc="http://schemas.microsoft.com/office/word/2010/wordprocessingCanvas" xmlns:wpg="http://schemas.microsoft.com/office/word/2010/wordprocessingGroup" xmlns:wpi="http://schemas.microsoft.com/office/word/2010/wordprocessingInk" xmlns:wps="http://schemas.microsoft.com/office/word/2010/wordprocessingShape" mc:Ignorable="w14 wp14">
+<w:ftr xmlns:ve="http://schemas.openxmlformats.org/markup-compatibility/2006" xmlns:o="urn:schemas-microsoft-com:office:office" xmlns:r="http://schemas.openxmlformats.org/officeDocument/2006/relationships" xmlns:m="http://schemas.openxmlformats.org/officeDocument/2006/math" xmlns:v="urn:schemas-microsoft-com:vml" xmlns:wp="http://schemas.openxmlformats.org/drawingml/2006/wordprocessingDrawing" xmlns:w10="urn:schemas-microsoft-com:office:word" xmlns:w="http://schemas.openxmlformats.org/wordprocessingml/2006/main" xmlns:wne="http://schemas.microsoft.com/office/word/2006/wordml">
   <w:p>
     <w:pPr>
-      <w:pStyle w:val="Footer"/>
-      <w:jc w:val="left"/>
+      <w:pStyle w:val="Piedepgina"/>
+      <w:rPr>
+        <w:rFonts w:hint="eastAsia"/>
+      </w:rPr>
     </w:pPr>
     <w:r>
       <w:rPr>
-        <w:rFonts w:ascii="Aptos" w:hAnsi="Aptos"/>
         <w:color w:val="6B7280"/>
         <w:sz w:val="16"/>
       </w:rPr>
-      <w:t>Documento Informativo Oficial para Usuarios — Seguridad, Privacidad y Garantía de Datos (2026)</w:t>
+      <w:t xml:space="preserve">Documento Informativo Oficial para Usuarios — Seguridad, Privacidad </w:t>
+    </w:r>
+    <w:r>
+      <w:rPr>
+        <w:color w:val="6B7280"/>
+        <w:sz w:val="16"/>
+      </w:rPr>
+      <w:t>y Garantía de Datos (2026)</w:t>
     </w:r>
   </w:p>
 </w:ftr>
 </file>
 
+<file path=word/footnotes.xml><?xml version="1.0" encoding="utf-8"?>
+<w:footnotes xmlns:ve="http://schemas.openxmlformats.org/markup-compatibility/2006" xmlns:o="urn:schemas-microsoft-com:office:office" xmlns:r="http://schemas.openxmlformats.org/officeDocument/2006/relationships" xmlns:m="http://schemas.openxmlformats.org/officeDocument/2006/math" xmlns:v="urn:schemas-microsoft-com:vml" xmlns:wp="http://schemas.openxmlformats.org/drawingml/2006/wordprocessingDrawing" xmlns:w10="urn:schemas-microsoft-com:office:word" xmlns:w="http://schemas.openxmlformats.org/wordprocessingml/2006/main" xmlns:wne="http://schemas.microsoft.com/office/word/2006/wordml">
+  <w:footnote w:type="separator" w:id="0">
+    <w:p>
+      <w:pPr>
+        <w:spacing w:after="0" w:line="240" w:lineRule="auto"/>
+      </w:pPr>
+      <w:r>
+        <w:separator/>
+      </w:r>
+    </w:p>
+  </w:footnote>
+  <w:footnote w:type="continuationSeparator" w:id="1">
+    <w:p>
+      <w:pPr>
+        <w:spacing w:after="0" w:line="240" w:lineRule="auto"/>
+      </w:pPr>
+      <w:r>
+        <w:continuationSeparator/>
+      </w:r>
+    </w:p>
+  </w:footnote>
+</w:footnotes>
+</file>
+
 <file path=word/header1.xml><?xml version="1.0" encoding="utf-8"?>
-<w:hdr xmlns:m="http://schemas.openxmlformats.org/officeDocument/2006/math" xmlns:mc="http://schemas.openxmlformats.org/markup-compatibility/2006" xmlns:mo="http://schemas.microsoft.com/office/mac/office/2008/main" xmlns:mv="urn:schemas-microsoft-com:mac:vml" xmlns:o="urn:schemas-microsoft-com:office:office" xmlns:r="http://schemas.openxmlformats.org/officeDocument/2006/relationships" xmlns:v="urn:schemas-microsoft-com:vml" xmlns:w10="urn:schemas-microsoft-com:office:word" xmlns:w14="http://schemas.microsoft.com/office/word/2010/wordml" xmlns:w="http://schemas.openxmlformats.org/wordprocessingml/2006/main" xmlns:wne="http://schemas.microsoft.com/office/word/2006/wordml" xmlns:wp14="http://schemas.microsoft.com/office/word/2010/wordprocessingDrawing" xmlns:wp="http://schemas.openxmlformats.org/drawingml/2006/wordprocessingDrawing" xmlns:wpc="http://schemas.microsoft.com/office/word/2010/wordprocessingCanvas" xmlns:wpg="http://schemas.microsoft.com/office/word/2010/wordprocessingGroup" xmlns:wpi="http://schemas.microsoft.com/office/word/2010/wordprocessingInk" xmlns:wps="http://schemas.microsoft.com/office/word/2010/wordprocessingShape" mc:Ignorable="w14 wp14">
+<w:hdr xmlns:ve="http://schemas.openxmlformats.org/markup-compatibility/2006" xmlns:o="urn:schemas-microsoft-com:office:office" xmlns:r="http://schemas.openxmlformats.org/officeDocument/2006/relationships" xmlns:m="http://schemas.openxmlformats.org/officeDocument/2006/math" xmlns:v="urn:schemas-microsoft-com:vml" xmlns:wp="http://schemas.openxmlformats.org/drawingml/2006/wordprocessingDrawing" xmlns:w10="urn:schemas-microsoft-com:office:word" xmlns:w="http://schemas.openxmlformats.org/wordprocessingml/2006/main" xmlns:wne="http://schemas.microsoft.com/office/word/2006/wordml">
   <w:p>
     <w:pPr>
-      <w:pStyle w:val="Header"/>
+      <w:pStyle w:val="Encabezado"/>
       <w:jc w:val="right"/>
+      <w:rPr>
+        <w:rFonts w:hint="eastAsia"/>
+      </w:rPr>
     </w:pPr>
     <w:r>
       <w:rPr>
-        <w:rFonts w:ascii="Aptos" w:hAnsi="Aptos"/>
         <w:color w:val="6B7280"/>
         <w:sz w:val="16"/>
       </w:rPr>
@@ -1352,7 +1301,7 @@
 </file>
 
 <file path=word/numbering.xml><?xml version="1.0" encoding="utf-8"?>
-<w:numbering xmlns:wpc="http://schemas.microsoft.com/office/word/2010/wordprocessingCanvas" xmlns:mo="http://schemas.microsoft.com/office/mac/office/2008/main" xmlns:mc="http://schemas.openxmlformats.org/markup-compatibility/2006" xmlns:mv="urn:schemas-microsoft-com:mac:vml" xmlns:o="urn:schemas-microsoft-com:office:office" xmlns:r="http://schemas.openxmlformats.org/officeDocument/2006/relationships" xmlns:m="http://schemas.openxmlformats.org/officeDocument/2006/math" xmlns:v="urn:schemas-microsoft-com:vml" xmlns:wp14="http://schemas.microsoft.com/office/word/2010/wordprocessingDrawing" xmlns:wp="http://schemas.openxmlformats.org/drawingml/2006/wordprocessingDrawing" xmlns:w10="urn:schemas-microsoft-com:office:word" xmlns:w="http://schemas.openxmlformats.org/wordprocessingml/2006/main" xmlns:w14="http://schemas.microsoft.com/office/word/2010/wordml" xmlns:wpg="http://schemas.microsoft.com/office/word/2010/wordprocessingGroup" xmlns:wpi="http://schemas.microsoft.com/office/word/2010/wordprocessingInk" xmlns:wne="http://schemas.microsoft.com/office/word/2006/wordml" xmlns:wps="http://schemas.microsoft.com/office/word/2010/wordprocessingShape" mc:Ignorable="w14 wp14">
+<w:numbering xmlns:ve="http://schemas.openxmlformats.org/markup-compatibility/2006" xmlns:o="urn:schemas-microsoft-com:office:office" xmlns:r="http://schemas.openxmlformats.org/officeDocument/2006/relationships" xmlns:m="http://schemas.openxmlformats.org/officeDocument/2006/math" xmlns:v="urn:schemas-microsoft-com:vml" xmlns:wp="http://schemas.openxmlformats.org/drawingml/2006/wordprocessingDrawing" xmlns:w10="urn:schemas-microsoft-com:office:word" xmlns:w="http://schemas.openxmlformats.org/wordprocessingml/2006/main" xmlns:wne="http://schemas.microsoft.com/office/word/2006/wordml">
   <w:abstractNum w:abstractNumId="0">
     <w:nsid w:val="FFFFFF7C"/>
     <w:multiLevelType w:val="singleLevel"/>
@@ -1394,7 +1343,7 @@
     <w:lvl w:ilvl="0">
       <w:start w:val="1"/>
       <w:numFmt w:val="decimal"/>
-      <w:pStyle w:val="ListNumber3"/>
+      <w:pStyle w:val="Listaconnmeros3"/>
       <w:lvlText w:val="%1."/>
       <w:lvlJc w:val="left"/>
       <w:pPr>
@@ -1412,7 +1361,7 @@
     <w:lvl w:ilvl="0">
       <w:start w:val="1"/>
       <w:numFmt w:val="decimal"/>
-      <w:pStyle w:val="ListNumber2"/>
+      <w:pStyle w:val="Listaconnmeros2"/>
       <w:lvlText w:val="%1."/>
       <w:lvlJc w:val="left"/>
       <w:pPr>
@@ -1450,7 +1399,7 @@
     <w:lvl w:ilvl="0">
       <w:start w:val="1"/>
       <w:numFmt w:val="bullet"/>
-      <w:pStyle w:val="ListBullet3"/>
+      <w:pStyle w:val="Listaconvietas3"/>
       <w:lvlText w:val=""/>
       <w:lvlJc w:val="left"/>
       <w:pPr>
@@ -1471,7 +1420,7 @@
     <w:lvl w:ilvl="0">
       <w:start w:val="1"/>
       <w:numFmt w:val="bullet"/>
-      <w:pStyle w:val="ListBullet2"/>
+      <w:pStyle w:val="Listaconvietas2"/>
       <w:lvlText w:val=""/>
       <w:lvlJc w:val="left"/>
       <w:pPr>
@@ -1492,7 +1441,7 @@
     <w:lvl w:ilvl="0">
       <w:start w:val="1"/>
       <w:numFmt w:val="decimal"/>
-      <w:pStyle w:val="ListNumber"/>
+      <w:pStyle w:val="Listaconnmeros"/>
       <w:lvlText w:val="%1."/>
       <w:lvlJc w:val="left"/>
       <w:pPr>
@@ -1510,7 +1459,7 @@
     <w:lvl w:ilvl="0">
       <w:start w:val="1"/>
       <w:numFmt w:val="bullet"/>
-      <w:pStyle w:val="ListBullet"/>
+      <w:pStyle w:val="Listaconvietas"/>
       <w:lvlText w:val=""/>
       <w:lvlJc w:val="left"/>
       <w:pPr>
@@ -1555,7 +1504,7 @@
 </file>
 
 <file path=word/styles.xml><?xml version="1.0" encoding="utf-8"?>
-<w:styles xmlns:mc="http://schemas.openxmlformats.org/markup-compatibility/2006" xmlns:r="http://schemas.openxmlformats.org/officeDocument/2006/relationships" xmlns:w="http://schemas.openxmlformats.org/wordprocessingml/2006/main" xmlns:w14="http://schemas.microsoft.com/office/word/2010/wordml" mc:Ignorable="w14">
+<w:styles xmlns:r="http://schemas.openxmlformats.org/officeDocument/2006/relationships" xmlns:w="http://schemas.openxmlformats.org/wordprocessingml/2006/main">
   <w:docDefaults>
     <w:rPrDefault>
       <w:rPr>
@@ -1571,7 +1520,7 @@
       </w:pPr>
     </w:pPrDefault>
   </w:docDefaults>
-  <w:latentStyles w:defLockedState="0" w:defUIPriority="99" w:defSemiHidden="1" w:defUnhideWhenUsed="1" w:defQFormat="0" w:count="276">
+  <w:latentStyles w:defLockedState="0" w:defUIPriority="99" w:defSemiHidden="1" w:defUnhideWhenUsed="1" w:defQFormat="0" w:count="267">
     <w:lsdException w:name="Normal" w:semiHidden="0" w:uiPriority="0" w:unhideWhenUsed="0" w:qFormat="1"/>
     <w:lsdException w:name="heading 1" w:semiHidden="0" w:uiPriority="9" w:unhideWhenUsed="0" w:qFormat="1"/>
     <w:lsdException w:name="heading 2" w:uiPriority="9" w:qFormat="1"/>
@@ -1720,55 +1669,11 @@
       <w:sz w:val="19"/>
     </w:rPr>
   </w:style>
-  <w:style w:type="paragraph" w:styleId="Header">
-    <w:name w:val="header"/>
-    <w:basedOn w:val="Normal"/>
-    <w:link w:val="HeaderChar"/>
-    <w:uiPriority w:val="99"/>
-    <w:unhideWhenUsed/>
-    <w:rsid w:val="00E618BF"/>
-    <w:pPr>
-      <w:tabs>
-        <w:tab w:val="center" w:pos="4680"/>
-        <w:tab w:val="right" w:pos="9360"/>
-      </w:tabs>
-      <w:spacing w:after="0" w:line="240" w:lineRule="auto"/>
-    </w:pPr>
-  </w:style>
-  <w:style w:type="character" w:customStyle="1" w:styleId="HeaderChar">
-    <w:name w:val="Header Char"/>
-    <w:basedOn w:val="DefaultParagraphFont"/>
-    <w:link w:val="Header"/>
-    <w:uiPriority w:val="99"/>
-    <w:rsid w:val="00E618BF"/>
-  </w:style>
-  <w:style w:type="paragraph" w:styleId="Footer">
-    <w:name w:val="footer"/>
-    <w:basedOn w:val="Normal"/>
-    <w:link w:val="FooterChar"/>
-    <w:uiPriority w:val="99"/>
-    <w:unhideWhenUsed/>
-    <w:rsid w:val="00E618BF"/>
-    <w:pPr>
-      <w:tabs>
-        <w:tab w:val="center" w:pos="4680"/>
-        <w:tab w:val="right" w:pos="9360"/>
-      </w:tabs>
-      <w:spacing w:after="0" w:line="240" w:lineRule="auto"/>
-    </w:pPr>
-  </w:style>
-  <w:style w:type="character" w:customStyle="1" w:styleId="FooterChar">
-    <w:name w:val="Footer Char"/>
-    <w:basedOn w:val="DefaultParagraphFont"/>
-    <w:link w:val="Footer"/>
-    <w:uiPriority w:val="99"/>
-    <w:rsid w:val="00E618BF"/>
-  </w:style>
-  <w:style w:type="paragraph" w:styleId="Heading1">
+  <w:style w:type="paragraph" w:styleId="Ttulo1">
     <w:name w:val="heading 1"/>
     <w:basedOn w:val="Normal"/>
     <w:next w:val="Normal"/>
-    <w:link w:val="Heading1Char"/>
+    <w:link w:val="Ttulo1Car"/>
     <w:uiPriority w:val="9"/>
     <w:qFormat/>
     <w:rsid w:val="00FC693F"/>
@@ -1779,7 +1684,7 @@
       <w:outlineLvl w:val="0"/>
     </w:pPr>
     <w:rPr>
-      <w:rFonts w:asciiTheme="majorHAnsi" w:eastAsiaTheme="majorEastAsia" w:hAnsiTheme="majorHAnsi" w:cstheme="majorBidi" w:ascii="Aptos Display" w:hAnsi="Aptos Display"/>
+      <w:rFonts w:asciiTheme="majorHAnsi" w:eastAsiaTheme="majorEastAsia" w:hAnsiTheme="majorHAnsi" w:cstheme="majorBidi"/>
       <w:b/>
       <w:bCs/>
       <w:color w:val="0F766E"/>
@@ -1787,11 +1692,11 @@
       <w:szCs w:val="28"/>
     </w:rPr>
   </w:style>
-  <w:style w:type="paragraph" w:styleId="Heading2">
+  <w:style w:type="paragraph" w:styleId="Ttulo2">
     <w:name w:val="heading 2"/>
     <w:basedOn w:val="Normal"/>
     <w:next w:val="Normal"/>
-    <w:link w:val="Heading2Char"/>
+    <w:link w:val="Ttulo2Car"/>
     <w:uiPriority w:val="9"/>
     <w:unhideWhenUsed/>
     <w:qFormat/>
@@ -1803,7 +1708,7 @@
       <w:outlineLvl w:val="1"/>
     </w:pPr>
     <w:rPr>
-      <w:rFonts w:asciiTheme="majorHAnsi" w:eastAsiaTheme="majorEastAsia" w:hAnsiTheme="majorHAnsi" w:cstheme="majorBidi" w:ascii="Aptos Display" w:hAnsi="Aptos Display"/>
+      <w:rFonts w:asciiTheme="majorHAnsi" w:eastAsiaTheme="majorEastAsia" w:hAnsiTheme="majorHAnsi" w:cstheme="majorBidi"/>
       <w:b/>
       <w:bCs/>
       <w:color w:val="115E59"/>
@@ -1811,11 +1716,11 @@
       <w:szCs w:val="26"/>
     </w:rPr>
   </w:style>
-  <w:style w:type="paragraph" w:styleId="Heading3">
+  <w:style w:type="paragraph" w:styleId="Ttulo3">
     <w:name w:val="heading 3"/>
     <w:basedOn w:val="Normal"/>
     <w:next w:val="Normal"/>
-    <w:link w:val="Heading3Char"/>
+    <w:link w:val="Ttulo3Car"/>
     <w:uiPriority w:val="9"/>
     <w:unhideWhenUsed/>
     <w:qFormat/>
@@ -1827,18 +1732,18 @@
       <w:outlineLvl w:val="2"/>
     </w:pPr>
     <w:rPr>
-      <w:rFonts w:asciiTheme="majorHAnsi" w:eastAsiaTheme="majorEastAsia" w:hAnsiTheme="majorHAnsi" w:cstheme="majorBidi" w:ascii="Aptos Display" w:hAnsi="Aptos Display"/>
+      <w:rFonts w:asciiTheme="majorHAnsi" w:eastAsiaTheme="majorEastAsia" w:hAnsiTheme="majorHAnsi" w:cstheme="majorBidi"/>
       <w:b/>
       <w:bCs/>
       <w:color w:val="0D9488"/>
       <w:sz w:val="20"/>
     </w:rPr>
   </w:style>
-  <w:style w:type="paragraph" w:styleId="Heading4">
+  <w:style w:type="paragraph" w:styleId="Ttulo4">
     <w:name w:val="heading 4"/>
     <w:basedOn w:val="Normal"/>
     <w:next w:val="Normal"/>
-    <w:link w:val="Heading4Char"/>
+    <w:link w:val="Ttulo4Car"/>
     <w:uiPriority w:val="9"/>
     <w:semiHidden/>
     <w:unhideWhenUsed/>
@@ -1859,11 +1764,11 @@
       <w:color w:val="4F81BD" w:themeColor="accent1"/>
     </w:rPr>
   </w:style>
-  <w:style w:type="paragraph" w:styleId="Heading5">
+  <w:style w:type="paragraph" w:styleId="Ttulo5">
     <w:name w:val="heading 5"/>
     <w:basedOn w:val="Normal"/>
     <w:next w:val="Normal"/>
-    <w:link w:val="Heading5Char"/>
+    <w:link w:val="Ttulo5Car"/>
     <w:uiPriority w:val="9"/>
     <w:semiHidden/>
     <w:unhideWhenUsed/>
@@ -1880,11 +1785,11 @@
       <w:color w:val="243F60" w:themeColor="accent1" w:themeShade="7F"/>
     </w:rPr>
   </w:style>
-  <w:style w:type="paragraph" w:styleId="Heading6">
+  <w:style w:type="paragraph" w:styleId="Ttulo6">
     <w:name w:val="heading 6"/>
     <w:basedOn w:val="Normal"/>
     <w:next w:val="Normal"/>
-    <w:link w:val="Heading6Char"/>
+    <w:link w:val="Ttulo6Car"/>
     <w:uiPriority w:val="9"/>
     <w:semiHidden/>
     <w:unhideWhenUsed/>
@@ -1903,11 +1808,11 @@
       <w:color w:val="243F60" w:themeColor="accent1" w:themeShade="7F"/>
     </w:rPr>
   </w:style>
-  <w:style w:type="paragraph" w:styleId="Heading7">
+  <w:style w:type="paragraph" w:styleId="Ttulo7">
     <w:name w:val="heading 7"/>
     <w:basedOn w:val="Normal"/>
     <w:next w:val="Normal"/>
-    <w:link w:val="Heading7Char"/>
+    <w:link w:val="Ttulo7Car"/>
     <w:uiPriority w:val="9"/>
     <w:semiHidden/>
     <w:unhideWhenUsed/>
@@ -1926,11 +1831,11 @@
       <w:color w:val="404040" w:themeColor="text1" w:themeTint="BF"/>
     </w:rPr>
   </w:style>
-  <w:style w:type="paragraph" w:styleId="Heading8">
+  <w:style w:type="paragraph" w:styleId="Ttulo8">
     <w:name w:val="heading 8"/>
     <w:basedOn w:val="Normal"/>
     <w:next w:val="Normal"/>
-    <w:link w:val="Heading8Char"/>
+    <w:link w:val="Ttulo8Car"/>
     <w:uiPriority w:val="9"/>
     <w:semiHidden/>
     <w:unhideWhenUsed/>
@@ -1949,11 +1854,11 @@
       <w:szCs w:val="20"/>
     </w:rPr>
   </w:style>
-  <w:style w:type="paragraph" w:styleId="Heading9">
+  <w:style w:type="paragraph" w:styleId="Ttulo9">
     <w:name w:val="heading 9"/>
     <w:basedOn w:val="Normal"/>
     <w:next w:val="Normal"/>
-    <w:link w:val="Heading9Char"/>
+    <w:link w:val="Ttulo9Car"/>
     <w:uiPriority w:val="9"/>
     <w:semiHidden/>
     <w:unhideWhenUsed/>
@@ -1974,17 +1879,18 @@
       <w:szCs w:val="20"/>
     </w:rPr>
   </w:style>
-  <w:style w:type="character" w:default="1" w:styleId="DefaultParagraphFont">
+  <w:style w:type="character" w:default="1" w:styleId="Fuentedeprrafopredeter">
     <w:name w:val="Default Paragraph Font"/>
     <w:uiPriority w:val="1"/>
     <w:semiHidden/>
     <w:unhideWhenUsed/>
   </w:style>
-  <w:style w:type="table" w:default="1" w:styleId="TableNormal">
+  <w:style w:type="table" w:default="1" w:styleId="Tablanormal">
     <w:name w:val="Normal Table"/>
     <w:uiPriority w:val="99"/>
     <w:semiHidden/>
     <w:unhideWhenUsed/>
+    <w:qFormat/>
     <w:tblPr>
       <w:tblInd w:w="0" w:type="dxa"/>
       <w:tblCellMar>
@@ -1995,13 +1901,57 @@
       </w:tblCellMar>
     </w:tblPr>
   </w:style>
-  <w:style w:type="numbering" w:default="1" w:styleId="NoList">
+  <w:style w:type="numbering" w:default="1" w:styleId="Sinlista">
     <w:name w:val="No List"/>
     <w:uiPriority w:val="99"/>
     <w:semiHidden/>
     <w:unhideWhenUsed/>
   </w:style>
-  <w:style w:type="paragraph" w:styleId="NoSpacing">
+  <w:style w:type="paragraph" w:styleId="Encabezado">
+    <w:name w:val="header"/>
+    <w:basedOn w:val="Normal"/>
+    <w:link w:val="EncabezadoCar"/>
+    <w:uiPriority w:val="99"/>
+    <w:unhideWhenUsed/>
+    <w:rsid w:val="00E618BF"/>
+    <w:pPr>
+      <w:tabs>
+        <w:tab w:val="center" w:pos="4680"/>
+        <w:tab w:val="right" w:pos="9360"/>
+      </w:tabs>
+      <w:spacing w:after="0" w:line="240" w:lineRule="auto"/>
+    </w:pPr>
+  </w:style>
+  <w:style w:type="character" w:customStyle="1" w:styleId="EncabezadoCar">
+    <w:name w:val="Encabezado Car"/>
+    <w:basedOn w:val="Fuentedeprrafopredeter"/>
+    <w:link w:val="Encabezado"/>
+    <w:uiPriority w:val="99"/>
+    <w:rsid w:val="00E618BF"/>
+  </w:style>
+  <w:style w:type="paragraph" w:styleId="Piedepgina">
+    <w:name w:val="footer"/>
+    <w:basedOn w:val="Normal"/>
+    <w:link w:val="PiedepginaCar"/>
+    <w:uiPriority w:val="99"/>
+    <w:unhideWhenUsed/>
+    <w:rsid w:val="00E618BF"/>
+    <w:pPr>
+      <w:tabs>
+        <w:tab w:val="center" w:pos="4680"/>
+        <w:tab w:val="right" w:pos="9360"/>
+      </w:tabs>
+      <w:spacing w:after="0" w:line="240" w:lineRule="auto"/>
+    </w:pPr>
+  </w:style>
+  <w:style w:type="character" w:customStyle="1" w:styleId="PiedepginaCar">
+    <w:name w:val="Pie de página Car"/>
+    <w:basedOn w:val="Fuentedeprrafopredeter"/>
+    <w:link w:val="Piedepgina"/>
+    <w:uiPriority w:val="99"/>
+    <w:rsid w:val="00E618BF"/>
+  </w:style>
+  <w:style w:type="paragraph" w:styleId="Sinespaciado">
     <w:name w:val="No Spacing"/>
     <w:uiPriority w:val="1"/>
     <w:qFormat/>
@@ -2010,10 +1960,10 @@
       <w:spacing w:after="0" w:line="240" w:lineRule="auto"/>
     </w:pPr>
   </w:style>
-  <w:style w:type="character" w:customStyle="1" w:styleId="Heading1Char">
-    <w:name w:val="Heading 1 Char"/>
-    <w:basedOn w:val="DefaultParagraphFont"/>
-    <w:link w:val="Heading1"/>
+  <w:style w:type="character" w:customStyle="1" w:styleId="Ttulo1Car">
+    <w:name w:val="Título 1 Car"/>
+    <w:basedOn w:val="Fuentedeprrafopredeter"/>
+    <w:link w:val="Ttulo1"/>
     <w:uiPriority w:val="9"/>
     <w:rsid w:val="00FC693F"/>
     <w:rPr>
@@ -2025,10 +1975,10 @@
       <w:szCs w:val="28"/>
     </w:rPr>
   </w:style>
-  <w:style w:type="character" w:customStyle="1" w:styleId="Heading2Char">
-    <w:name w:val="Heading 2 Char"/>
-    <w:basedOn w:val="DefaultParagraphFont"/>
-    <w:link w:val="Heading2"/>
+  <w:style w:type="character" w:customStyle="1" w:styleId="Ttulo2Car">
+    <w:name w:val="Título 2 Car"/>
+    <w:basedOn w:val="Fuentedeprrafopredeter"/>
+    <w:link w:val="Ttulo2"/>
     <w:uiPriority w:val="9"/>
     <w:rsid w:val="00FC693F"/>
     <w:rPr>
@@ -2040,10 +1990,10 @@
       <w:szCs w:val="26"/>
     </w:rPr>
   </w:style>
-  <w:style w:type="character" w:customStyle="1" w:styleId="Heading3Char">
-    <w:name w:val="Heading 3 Char"/>
-    <w:basedOn w:val="DefaultParagraphFont"/>
-    <w:link w:val="Heading3"/>
+  <w:style w:type="character" w:customStyle="1" w:styleId="Ttulo3Car">
+    <w:name w:val="Título 3 Car"/>
+    <w:basedOn w:val="Fuentedeprrafopredeter"/>
+    <w:link w:val="Ttulo3"/>
     <w:uiPriority w:val="9"/>
     <w:rsid w:val="00FC693F"/>
     <w:rPr>
@@ -2053,11 +2003,11 @@
       <w:color w:val="4F81BD" w:themeColor="accent1"/>
     </w:rPr>
   </w:style>
-  <w:style w:type="paragraph" w:styleId="Title">
+  <w:style w:type="paragraph" w:styleId="Ttulo">
     <w:name w:val="Title"/>
     <w:basedOn w:val="Normal"/>
     <w:next w:val="Normal"/>
-    <w:link w:val="TitleChar"/>
+    <w:link w:val="TtuloCar"/>
     <w:uiPriority w:val="10"/>
     <w:qFormat/>
     <w:rsid w:val="00FC693F"/>
@@ -2069,7 +2019,7 @@
       <w:contextualSpacing/>
     </w:pPr>
     <w:rPr>
-      <w:rFonts w:asciiTheme="majorHAnsi" w:eastAsiaTheme="majorEastAsia" w:hAnsiTheme="majorHAnsi" w:cstheme="majorBidi" w:ascii="Aptos Display" w:hAnsi="Aptos Display"/>
+      <w:rFonts w:asciiTheme="majorHAnsi" w:eastAsiaTheme="majorEastAsia" w:hAnsiTheme="majorHAnsi" w:cstheme="majorBidi"/>
       <w:b/>
       <w:color w:val="115E59"/>
       <w:spacing w:val="5"/>
@@ -2078,10 +2028,10 @@
       <w:szCs w:val="52"/>
     </w:rPr>
   </w:style>
-  <w:style w:type="character" w:customStyle="1" w:styleId="TitleChar">
-    <w:name w:val="Title Char"/>
-    <w:basedOn w:val="DefaultParagraphFont"/>
-    <w:link w:val="Title"/>
+  <w:style w:type="character" w:customStyle="1" w:styleId="TtuloCar">
+    <w:name w:val="Título Car"/>
+    <w:basedOn w:val="Fuentedeprrafopredeter"/>
+    <w:link w:val="Ttulo"/>
     <w:uiPriority w:val="10"/>
     <w:rsid w:val="00FC693F"/>
     <w:rPr>
@@ -2093,11 +2043,11 @@
       <w:szCs w:val="52"/>
     </w:rPr>
   </w:style>
-  <w:style w:type="paragraph" w:styleId="Subtitle">
+  <w:style w:type="paragraph" w:styleId="Subttulo">
     <w:name w:val="Subtitle"/>
     <w:basedOn w:val="Normal"/>
     <w:next w:val="Normal"/>
-    <w:link w:val="SubtitleChar"/>
+    <w:link w:val="SubttuloCar"/>
     <w:uiPriority w:val="11"/>
     <w:qFormat/>
     <w:rsid w:val="00FC693F"/>
@@ -2116,10 +2066,10 @@
       <w:szCs w:val="24"/>
     </w:rPr>
   </w:style>
-  <w:style w:type="character" w:customStyle="1" w:styleId="SubtitleChar">
-    <w:name w:val="Subtitle Char"/>
-    <w:basedOn w:val="DefaultParagraphFont"/>
-    <w:link w:val="Subtitle"/>
+  <w:style w:type="character" w:customStyle="1" w:styleId="SubttuloCar">
+    <w:name w:val="Subtítulo Car"/>
+    <w:basedOn w:val="Fuentedeprrafopredeter"/>
+    <w:link w:val="Subttulo"/>
     <w:uiPriority w:val="11"/>
     <w:rsid w:val="00FC693F"/>
     <w:rPr>
@@ -2132,7 +2082,7 @@
       <w:szCs w:val="24"/>
     </w:rPr>
   </w:style>
-  <w:style w:type="paragraph" w:styleId="ListParagraph">
+  <w:style w:type="paragraph" w:styleId="Prrafodelista">
     <w:name w:val="List Paragraph"/>
     <w:basedOn w:val="Normal"/>
     <w:uiPriority w:val="34"/>
@@ -2143,10 +2093,10 @@
       <w:contextualSpacing/>
     </w:pPr>
   </w:style>
-  <w:style w:type="paragraph" w:styleId="BodyText">
+  <w:style w:type="paragraph" w:styleId="Textoindependiente">
     <w:name w:val="Body Text"/>
     <w:basedOn w:val="Normal"/>
-    <w:link w:val="BodyTextChar"/>
+    <w:link w:val="TextoindependienteCar"/>
     <w:uiPriority w:val="99"/>
     <w:unhideWhenUsed/>
     <w:rsid w:val="00AA1D8D"/>
@@ -2154,17 +2104,17 @@
       <w:spacing w:after="120"/>
     </w:pPr>
   </w:style>
-  <w:style w:type="character" w:customStyle="1" w:styleId="BodyTextChar">
-    <w:name w:val="Body Text Char"/>
-    <w:basedOn w:val="DefaultParagraphFont"/>
-    <w:link w:val="BodyText"/>
+  <w:style w:type="character" w:customStyle="1" w:styleId="TextoindependienteCar">
+    <w:name w:val="Texto independiente Car"/>
+    <w:basedOn w:val="Fuentedeprrafopredeter"/>
+    <w:link w:val="Textoindependiente"/>
     <w:uiPriority w:val="99"/>
     <w:rsid w:val="00AA1D8D"/>
   </w:style>
-  <w:style w:type="paragraph" w:styleId="BodyText2">
+  <w:style w:type="paragraph" w:styleId="Textoindependiente2">
     <w:name w:val="Body Text 2"/>
     <w:basedOn w:val="Normal"/>
-    <w:link w:val="BodyText2Char"/>
+    <w:link w:val="Textoindependiente2Car"/>
     <w:uiPriority w:val="99"/>
     <w:unhideWhenUsed/>
     <w:rsid w:val="00AA1D8D"/>
@@ -2172,17 +2122,17 @@
       <w:spacing w:after="120" w:line="480" w:lineRule="auto"/>
     </w:pPr>
   </w:style>
-  <w:style w:type="character" w:customStyle="1" w:styleId="BodyText2Char">
-    <w:name w:val="Body Text 2 Char"/>
-    <w:basedOn w:val="DefaultParagraphFont"/>
-    <w:link w:val="BodyText2"/>
+  <w:style w:type="character" w:customStyle="1" w:styleId="Textoindependiente2Car">
+    <w:name w:val="Texto independiente 2 Car"/>
+    <w:basedOn w:val="Fuentedeprrafopredeter"/>
+    <w:link w:val="Textoindependiente2"/>
     <w:uiPriority w:val="99"/>
     <w:rsid w:val="00AA1D8D"/>
   </w:style>
-  <w:style w:type="paragraph" w:styleId="BodyText3">
+  <w:style w:type="paragraph" w:styleId="Textoindependiente3">
     <w:name w:val="Body Text 3"/>
     <w:basedOn w:val="Normal"/>
-    <w:link w:val="BodyText3Char"/>
+    <w:link w:val="Textoindependiente3Car"/>
     <w:uiPriority w:val="99"/>
     <w:unhideWhenUsed/>
     <w:rsid w:val="00AA1D8D"/>
@@ -2194,10 +2144,10 @@
       <w:szCs w:val="16"/>
     </w:rPr>
   </w:style>
-  <w:style w:type="character" w:customStyle="1" w:styleId="BodyText3Char">
-    <w:name w:val="Body Text 3 Char"/>
-    <w:basedOn w:val="DefaultParagraphFont"/>
-    <w:link w:val="BodyText3"/>
+  <w:style w:type="character" w:customStyle="1" w:styleId="Textoindependiente3Car">
+    <w:name w:val="Texto independiente 3 Car"/>
+    <w:basedOn w:val="Fuentedeprrafopredeter"/>
+    <w:link w:val="Textoindependiente3"/>
     <w:uiPriority w:val="99"/>
     <w:rsid w:val="00AA1D8D"/>
     <w:rPr>
@@ -2205,7 +2155,7 @@
       <w:szCs w:val="16"/>
     </w:rPr>
   </w:style>
-  <w:style w:type="paragraph" w:styleId="List">
+  <w:style w:type="paragraph" w:styleId="Lista">
     <w:name w:val="List"/>
     <w:basedOn w:val="Normal"/>
     <w:uiPriority w:val="99"/>
@@ -2216,7 +2166,7 @@
       <w:contextualSpacing/>
     </w:pPr>
   </w:style>
-  <w:style w:type="paragraph" w:styleId="List2">
+  <w:style w:type="paragraph" w:styleId="Lista2">
     <w:name w:val="List 2"/>
     <w:basedOn w:val="Normal"/>
     <w:uiPriority w:val="99"/>
@@ -2227,7 +2177,7 @@
       <w:contextualSpacing/>
     </w:pPr>
   </w:style>
-  <w:style w:type="paragraph" w:styleId="List3">
+  <w:style w:type="paragraph" w:styleId="Lista3">
     <w:name w:val="List 3"/>
     <w:basedOn w:val="Normal"/>
     <w:uiPriority w:val="99"/>
@@ -2238,7 +2188,7 @@
       <w:contextualSpacing/>
     </w:pPr>
   </w:style>
-  <w:style w:type="paragraph" w:styleId="ListBullet">
+  <w:style w:type="paragraph" w:styleId="Listaconvietas">
     <w:name w:val="List Bullet"/>
     <w:basedOn w:val="Normal"/>
     <w:uiPriority w:val="99"/>
@@ -2251,7 +2201,7 @@
       <w:contextualSpacing/>
     </w:pPr>
   </w:style>
-  <w:style w:type="paragraph" w:styleId="ListBullet2">
+  <w:style w:type="paragraph" w:styleId="Listaconvietas2">
     <w:name w:val="List Bullet 2"/>
     <w:basedOn w:val="Normal"/>
     <w:uiPriority w:val="99"/>
@@ -2264,7 +2214,7 @@
       <w:contextualSpacing/>
     </w:pPr>
   </w:style>
-  <w:style w:type="paragraph" w:styleId="ListBullet3">
+  <w:style w:type="paragraph" w:styleId="Listaconvietas3">
     <w:name w:val="List Bullet 3"/>
     <w:basedOn w:val="Normal"/>
     <w:uiPriority w:val="99"/>
@@ -2277,7 +2227,7 @@
       <w:contextualSpacing/>
     </w:pPr>
   </w:style>
-  <w:style w:type="paragraph" w:styleId="ListNumber">
+  <w:style w:type="paragraph" w:styleId="Listaconnmeros">
     <w:name w:val="List Number"/>
     <w:basedOn w:val="Normal"/>
     <w:uiPriority w:val="99"/>
@@ -2290,7 +2240,7 @@
       <w:contextualSpacing/>
     </w:pPr>
   </w:style>
-  <w:style w:type="paragraph" w:styleId="ListNumber2">
+  <w:style w:type="paragraph" w:styleId="Listaconnmeros2">
     <w:name w:val="List Number 2"/>
     <w:basedOn w:val="Normal"/>
     <w:uiPriority w:val="99"/>
@@ -2303,7 +2253,7 @@
       <w:contextualSpacing/>
     </w:pPr>
   </w:style>
-  <w:style w:type="paragraph" w:styleId="ListNumber3">
+  <w:style w:type="paragraph" w:styleId="Listaconnmeros3">
     <w:name w:val="List Number 3"/>
     <w:basedOn w:val="Normal"/>
     <w:uiPriority w:val="99"/>
@@ -2316,7 +2266,7 @@
       <w:contextualSpacing/>
     </w:pPr>
   </w:style>
-  <w:style w:type="paragraph" w:styleId="ListContinue">
+  <w:style w:type="paragraph" w:styleId="Continuarlista">
     <w:name w:val="List Continue"/>
     <w:basedOn w:val="Normal"/>
     <w:uiPriority w:val="99"/>
@@ -2328,7 +2278,7 @@
       <w:contextualSpacing/>
     </w:pPr>
   </w:style>
-  <w:style w:type="paragraph" w:styleId="ListContinue2">
+  <w:style w:type="paragraph" w:styleId="Continuarlista2">
     <w:name w:val="List Continue 2"/>
     <w:basedOn w:val="Normal"/>
     <w:uiPriority w:val="99"/>
@@ -2340,7 +2290,7 @@
       <w:contextualSpacing/>
     </w:pPr>
   </w:style>
-  <w:style w:type="paragraph" w:styleId="ListContinue3">
+  <w:style w:type="paragraph" w:styleId="Continuarlista3">
     <w:name w:val="List Continue 3"/>
     <w:basedOn w:val="Normal"/>
     <w:uiPriority w:val="99"/>
@@ -2352,9 +2302,9 @@
       <w:contextualSpacing/>
     </w:pPr>
   </w:style>
-  <w:style w:type="paragraph" w:styleId="MacroText">
+  <w:style w:type="paragraph" w:styleId="Textomacro">
     <w:name w:val="macro"/>
-    <w:link w:val="MacroTextChar"/>
+    <w:link w:val="TextomacroCar"/>
     <w:uiPriority w:val="99"/>
     <w:unhideWhenUsed/>
     <w:rsid w:val="0029639D"/>
@@ -2375,10 +2325,10 @@
       <w:szCs w:val="20"/>
     </w:rPr>
   </w:style>
-  <w:style w:type="character" w:customStyle="1" w:styleId="MacroTextChar">
-    <w:name w:val="Macro Text Char"/>
-    <w:basedOn w:val="DefaultParagraphFont"/>
-    <w:link w:val="MacroText"/>
+  <w:style w:type="character" w:customStyle="1" w:styleId="TextomacroCar">
+    <w:name w:val="Texto macro Car"/>
+    <w:basedOn w:val="Fuentedeprrafopredeter"/>
+    <w:link w:val="Textomacro"/>
     <w:uiPriority w:val="99"/>
     <w:rsid w:val="0029639D"/>
     <w:rPr>
@@ -2387,11 +2337,11 @@
       <w:szCs w:val="20"/>
     </w:rPr>
   </w:style>
-  <w:style w:type="paragraph" w:styleId="Quote">
+  <w:style w:type="paragraph" w:styleId="Cita">
     <w:name w:val="Quote"/>
     <w:basedOn w:val="Normal"/>
     <w:next w:val="Normal"/>
-    <w:link w:val="QuoteChar"/>
+    <w:link w:val="CitaCar"/>
     <w:uiPriority w:val="29"/>
     <w:qFormat/>
     <w:rsid w:val="00FC693F"/>
@@ -2401,10 +2351,10 @@
       <w:color w:val="000000" w:themeColor="text1"/>
     </w:rPr>
   </w:style>
-  <w:style w:type="character" w:customStyle="1" w:styleId="QuoteChar">
-    <w:name w:val="Quote Char"/>
-    <w:basedOn w:val="DefaultParagraphFont"/>
-    <w:link w:val="Quote"/>
+  <w:style w:type="character" w:customStyle="1" w:styleId="CitaCar">
+    <w:name w:val="Cita Car"/>
+    <w:basedOn w:val="Fuentedeprrafopredeter"/>
+    <w:link w:val="Cita"/>
     <w:uiPriority w:val="29"/>
     <w:rsid w:val="00FC693F"/>
     <w:rPr>
@@ -2413,10 +2363,10 @@
       <w:color w:val="000000" w:themeColor="text1"/>
     </w:rPr>
   </w:style>
-  <w:style w:type="character" w:customStyle="1" w:styleId="Heading4Char">
-    <w:name w:val="Heading 4 Char"/>
-    <w:basedOn w:val="DefaultParagraphFont"/>
-    <w:link w:val="Heading4"/>
+  <w:style w:type="character" w:customStyle="1" w:styleId="Ttulo4Car">
+    <w:name w:val="Título 4 Car"/>
+    <w:basedOn w:val="Fuentedeprrafopredeter"/>
+    <w:link w:val="Ttulo4"/>
     <w:uiPriority w:val="9"/>
     <w:semiHidden/>
     <w:rsid w:val="00FC693F"/>
@@ -2429,10 +2379,10 @@
       <w:color w:val="4F81BD" w:themeColor="accent1"/>
     </w:rPr>
   </w:style>
-  <w:style w:type="character" w:customStyle="1" w:styleId="Heading5Char">
-    <w:name w:val="Heading 5 Char"/>
-    <w:basedOn w:val="DefaultParagraphFont"/>
-    <w:link w:val="Heading5"/>
+  <w:style w:type="character" w:customStyle="1" w:styleId="Ttulo5Car">
+    <w:name w:val="Título 5 Car"/>
+    <w:basedOn w:val="Fuentedeprrafopredeter"/>
+    <w:link w:val="Ttulo5"/>
     <w:uiPriority w:val="9"/>
     <w:semiHidden/>
     <w:rsid w:val="00FC693F"/>
@@ -2441,10 +2391,10 @@
       <w:color w:val="243F60" w:themeColor="accent1" w:themeShade="7F"/>
     </w:rPr>
   </w:style>
-  <w:style w:type="character" w:customStyle="1" w:styleId="Heading6Char">
-    <w:name w:val="Heading 6 Char"/>
-    <w:basedOn w:val="DefaultParagraphFont"/>
-    <w:link w:val="Heading6"/>
+  <w:style w:type="character" w:customStyle="1" w:styleId="Ttulo6Car">
+    <w:name w:val="Título 6 Car"/>
+    <w:basedOn w:val="Fuentedeprrafopredeter"/>
+    <w:link w:val="Ttulo6"/>
     <w:uiPriority w:val="9"/>
     <w:semiHidden/>
     <w:rsid w:val="00FC693F"/>
@@ -2455,10 +2405,10 @@
       <w:color w:val="243F60" w:themeColor="accent1" w:themeShade="7F"/>
     </w:rPr>
   </w:style>
-  <w:style w:type="character" w:customStyle="1" w:styleId="Heading7Char">
-    <w:name w:val="Heading 7 Char"/>
-    <w:basedOn w:val="DefaultParagraphFont"/>
-    <w:link w:val="Heading7"/>
+  <w:style w:type="character" w:customStyle="1" w:styleId="Ttulo7Car">
+    <w:name w:val="Título 7 Car"/>
+    <w:basedOn w:val="Fuentedeprrafopredeter"/>
+    <w:link w:val="Ttulo7"/>
     <w:uiPriority w:val="9"/>
     <w:semiHidden/>
     <w:rsid w:val="00FC693F"/>
@@ -2469,10 +2419,10 @@
       <w:color w:val="404040" w:themeColor="text1" w:themeTint="BF"/>
     </w:rPr>
   </w:style>
-  <w:style w:type="character" w:customStyle="1" w:styleId="Heading8Char">
-    <w:name w:val="Heading 8 Char"/>
-    <w:basedOn w:val="DefaultParagraphFont"/>
-    <w:link w:val="Heading8"/>
+  <w:style w:type="character" w:customStyle="1" w:styleId="Ttulo8Car">
+    <w:name w:val="Título 8 Car"/>
+    <w:basedOn w:val="Fuentedeprrafopredeter"/>
+    <w:link w:val="Ttulo8"/>
     <w:uiPriority w:val="9"/>
     <w:semiHidden/>
     <w:rsid w:val="00FC693F"/>
@@ -2483,10 +2433,10 @@
       <w:szCs w:val="20"/>
     </w:rPr>
   </w:style>
-  <w:style w:type="character" w:customStyle="1" w:styleId="Heading9Char">
-    <w:name w:val="Heading 9 Char"/>
-    <w:basedOn w:val="DefaultParagraphFont"/>
-    <w:link w:val="Heading9"/>
+  <w:style w:type="character" w:customStyle="1" w:styleId="Ttulo9Car">
+    <w:name w:val="Título 9 Car"/>
+    <w:basedOn w:val="Fuentedeprrafopredeter"/>
+    <w:link w:val="Ttulo9"/>
     <w:uiPriority w:val="9"/>
     <w:semiHidden/>
     <w:rsid w:val="00FC693F"/>
@@ -2499,7 +2449,7 @@
       <w:szCs w:val="20"/>
     </w:rPr>
   </w:style>
-  <w:style w:type="paragraph" w:styleId="Caption">
+  <w:style w:type="paragraph" w:styleId="Epgrafe">
     <w:name w:val="caption"/>
     <w:basedOn w:val="Normal"/>
     <w:next w:val="Normal"/>
@@ -2519,9 +2469,9 @@
       <w:szCs w:val="18"/>
     </w:rPr>
   </w:style>
-  <w:style w:type="character" w:styleId="Strong">
+  <w:style w:type="character" w:styleId="Textoennegrita">
     <w:name w:val="Strong"/>
-    <w:basedOn w:val="DefaultParagraphFont"/>
+    <w:basedOn w:val="Fuentedeprrafopredeter"/>
     <w:uiPriority w:val="22"/>
     <w:qFormat/>
     <w:rsid w:val="00FC693F"/>
@@ -2530,9 +2480,9 @@
       <w:bCs/>
     </w:rPr>
   </w:style>
-  <w:style w:type="character" w:styleId="Emphasis">
+  <w:style w:type="character" w:styleId="nfasis">
     <w:name w:val="Emphasis"/>
-    <w:basedOn w:val="DefaultParagraphFont"/>
+    <w:basedOn w:val="Fuentedeprrafopredeter"/>
     <w:uiPriority w:val="20"/>
     <w:qFormat/>
     <w:rsid w:val="00FC693F"/>
@@ -2541,11 +2491,11 @@
       <w:iCs/>
     </w:rPr>
   </w:style>
-  <w:style w:type="paragraph" w:styleId="IntenseQuote">
+  <w:style w:type="paragraph" w:styleId="Citadestacada">
     <w:name w:val="Intense Quote"/>
     <w:basedOn w:val="Normal"/>
     <w:next w:val="Normal"/>
-    <w:link w:val="IntenseQuoteChar"/>
+    <w:link w:val="CitadestacadaCar"/>
     <w:uiPriority w:val="30"/>
     <w:qFormat/>
     <w:rsid w:val="00FC693F"/>
@@ -2564,10 +2514,10 @@
       <w:color w:val="4F81BD" w:themeColor="accent1"/>
     </w:rPr>
   </w:style>
-  <w:style w:type="character" w:customStyle="1" w:styleId="IntenseQuoteChar">
-    <w:name w:val="Intense Quote Char"/>
-    <w:basedOn w:val="DefaultParagraphFont"/>
-    <w:link w:val="IntenseQuote"/>
+  <w:style w:type="character" w:customStyle="1" w:styleId="CitadestacadaCar">
+    <w:name w:val="Cita destacada Car"/>
+    <w:basedOn w:val="Fuentedeprrafopredeter"/>
+    <w:link w:val="Citadestacada"/>
     <w:uiPriority w:val="30"/>
     <w:rsid w:val="00FC693F"/>
     <w:rPr>
@@ -2578,9 +2528,9 @@
       <w:color w:val="4F81BD" w:themeColor="accent1"/>
     </w:rPr>
   </w:style>
-  <w:style w:type="character" w:styleId="SubtleEmphasis">
+  <w:style w:type="character" w:styleId="nfasissutil">
     <w:name w:val="Subtle Emphasis"/>
-    <w:basedOn w:val="DefaultParagraphFont"/>
+    <w:basedOn w:val="Fuentedeprrafopredeter"/>
     <w:uiPriority w:val="19"/>
     <w:qFormat/>
     <w:rsid w:val="00FC693F"/>
@@ -2590,9 +2540,9 @@
       <w:color w:val="808080" w:themeColor="text1" w:themeTint="7F"/>
     </w:rPr>
   </w:style>
-  <w:style w:type="character" w:styleId="IntenseEmphasis">
+  <w:style w:type="character" w:styleId="nfasisintenso">
     <w:name w:val="Intense Emphasis"/>
-    <w:basedOn w:val="DefaultParagraphFont"/>
+    <w:basedOn w:val="Fuentedeprrafopredeter"/>
     <w:uiPriority w:val="21"/>
     <w:qFormat/>
     <w:rsid w:val="00FC693F"/>
@@ -2604,9 +2554,9 @@
       <w:color w:val="4F81BD" w:themeColor="accent1"/>
     </w:rPr>
   </w:style>
-  <w:style w:type="character" w:styleId="SubtleReference">
+  <w:style w:type="character" w:styleId="Referenciasutil">
     <w:name w:val="Subtle Reference"/>
-    <w:basedOn w:val="DefaultParagraphFont"/>
+    <w:basedOn w:val="Fuentedeprrafopredeter"/>
     <w:uiPriority w:val="31"/>
     <w:qFormat/>
     <w:rsid w:val="00FC693F"/>
@@ -2616,9 +2566,9 @@
       <w:u w:val="single"/>
     </w:rPr>
   </w:style>
-  <w:style w:type="character" w:styleId="IntenseReference">
+  <w:style w:type="character" w:styleId="Referenciaintensa">
     <w:name w:val="Intense Reference"/>
-    <w:basedOn w:val="DefaultParagraphFont"/>
+    <w:basedOn w:val="Fuentedeprrafopredeter"/>
     <w:uiPriority w:val="32"/>
     <w:qFormat/>
     <w:rsid w:val="00FC693F"/>
@@ -2631,9 +2581,9 @@
       <w:u w:val="single"/>
     </w:rPr>
   </w:style>
-  <w:style w:type="character" w:styleId="BookTitle">
+  <w:style w:type="character" w:styleId="Ttulodellibro">
     <w:name w:val="Book Title"/>
-    <w:basedOn w:val="DefaultParagraphFont"/>
+    <w:basedOn w:val="Fuentedeprrafopredeter"/>
     <w:uiPriority w:val="33"/>
     <w:qFormat/>
     <w:rsid w:val="00FC693F"/>
@@ -2644,9 +2594,9 @@
       <w:spacing w:val="5"/>
     </w:rPr>
   </w:style>
-  <w:style w:type="paragraph" w:styleId="TOCHeading">
+  <w:style w:type="paragraph" w:styleId="TtulodeTDC">
     <w:name w:val="TOC Heading"/>
-    <w:basedOn w:val="Heading1"/>
+    <w:basedOn w:val="Ttulo1"/>
     <w:next w:val="Normal"/>
     <w:uiPriority w:val="39"/>
     <w:semiHidden/>
@@ -2657,9 +2607,9 @@
       <w:outlineLvl w:val="9"/>
     </w:pPr>
   </w:style>
-  <w:style w:type="table" w:styleId="TableGrid">
+  <w:style w:type="table" w:styleId="Tablaconcuadrcula">
     <w:name w:val="Table Grid"/>
-    <w:basedOn w:val="TableNormal"/>
+    <w:basedOn w:val="Tablanormal"/>
     <w:uiPriority w:val="59"/>
     <w:rsid w:val="00FC693F"/>
     <w:pPr>
@@ -2683,9 +2633,9 @@
       </w:tblCellMar>
     </w:tblPr>
   </w:style>
-  <w:style w:type="table" w:styleId="LightShading">
+  <w:style w:type="table" w:styleId="Sombreadoclaro">
     <w:name w:val="Light Shading"/>
-    <w:basedOn w:val="TableNormal"/>
+    <w:basedOn w:val="Tablanormal"/>
     <w:uiPriority w:val="60"/>
     <w:rsid w:val="00FC693F"/>
     <w:pPr>
@@ -2786,9 +2736,9 @@
       </w:tcPr>
     </w:tblStylePr>
   </w:style>
-  <w:style w:type="table" w:styleId="LightShading-Accent1">
+  <w:style w:type="table" w:styleId="Sombreadoclaro-nfasis1">
     <w:name w:val="Light Shading Accent 1"/>
-    <w:basedOn w:val="TableNormal"/>
+    <w:basedOn w:val="Tablanormal"/>
     <w:uiPriority w:val="60"/>
     <w:rsid w:val="00FC693F"/>
     <w:pPr>
@@ -2889,9 +2839,9 @@
       </w:tcPr>
     </w:tblStylePr>
   </w:style>
-  <w:style w:type="table" w:styleId="LightShading-Accent2">
+  <w:style w:type="table" w:styleId="Sombreadoclaro-nfasis2">
     <w:name w:val="Light Shading Accent 2"/>
-    <w:basedOn w:val="TableNormal"/>
+    <w:basedOn w:val="Tablanormal"/>
     <w:uiPriority w:val="60"/>
     <w:rsid w:val="00FC693F"/>
     <w:pPr>
@@ -2992,9 +2942,9 @@
       </w:tcPr>
     </w:tblStylePr>
   </w:style>
-  <w:style w:type="table" w:styleId="LightShading-Accent3">
+  <w:style w:type="table" w:styleId="Sombreadoclaro-nfasis3">
     <w:name w:val="Light Shading Accent 3"/>
-    <w:basedOn w:val="TableNormal"/>
+    <w:basedOn w:val="Tablanormal"/>
     <w:uiPriority w:val="60"/>
     <w:rsid w:val="00FC693F"/>
     <w:pPr>
@@ -3095,9 +3045,9 @@
       </w:tcPr>
     </w:tblStylePr>
   </w:style>
-  <w:style w:type="table" w:styleId="LightShading-Accent4">
+  <w:style w:type="table" w:styleId="Sombreadoclaro-nfasis4">
     <w:name w:val="Light Shading Accent 4"/>
-    <w:basedOn w:val="TableNormal"/>
+    <w:basedOn w:val="Tablanormal"/>
     <w:uiPriority w:val="60"/>
     <w:rsid w:val="00FC693F"/>
     <w:pPr>
@@ -3198,9 +3148,9 @@
       </w:tcPr>
     </w:tblStylePr>
   </w:style>
-  <w:style w:type="table" w:styleId="LightShading-Accent5">
+  <w:style w:type="table" w:styleId="Sombreadoclaro-nfasis5">
     <w:name w:val="Light Shading Accent 5"/>
-    <w:basedOn w:val="TableNormal"/>
+    <w:basedOn w:val="Tablanormal"/>
     <w:uiPriority w:val="60"/>
     <w:rsid w:val="00FC693F"/>
     <w:pPr>
@@ -3301,9 +3251,9 @@
       </w:tcPr>
     </w:tblStylePr>
   </w:style>
-  <w:style w:type="table" w:styleId="LightShading-Accent6">
+  <w:style w:type="table" w:styleId="Sombreadoclaro-nfasis6">
     <w:name w:val="Light Shading Accent 6"/>
-    <w:basedOn w:val="TableNormal"/>
+    <w:basedOn w:val="Tablanormal"/>
     <w:uiPriority w:val="60"/>
     <w:rsid w:val="00FC693F"/>
     <w:pPr>
@@ -3404,9 +3354,9 @@
       </w:tcPr>
     </w:tblStylePr>
   </w:style>
-  <w:style w:type="table" w:styleId="LightList">
+  <w:style w:type="table" w:styleId="Listaclara">
     <w:name w:val="Light List"/>
-    <w:basedOn w:val="TableNormal"/>
+    <w:basedOn w:val="Tablanormal"/>
     <w:uiPriority w:val="61"/>
     <w:rsid w:val="00FC693F"/>
     <w:pPr>
@@ -3496,9 +3446,9 @@
       </w:tcPr>
     </w:tblStylePr>
   </w:style>
-  <w:style w:type="table" w:styleId="LightList-Accent1">
+  <w:style w:type="table" w:styleId="Listaclara-nfasis1">
     <w:name w:val="Light List Accent 1"/>
-    <w:basedOn w:val="TableNormal"/>
+    <w:basedOn w:val="Tablanormal"/>
     <w:uiPriority w:val="61"/>
     <w:rsid w:val="00FC693F"/>
     <w:pPr>
@@ -3588,9 +3538,9 @@
       </w:tcPr>
     </w:tblStylePr>
   </w:style>
-  <w:style w:type="table" w:styleId="LightList-Accent2">
+  <w:style w:type="table" w:styleId="Listaclara-nfasis2">
     <w:name w:val="Light List Accent 2"/>
-    <w:basedOn w:val="TableNormal"/>
+    <w:basedOn w:val="Tablanormal"/>
     <w:uiPriority w:val="61"/>
     <w:rsid w:val="00CB0664"/>
     <w:pPr>
@@ -3680,9 +3630,9 @@
       </w:tcPr>
     </w:tblStylePr>
   </w:style>
-  <w:style w:type="table" w:styleId="LightList-Accent3">
+  <w:style w:type="table" w:styleId="Listaclara-nfasis3">
     <w:name w:val="Light List Accent 3"/>
-    <w:basedOn w:val="TableNormal"/>
+    <w:basedOn w:val="Tablanormal"/>
     <w:uiPriority w:val="61"/>
     <w:rsid w:val="00CB0664"/>
     <w:pPr>
@@ -3772,9 +3722,9 @@
       </w:tcPr>
     </w:tblStylePr>
   </w:style>
-  <w:style w:type="table" w:styleId="LightList-Accent4">
+  <w:style w:type="table" w:styleId="Listaclara-nfasis4">
     <w:name w:val="Light List Accent 4"/>
-    <w:basedOn w:val="TableNormal"/>
+    <w:basedOn w:val="Tablanormal"/>
     <w:uiPriority w:val="61"/>
     <w:rsid w:val="00CB0664"/>
     <w:pPr>
@@ -3864,9 +3814,9 @@
       </w:tcPr>
     </w:tblStylePr>
   </w:style>
-  <w:style w:type="table" w:styleId="LightList-Accent5">
+  <w:style w:type="table" w:styleId="Listaclara-nfasis5">
     <w:name w:val="Light List Accent 5"/>
-    <w:basedOn w:val="TableNormal"/>
+    <w:basedOn w:val="Tablanormal"/>
     <w:uiPriority w:val="61"/>
     <w:rsid w:val="00CB0664"/>
     <w:pPr>
@@ -3956,9 +3906,9 @@
       </w:tcPr>
     </w:tblStylePr>
   </w:style>
-  <w:style w:type="table" w:styleId="LightList-Accent6">
+  <w:style w:type="table" w:styleId="Listaclara-nfasis6">
     <w:name w:val="Light List Accent 6"/>
-    <w:basedOn w:val="TableNormal"/>
+    <w:basedOn w:val="Tablanormal"/>
     <w:uiPriority w:val="61"/>
     <w:rsid w:val="00CB0664"/>
     <w:pPr>
@@ -4048,9 +3998,9 @@
       </w:tcPr>
     </w:tblStylePr>
   </w:style>
-  <w:style w:type="table" w:styleId="LightGrid">
+  <w:style w:type="table" w:styleId="Cuadrculaclara">
     <w:name w:val="Light Grid"/>
-    <w:basedOn w:val="TableNormal"/>
+    <w:basedOn w:val="Tablanormal"/>
     <w:uiPriority w:val="62"/>
     <w:rsid w:val="00CB0664"/>
     <w:pPr>
@@ -4178,9 +4128,9 @@
       </w:tcPr>
     </w:tblStylePr>
   </w:style>
-  <w:style w:type="table" w:styleId="LightGrid-Accent1">
+  <w:style w:type="table" w:styleId="Cuadrculaclara-nfasis1">
     <w:name w:val="Light Grid Accent 1"/>
-    <w:basedOn w:val="TableNormal"/>
+    <w:basedOn w:val="Tablanormal"/>
     <w:uiPriority w:val="62"/>
     <w:rsid w:val="00CB0664"/>
     <w:pPr>
@@ -4308,9 +4258,9 @@
       </w:tcPr>
     </w:tblStylePr>
   </w:style>
-  <w:style w:type="table" w:styleId="LightGrid-Accent2">
+  <w:style w:type="table" w:styleId="Cuadrculaclara-nfasis2">
     <w:name w:val="Light Grid Accent 2"/>
-    <w:basedOn w:val="TableNormal"/>
+    <w:basedOn w:val="Tablanormal"/>
     <w:uiPriority w:val="62"/>
     <w:rsid w:val="00CB0664"/>
     <w:pPr>
@@ -4438,9 +4388,9 @@
       </w:tcPr>
     </w:tblStylePr>
   </w:style>
-  <w:style w:type="table" w:styleId="LightGrid-Accent3">
+  <w:style w:type="table" w:styleId="Cuadrculaclara-nfasis3">
     <w:name w:val="Light Grid Accent 3"/>
-    <w:basedOn w:val="TableNormal"/>
+    <w:basedOn w:val="Tablanormal"/>
     <w:uiPriority w:val="62"/>
     <w:rsid w:val="00CB0664"/>
     <w:pPr>
@@ -4568,9 +4518,9 @@
       </w:tcPr>
     </w:tblStylePr>
   </w:style>
-  <w:style w:type="table" w:styleId="LightGrid-Accent4">
+  <w:style w:type="table" w:styleId="Cuadrculaclara-nfasis4">
     <w:name w:val="Light Grid Accent 4"/>
-    <w:basedOn w:val="TableNormal"/>
+    <w:basedOn w:val="Tablanormal"/>
     <w:uiPriority w:val="62"/>
     <w:rsid w:val="00CB0664"/>
     <w:pPr>
@@ -4698,9 +4648,9 @@
       </w:tcPr>
     </w:tblStylePr>
   </w:style>
-  <w:style w:type="table" w:styleId="LightGrid-Accent5">
+  <w:style w:type="table" w:styleId="Cuadrculaclara-nfasis5">
     <w:name w:val="Light Grid Accent 5"/>
-    <w:basedOn w:val="TableNormal"/>
+    <w:basedOn w:val="Tablanormal"/>
     <w:uiPriority w:val="62"/>
     <w:rsid w:val="00CB0664"/>
     <w:pPr>
@@ -4828,9 +4778,9 @@
       </w:tcPr>
     </w:tblStylePr>
   </w:style>
-  <w:style w:type="table" w:styleId="LightGrid-Accent6">
+  <w:style w:type="table" w:styleId="Cuadrculaclara-nfasis6">
     <w:name w:val="Light Grid Accent 6"/>
-    <w:basedOn w:val="TableNormal"/>
+    <w:basedOn w:val="Tablanormal"/>
     <w:uiPriority w:val="62"/>
     <w:rsid w:val="00CB0664"/>
     <w:pPr>
@@ -4958,9 +4908,9 @@
       </w:tcPr>
     </w:tblStylePr>
   </w:style>
-  <w:style w:type="table" w:styleId="MediumShading1">
+  <w:style w:type="table" w:styleId="Sombreadomedio1">
     <w:name w:val="Medium Shading 1"/>
-    <w:basedOn w:val="TableNormal"/>
+    <w:basedOn w:val="Tablanormal"/>
     <w:uiPriority w:val="63"/>
     <w:rsid w:val="00CB0664"/>
     <w:pPr>
@@ -5064,9 +5014,9 @@
       </w:tcPr>
     </w:tblStylePr>
   </w:style>
-  <w:style w:type="table" w:styleId="MediumShading1-Accent1">
+  <w:style w:type="table" w:styleId="Sombreadomedio1-nfasis1">
     <w:name w:val="Medium Shading 1 Accent 1"/>
-    <w:basedOn w:val="TableNormal"/>
+    <w:basedOn w:val="Tablanormal"/>
     <w:uiPriority w:val="63"/>
     <w:rsid w:val="00CB0664"/>
     <w:pPr>
@@ -5170,9 +5120,9 @@
       </w:tcPr>
     </w:tblStylePr>
   </w:style>
-  <w:style w:type="table" w:styleId="MediumShading1-Accent2">
+  <w:style w:type="table" w:styleId="Sombreadomedio1-nfasis2">
     <w:name w:val="Medium Shading 1 Accent 2"/>
-    <w:basedOn w:val="TableNormal"/>
+    <w:basedOn w:val="Tablanormal"/>
     <w:uiPriority w:val="63"/>
     <w:rsid w:val="00CB0664"/>
     <w:pPr>
@@ -5276,9 +5226,9 @@
       </w:tcPr>
     </w:tblStylePr>
   </w:style>
-  <w:style w:type="table" w:styleId="MediumShading1-Accent3">
+  <w:style w:type="table" w:styleId="Sombreadomedio1-nfasis3">
     <w:name w:val="Medium Shading 1 Accent 3"/>
-    <w:basedOn w:val="TableNormal"/>
+    <w:basedOn w:val="Tablanormal"/>
     <w:uiPriority w:val="63"/>
     <w:rsid w:val="00CB0664"/>
     <w:pPr>
@@ -5382,9 +5332,9 @@
       </w:tcPr>
     </w:tblStylePr>
   </w:style>
-  <w:style w:type="table" w:styleId="MediumShading1-Accent4">
+  <w:style w:type="table" w:styleId="Sombreadomedio1-nfasis4">
     <w:name w:val="Medium Shading 1 Accent 4"/>
-    <w:basedOn w:val="TableNormal"/>
+    <w:basedOn w:val="Tablanormal"/>
     <w:uiPriority w:val="63"/>
     <w:rsid w:val="00CB0664"/>
     <w:pPr>
@@ -5488,9 +5438,9 @@
       </w:tcPr>
     </w:tblStylePr>
   </w:style>
-  <w:style w:type="table" w:styleId="MediumShading1-Accent5">
+  <w:style w:type="table" w:styleId="Sombreadomedio1-nfasis5">
     <w:name w:val="Medium Shading 1 Accent 5"/>
-    <w:basedOn w:val="TableNormal"/>
+    <w:basedOn w:val="Tablanormal"/>
     <w:uiPriority w:val="63"/>
     <w:rsid w:val="00CB0664"/>
     <w:pPr>
@@ -5594,9 +5544,9 @@
       </w:tcPr>
     </w:tblStylePr>
   </w:style>
-  <w:style w:type="table" w:styleId="MediumShading1-Accent6">
+  <w:style w:type="table" w:styleId="Sombreadomedio1-nfasis6">
     <w:name w:val="Medium Shading 1 Accent 6"/>
-    <w:basedOn w:val="TableNormal"/>
+    <w:basedOn w:val="Tablanormal"/>
     <w:uiPriority w:val="63"/>
     <w:rsid w:val="00CB0664"/>
     <w:pPr>
@@ -5700,9 +5650,9 @@
       </w:tcPr>
     </w:tblStylePr>
   </w:style>
-  <w:style w:type="table" w:styleId="MediumShading2">
+  <w:style w:type="table" w:styleId="Sombreadomedio2">
     <w:name w:val="Medium Shading 2"/>
-    <w:basedOn w:val="TableNormal"/>
+    <w:basedOn w:val="Tablanormal"/>
     <w:uiPriority w:val="64"/>
     <w:rsid w:val="00CB0664"/>
     <w:pPr>
@@ -5849,9 +5799,9 @@
       </w:tcPr>
     </w:tblStylePr>
   </w:style>
-  <w:style w:type="table" w:styleId="MediumShading2-Accent1">
+  <w:style w:type="table" w:styleId="Sombreadomedio2-nfasis1">
     <w:name w:val="Medium Shading 2 Accent 1"/>
-    <w:basedOn w:val="TableNormal"/>
+    <w:basedOn w:val="Tablanormal"/>
     <w:uiPriority w:val="64"/>
     <w:rsid w:val="00CB0664"/>
     <w:pPr>
@@ -5998,9 +5948,9 @@
       </w:tcPr>
     </w:tblStylePr>
   </w:style>
-  <w:style w:type="table" w:styleId="MediumShading2-Accent2">
+  <w:style w:type="table" w:styleId="Sombreadomedio2-nfasis2">
     <w:name w:val="Medium Shading 2 Accent 2"/>
-    <w:basedOn w:val="TableNormal"/>
+    <w:basedOn w:val="Tablanormal"/>
     <w:uiPriority w:val="64"/>
     <w:rsid w:val="00CB0664"/>
     <w:pPr>
@@ -6147,9 +6097,9 @@
       </w:tcPr>
     </w:tblStylePr>
   </w:style>
-  <w:style w:type="table" w:styleId="MediumShading2-Accent3">
+  <w:style w:type="table" w:styleId="Sombreadomedio2-nfasis3">
     <w:name w:val="Medium Shading 2 Accent 3"/>
-    <w:basedOn w:val="TableNormal"/>
+    <w:basedOn w:val="Tablanormal"/>
     <w:uiPriority w:val="64"/>
     <w:rsid w:val="00CB0664"/>
     <w:pPr>
@@ -6296,9 +6246,9 @@
       </w:tcPr>
     </w:tblStylePr>
   </w:style>
-  <w:style w:type="table" w:styleId="MediumShading2-Accent4">
+  <w:style w:type="table" w:styleId="Sombreadomedio2-nfasis4">
     <w:name w:val="Medium Shading 2 Accent 4"/>
-    <w:basedOn w:val="TableNormal"/>
+    <w:basedOn w:val="Tablanormal"/>
     <w:uiPriority w:val="64"/>
     <w:rsid w:val="00CB0664"/>
     <w:pPr>
@@ -6445,9 +6395,9 @@
       </w:tcPr>
     </w:tblStylePr>
   </w:style>
-  <w:style w:type="table" w:styleId="MediumShading2-Accent5">
+  <w:style w:type="table" w:styleId="Sombreadomedio2-nfasis5">
     <w:name w:val="Medium Shading 2 Accent 5"/>
-    <w:basedOn w:val="TableNormal"/>
+    <w:basedOn w:val="Tablanormal"/>
     <w:uiPriority w:val="64"/>
     <w:rsid w:val="00CB0664"/>
     <w:pPr>
@@ -6594,9 +6544,9 @@
       </w:tcPr>
     </w:tblStylePr>
   </w:style>
-  <w:style w:type="table" w:styleId="MediumShading2-Accent6">
+  <w:style w:type="table" w:styleId="Sombreadomedio2-nfasis6">
     <w:name w:val="Medium Shading 2 Accent 6"/>
-    <w:basedOn w:val="TableNormal"/>
+    <w:basedOn w:val="Tablanormal"/>
     <w:uiPriority w:val="64"/>
     <w:rsid w:val="00CB0664"/>
     <w:pPr>
@@ -6743,9 +6693,9 @@
       </w:tcPr>
     </w:tblStylePr>
   </w:style>
-  <w:style w:type="table" w:styleId="MediumList1">
+  <w:style w:type="table" w:styleId="Listamedia1">
     <w:name w:val="Medium List 1"/>
-    <w:basedOn w:val="TableNormal"/>
+    <w:basedOn w:val="Tablanormal"/>
     <w:uiPriority w:val="65"/>
     <w:rsid w:val="00CB0664"/>
     <w:pPr>
@@ -6827,9 +6777,9 @@
       </w:tcPr>
     </w:tblStylePr>
   </w:style>
-  <w:style w:type="table" w:styleId="MediumList1-Accent1">
+  <w:style w:type="table" w:styleId="Listamedia1-nfasis1">
     <w:name w:val="Medium List 1 Accent 1"/>
-    <w:basedOn w:val="TableNormal"/>
+    <w:basedOn w:val="Tablanormal"/>
     <w:uiPriority w:val="65"/>
     <w:rsid w:val="00CB0664"/>
     <w:pPr>
@@ -6911,9 +6861,9 @@
       </w:tcPr>
     </w:tblStylePr>
   </w:style>
-  <w:style w:type="table" w:styleId="MediumList1-Accent2">
+  <w:style w:type="table" w:styleId="Listamedia1-nfasis2">
     <w:name w:val="Medium List 1 Accent 2"/>
-    <w:basedOn w:val="TableNormal"/>
+    <w:basedOn w:val="Tablanormal"/>
     <w:uiPriority w:val="65"/>
     <w:rsid w:val="00CB0664"/>
     <w:pPr>
@@ -6995,9 +6945,9 @@
       </w:tcPr>
     </w:tblStylePr>
   </w:style>
-  <w:style w:type="table" w:styleId="MediumList1-Accent3">
+  <w:style w:type="table" w:styleId="Listamedia1-nfasis3">
     <w:name w:val="Medium List 1 Accent 3"/>
-    <w:basedOn w:val="TableNormal"/>
+    <w:basedOn w:val="Tablanormal"/>
     <w:uiPriority w:val="65"/>
     <w:rsid w:val="00CB0664"/>
     <w:pPr>
@@ -7079,9 +7029,9 @@
       </w:tcPr>
     </w:tblStylePr>
   </w:style>
-  <w:style w:type="table" w:styleId="MediumList1-Accent4">
+  <w:style w:type="table" w:styleId="Listamedia1-nfasis4">
     <w:name w:val="Medium List 1 Accent 4"/>
-    <w:basedOn w:val="TableNormal"/>
+    <w:basedOn w:val="Tablanormal"/>
     <w:uiPriority w:val="65"/>
     <w:rsid w:val="00CB0664"/>
     <w:pPr>
@@ -7163,9 +7113,9 @@
       </w:tcPr>
     </w:tblStylePr>
   </w:style>
-  <w:style w:type="table" w:styleId="MediumList1-Accent5">
+  <w:style w:type="table" w:styleId="Listamedia1-nfasis5">
     <w:name w:val="Medium List 1 Accent 5"/>
-    <w:basedOn w:val="TableNormal"/>
+    <w:basedOn w:val="Tablanormal"/>
     <w:uiPriority w:val="65"/>
     <w:rsid w:val="00CB0664"/>
     <w:pPr>
@@ -7247,9 +7197,9 @@
       </w:tcPr>
     </w:tblStylePr>
   </w:style>
-  <w:style w:type="table" w:styleId="MediumList1-Accent6">
+  <w:style w:type="table" w:styleId="Listamedia1-nfasis6">
     <w:name w:val="Medium List 1 Accent 6"/>
-    <w:basedOn w:val="TableNormal"/>
+    <w:basedOn w:val="Tablanormal"/>
     <w:uiPriority w:val="65"/>
     <w:rsid w:val="00CB0664"/>
     <w:pPr>
@@ -7331,9 +7281,9 @@
       </w:tcPr>
     </w:tblStylePr>
   </w:style>
-  <w:style w:type="table" w:styleId="MediumList2">
+  <w:style w:type="table" w:styleId="Listamedia2">
     <w:name w:val="Medium List 2"/>
-    <w:basedOn w:val="TableNormal"/>
+    <w:basedOn w:val="Tablanormal"/>
     <w:uiPriority w:val="66"/>
     <w:rsid w:val="00CB0664"/>
     <w:pPr>
@@ -7459,9 +7409,9 @@
       </w:tcPr>
     </w:tblStylePr>
   </w:style>
-  <w:style w:type="table" w:styleId="MediumList2-Accent1">
+  <w:style w:type="table" w:styleId="Listamedia2-nfasis1">
     <w:name w:val="Medium List 2 Accent 1"/>
-    <w:basedOn w:val="TableNormal"/>
+    <w:basedOn w:val="Tablanormal"/>
     <w:uiPriority w:val="66"/>
     <w:rsid w:val="00CB0664"/>
     <w:pPr>
@@ -7587,9 +7537,9 @@
       </w:tcPr>
     </w:tblStylePr>
   </w:style>
-  <w:style w:type="table" w:styleId="MediumList2-Accent2">
+  <w:style w:type="table" w:styleId="Listamedia2-nfasis2">
     <w:name w:val="Medium List 2 Accent 2"/>
-    <w:basedOn w:val="TableNormal"/>
+    <w:basedOn w:val="Tablanormal"/>
     <w:uiPriority w:val="66"/>
     <w:rsid w:val="00CB0664"/>
     <w:pPr>
@@ -7715,9 +7665,9 @@
       </w:tcPr>
     </w:tblStylePr>
   </w:style>
-  <w:style w:type="table" w:styleId="MediumList2-Accent3">
+  <w:style w:type="table" w:styleId="Listamedia2-nfasis3">
     <w:name w:val="Medium List 2 Accent 3"/>
-    <w:basedOn w:val="TableNormal"/>
+    <w:basedOn w:val="Tablanormal"/>
     <w:uiPriority w:val="66"/>
     <w:rsid w:val="00CB0664"/>
     <w:pPr>
@@ -7843,9 +7793,9 @@
       </w:tcPr>
     </w:tblStylePr>
   </w:style>
-  <w:style w:type="table" w:styleId="MediumList2-Accent4">
+  <w:style w:type="table" w:styleId="Listamedia2-nfasis4">
     <w:name w:val="Medium List 2 Accent 4"/>
-    <w:basedOn w:val="TableNormal"/>
+    <w:basedOn w:val="Tablanormal"/>
     <w:uiPriority w:val="66"/>
     <w:rsid w:val="00CB0664"/>
     <w:pPr>
@@ -7971,9 +7921,9 @@
       </w:tcPr>
     </w:tblStylePr>
   </w:style>
-  <w:style w:type="table" w:styleId="MediumList2-Accent5">
+  <w:style w:type="table" w:styleId="Listamedia2-nfasis5">
     <w:name w:val="Medium List 2 Accent 5"/>
-    <w:basedOn w:val="TableNormal"/>
+    <w:basedOn w:val="Tablanormal"/>
     <w:uiPriority w:val="66"/>
     <w:rsid w:val="00CB0664"/>
     <w:pPr>
@@ -8099,9 +8049,9 @@
       </w:tcPr>
     </w:tblStylePr>
   </w:style>
-  <w:style w:type="table" w:styleId="MediumList2-Accent6">
+  <w:style w:type="table" w:styleId="Listamedia2-nfasis6">
     <w:name w:val="Medium List 2 Accent 6"/>
-    <w:basedOn w:val="TableNormal"/>
+    <w:basedOn w:val="Tablanormal"/>
     <w:uiPriority w:val="66"/>
     <w:rsid w:val="00CB0664"/>
     <w:pPr>
@@ -8227,9 +8177,9 @@
       </w:tcPr>
     </w:tblStylePr>
   </w:style>
-  <w:style w:type="table" w:styleId="MediumGrid1">
+  <w:style w:type="table" w:styleId="Cuadrculamedia1">
     <w:name w:val="Medium Grid 1"/>
-    <w:basedOn w:val="TableNormal"/>
+    <w:basedOn w:val="Tablanormal"/>
     <w:uiPriority w:val="67"/>
     <w:rsid w:val="00CB0664"/>
     <w:pPr>
@@ -8300,9 +8250,9 @@
       </w:tcPr>
     </w:tblStylePr>
   </w:style>
-  <w:style w:type="table" w:styleId="MediumGrid1-Accent1">
+  <w:style w:type="table" w:styleId="Cuadrculamedia1-nfasis1">
     <w:name w:val="Medium Grid 1 Accent 1"/>
-    <w:basedOn w:val="TableNormal"/>
+    <w:basedOn w:val="Tablanormal"/>
     <w:uiPriority w:val="67"/>
     <w:rsid w:val="00CB0664"/>
     <w:pPr>
@@ -8373,9 +8323,9 @@
       </w:tcPr>
     </w:tblStylePr>
   </w:style>
-  <w:style w:type="table" w:styleId="MediumGrid1-Accent2">
+  <w:style w:type="table" w:styleId="Cuadrculamedia1-nfasis2">
     <w:name w:val="Medium Grid 1 Accent 2"/>
-    <w:basedOn w:val="TableNormal"/>
+    <w:basedOn w:val="Tablanormal"/>
     <w:uiPriority w:val="67"/>
     <w:rsid w:val="00CB0664"/>
     <w:pPr>
@@ -8446,9 +8396,9 @@
       </w:tcPr>
     </w:tblStylePr>
   </w:style>
-  <w:style w:type="table" w:styleId="MediumGrid1-Accent3">
+  <w:style w:type="table" w:styleId="Cuadrculamedia1-nfasis3">
     <w:name w:val="Medium Grid 1 Accent 3"/>
-    <w:basedOn w:val="TableNormal"/>
+    <w:basedOn w:val="Tablanormal"/>
     <w:uiPriority w:val="67"/>
     <w:rsid w:val="00CB0664"/>
     <w:pPr>
@@ -8519,9 +8469,9 @@
       </w:tcPr>
     </w:tblStylePr>
   </w:style>
-  <w:style w:type="table" w:styleId="MediumGrid1-Accent4">
+  <w:style w:type="table" w:styleId="Cuadrculamedia1-nfasis4">
     <w:name w:val="Medium Grid 1 Accent 4"/>
-    <w:basedOn w:val="TableNormal"/>
+    <w:basedOn w:val="Tablanormal"/>
     <w:uiPriority w:val="67"/>
     <w:rsid w:val="00CB0664"/>
     <w:pPr>
@@ -8592,9 +8542,9 @@
       </w:tcPr>
     </w:tblStylePr>
   </w:style>
-  <w:style w:type="table" w:styleId="MediumGrid1-Accent5">
+  <w:style w:type="table" w:styleId="Cuadrculamedia1-nfasis5">
     <w:name w:val="Medium Grid 1 Accent 5"/>
-    <w:basedOn w:val="TableNormal"/>
+    <w:basedOn w:val="Tablanormal"/>
     <w:uiPriority w:val="67"/>
     <w:rsid w:val="00CB0664"/>
     <w:pPr>
@@ -8665,9 +8615,9 @@
       </w:tcPr>
     </w:tblStylePr>
   </w:style>
-  <w:style w:type="table" w:styleId="MediumGrid1-Accent6">
+  <w:style w:type="table" w:styleId="Cuadrculamedia1-nfasis6">
     <w:name w:val="Medium Grid 1 Accent 6"/>
-    <w:basedOn w:val="TableNormal"/>
+    <w:basedOn w:val="Tablanormal"/>
     <w:uiPriority w:val="67"/>
     <w:rsid w:val="00CB0664"/>
     <w:pPr>
@@ -8738,9 +8688,9 @@
       </w:tcPr>
     </w:tblStylePr>
   </w:style>
-  <w:style w:type="table" w:styleId="MediumGrid2">
+  <w:style w:type="table" w:styleId="Cuadrculamedia2">
     <w:name w:val="Medium Grid 2"/>
-    <w:basedOn w:val="TableNormal"/>
+    <w:basedOn w:val="Tablanormal"/>
     <w:uiPriority w:val="68"/>
     <w:rsid w:val="00CB0664"/>
     <w:pPr>
@@ -8863,9 +8813,9 @@
       </w:tcPr>
     </w:tblStylePr>
   </w:style>
-  <w:style w:type="table" w:styleId="MediumGrid2-Accent1">
+  <w:style w:type="table" w:styleId="Cuadrculamedia2-nfasis1">
     <w:name w:val="Medium Grid 2 Accent 1"/>
-    <w:basedOn w:val="TableNormal"/>
+    <w:basedOn w:val="Tablanormal"/>
     <w:uiPriority w:val="68"/>
     <w:rsid w:val="00CB0664"/>
     <w:pPr>
@@ -8988,9 +8938,9 @@
       </w:tcPr>
     </w:tblStylePr>
   </w:style>
-  <w:style w:type="table" w:styleId="MediumGrid2-Accent2">
+  <w:style w:type="table" w:styleId="Cuadrculamedia2-nfasis2">
     <w:name w:val="Medium Grid 2 Accent 2"/>
-    <w:basedOn w:val="TableNormal"/>
+    <w:basedOn w:val="Tablanormal"/>
     <w:uiPriority w:val="68"/>
     <w:rsid w:val="00CB0664"/>
     <w:pPr>
@@ -9113,9 +9063,9 @@
       </w:tcPr>
     </w:tblStylePr>
   </w:style>
-  <w:style w:type="table" w:styleId="MediumGrid2-Accent3">
+  <w:style w:type="table" w:styleId="Cuadrculamedia2-nfasis3">
     <w:name w:val="Medium Grid 2 Accent 3"/>
-    <w:basedOn w:val="TableNormal"/>
+    <w:basedOn w:val="Tablanormal"/>
     <w:uiPriority w:val="68"/>
     <w:rsid w:val="00CB0664"/>
     <w:pPr>
@@ -9238,9 +9188,9 @@
       </w:tcPr>
     </w:tblStylePr>
   </w:style>
-  <w:style w:type="table" w:styleId="MediumGrid2-Accent4">
+  <w:style w:type="table" w:styleId="Cuadrculamedia2-nfasis4">
     <w:name w:val="Medium Grid 2 Accent 4"/>
-    <w:basedOn w:val="TableNormal"/>
+    <w:basedOn w:val="Tablanormal"/>
     <w:uiPriority w:val="68"/>
     <w:rsid w:val="00CB0664"/>
     <w:pPr>
@@ -9363,9 +9313,9 @@
       </w:tcPr>
     </w:tblStylePr>
   </w:style>
-  <w:style w:type="table" w:styleId="MediumGrid2-Accent5">
+  <w:style w:type="table" w:styleId="Cuadrculamedia2-nfasis5">
     <w:name w:val="Medium Grid 2 Accent 5"/>
-    <w:basedOn w:val="TableNormal"/>
+    <w:basedOn w:val="Tablanormal"/>
     <w:uiPriority w:val="68"/>
     <w:rsid w:val="00CB0664"/>
     <w:pPr>
@@ -9488,9 +9438,9 @@
       </w:tcPr>
     </w:tblStylePr>
   </w:style>
-  <w:style w:type="table" w:styleId="MediumGrid2-Accent6">
+  <w:style w:type="table" w:styleId="Cuadrculamedia2-nfasis6">
     <w:name w:val="Medium Grid 2 Accent 6"/>
-    <w:basedOn w:val="TableNormal"/>
+    <w:basedOn w:val="Tablanormal"/>
     <w:uiPriority w:val="68"/>
     <w:rsid w:val="00CB0664"/>
     <w:pPr>
@@ -9613,9 +9563,9 @@
       </w:tcPr>
     </w:tblStylePr>
   </w:style>
-  <w:style w:type="table" w:styleId="MediumGrid3">
+  <w:style w:type="table" w:styleId="Cuadrculamedia3">
     <w:name w:val="Medium Grid 3"/>
-    <w:basedOn w:val="TableNormal"/>
+    <w:basedOn w:val="Tablanormal"/>
     <w:uiPriority w:val="69"/>
     <w:rsid w:val="00CB0664"/>
     <w:pPr>
@@ -9754,9 +9704,9 @@
       </w:tcPr>
     </w:tblStylePr>
   </w:style>
-  <w:style w:type="table" w:styleId="MediumGrid3-Accent1">
+  <w:style w:type="table" w:styleId="Cuadrculamedia3-nfasis1">
     <w:name w:val="Medium Grid 3 Accent 1"/>
-    <w:basedOn w:val="TableNormal"/>
+    <w:basedOn w:val="Tablanormal"/>
     <w:uiPriority w:val="69"/>
     <w:rsid w:val="00CB0664"/>
     <w:pPr>
@@ -9895,9 +9845,9 @@
       </w:tcPr>
     </w:tblStylePr>
   </w:style>
-  <w:style w:type="table" w:styleId="MediumGrid3-Accent2">
+  <w:style w:type="table" w:styleId="Cuadrculamedia3-nfasis2">
     <w:name w:val="Medium Grid 3 Accent 2"/>
-    <w:basedOn w:val="TableNormal"/>
+    <w:basedOn w:val="Tablanormal"/>
     <w:uiPriority w:val="69"/>
     <w:rsid w:val="00CB0664"/>
     <w:pPr>
@@ -10036,9 +9986,9 @@
       </w:tcPr>
     </w:tblStylePr>
   </w:style>
-  <w:style w:type="table" w:styleId="MediumGrid3-Accent3">
+  <w:style w:type="table" w:styleId="Cuadrculamedia3-nfasis3">
     <w:name w:val="Medium Grid 3 Accent 3"/>
-    <w:basedOn w:val="TableNormal"/>
+    <w:basedOn w:val="Tablanormal"/>
     <w:uiPriority w:val="69"/>
     <w:rsid w:val="00CB0664"/>
     <w:pPr>
@@ -10177,9 +10127,9 @@
       </w:tcPr>
     </w:tblStylePr>
   </w:style>
-  <w:style w:type="table" w:styleId="MediumGrid3-Accent4">
+  <w:style w:type="table" w:styleId="Cuadrculamedia3-nfasis4">
     <w:name w:val="Medium Grid 3 Accent 4"/>
-    <w:basedOn w:val="TableNormal"/>
+    <w:basedOn w:val="Tablanormal"/>
     <w:uiPriority w:val="69"/>
     <w:rsid w:val="00CB0664"/>
     <w:pPr>
@@ -10318,9 +10268,9 @@
       </w:tcPr>
     </w:tblStylePr>
   </w:style>
-  <w:style w:type="table" w:styleId="MediumGrid3-Accent5">
+  <w:style w:type="table" w:styleId="Cuadrculamedia3-nfasis5">
     <w:name w:val="Medium Grid 3 Accent 5"/>
-    <w:basedOn w:val="TableNormal"/>
+    <w:basedOn w:val="Tablanormal"/>
     <w:uiPriority w:val="69"/>
     <w:rsid w:val="00CB0664"/>
     <w:pPr>
@@ -10459,9 +10409,9 @@
       </w:tcPr>
     </w:tblStylePr>
   </w:style>
-  <w:style w:type="table" w:styleId="MediumGrid3-Accent6">
+  <w:style w:type="table" w:styleId="Cuadrculamedia3-nfasis6">
     <w:name w:val="Medium Grid 3 Accent 6"/>
-    <w:basedOn w:val="TableNormal"/>
+    <w:basedOn w:val="Tablanormal"/>
     <w:uiPriority w:val="69"/>
     <w:rsid w:val="00CB0664"/>
     <w:pPr>
@@ -10600,9 +10550,9 @@
       </w:tcPr>
     </w:tblStylePr>
   </w:style>
-  <w:style w:type="table" w:styleId="DarkList">
+  <w:style w:type="table" w:styleId="Listaoscura">
     <w:name w:val="Dark List"/>
-    <w:basedOn w:val="TableNormal"/>
+    <w:basedOn w:val="Tablanormal"/>
     <w:uiPriority w:val="70"/>
     <w:rsid w:val="00CB0664"/>
     <w:pPr>
@@ -10714,9 +10664,9 @@
       </w:tcPr>
     </w:tblStylePr>
   </w:style>
-  <w:style w:type="table" w:styleId="DarkList-Accent1">
+  <w:style w:type="table" w:styleId="Listaoscura-nfasis1">
     <w:name w:val="Dark List Accent 1"/>
-    <w:basedOn w:val="TableNormal"/>
+    <w:basedOn w:val="Tablanormal"/>
     <w:uiPriority w:val="70"/>
     <w:rsid w:val="00CB0664"/>
     <w:pPr>
@@ -10828,9 +10778,9 @@
       </w:tcPr>
     </w:tblStylePr>
   </w:style>
-  <w:style w:type="table" w:styleId="DarkList-Accent2">
+  <w:style w:type="table" w:styleId="Listaoscura-nfasis2">
     <w:name w:val="Dark List Accent 2"/>
-    <w:basedOn w:val="TableNormal"/>
+    <w:basedOn w:val="Tablanormal"/>
     <w:uiPriority w:val="70"/>
     <w:rsid w:val="00CB0664"/>
     <w:pPr>
@@ -10942,9 +10892,9 @@
       </w:tcPr>
     </w:tblStylePr>
   </w:style>
-  <w:style w:type="table" w:styleId="DarkList-Accent3">
+  <w:style w:type="table" w:styleId="Listaoscura-nfasis3">
     <w:name w:val="Dark List Accent 3"/>
-    <w:basedOn w:val="TableNormal"/>
+    <w:basedOn w:val="Tablanormal"/>
     <w:uiPriority w:val="70"/>
     <w:rsid w:val="00CB0664"/>
     <w:pPr>
@@ -11056,9 +11006,9 @@
       </w:tcPr>
     </w:tblStylePr>
   </w:style>
-  <w:style w:type="table" w:styleId="DarkList-Accent4">
+  <w:style w:type="table" w:styleId="Listaoscura-nfasis4">
     <w:name w:val="Dark List Accent 4"/>
-    <w:basedOn w:val="TableNormal"/>
+    <w:basedOn w:val="Tablanormal"/>
     <w:uiPriority w:val="70"/>
     <w:rsid w:val="00CB0664"/>
     <w:pPr>
@@ -11170,9 +11120,9 @@
       </w:tcPr>
     </w:tblStylePr>
   </w:style>
-  <w:style w:type="table" w:styleId="DarkList-Accent5">
+  <w:style w:type="table" w:styleId="Listaoscura-nfasis5">
     <w:name w:val="Dark List Accent 5"/>
-    <w:basedOn w:val="TableNormal"/>
+    <w:basedOn w:val="Tablanormal"/>
     <w:uiPriority w:val="70"/>
     <w:rsid w:val="00CB0664"/>
     <w:pPr>
@@ -11284,9 +11234,9 @@
       </w:tcPr>
     </w:tblStylePr>
   </w:style>
-  <w:style w:type="table" w:styleId="DarkList-Accent6">
+  <w:style w:type="table" w:styleId="Listaoscura-nfasis6">
     <w:name w:val="Dark List Accent 6"/>
-    <w:basedOn w:val="TableNormal"/>
+    <w:basedOn w:val="Tablanormal"/>
     <w:uiPriority w:val="70"/>
     <w:rsid w:val="00CB0664"/>
     <w:pPr>
@@ -11398,9 +11348,9 @@
       </w:tcPr>
     </w:tblStylePr>
   </w:style>
-  <w:style w:type="table" w:styleId="ColorfulShading">
+  <w:style w:type="table" w:styleId="Sombreadovistoso">
     <w:name w:val="Colorful Shading"/>
-    <w:basedOn w:val="TableNormal"/>
+    <w:basedOn w:val="Tablanormal"/>
     <w:uiPriority w:val="71"/>
     <w:rsid w:val="00CB0664"/>
     <w:pPr>
@@ -11520,9 +11470,9 @@
       </w:rPr>
     </w:tblStylePr>
   </w:style>
-  <w:style w:type="table" w:styleId="ColorfulShading-Accent1">
+  <w:style w:type="table" w:styleId="Sombreadovistoso-nfasis1">
     <w:name w:val="Colorful Shading Accent 1"/>
-    <w:basedOn w:val="TableNormal"/>
+    <w:basedOn w:val="Tablanormal"/>
     <w:uiPriority w:val="71"/>
     <w:rsid w:val="00CB0664"/>
     <w:pPr>
@@ -11642,9 +11592,9 @@
       </w:rPr>
     </w:tblStylePr>
   </w:style>
-  <w:style w:type="table" w:styleId="ColorfulShading-Accent2">
+  <w:style w:type="table" w:styleId="Sombreadovistoso-nfasis2">
     <w:name w:val="Colorful Shading Accent 2"/>
-    <w:basedOn w:val="TableNormal"/>
+    <w:basedOn w:val="Tablanormal"/>
     <w:uiPriority w:val="71"/>
     <w:rsid w:val="00CB0664"/>
     <w:pPr>
@@ -11764,9 +11714,9 @@
       </w:rPr>
     </w:tblStylePr>
   </w:style>
-  <w:style w:type="table" w:styleId="ColorfulShading-Accent3">
+  <w:style w:type="table" w:styleId="Sombreadovistoso-nfasis3">
     <w:name w:val="Colorful Shading Accent 3"/>
-    <w:basedOn w:val="TableNormal"/>
+    <w:basedOn w:val="Tablanormal"/>
     <w:uiPriority w:val="71"/>
     <w:rsid w:val="00CB0664"/>
     <w:pPr>
@@ -11876,9 +11826,9 @@
       </w:tcPr>
     </w:tblStylePr>
   </w:style>
-  <w:style w:type="table" w:styleId="ColorfulShading-Accent4">
+  <w:style w:type="table" w:styleId="Sombreadovistoso-nfasis4">
     <w:name w:val="Colorful Shading Accent 4"/>
-    <w:basedOn w:val="TableNormal"/>
+    <w:basedOn w:val="Tablanormal"/>
     <w:uiPriority w:val="71"/>
     <w:rsid w:val="00CB0664"/>
     <w:pPr>
@@ -11998,9 +11948,9 @@
       </w:rPr>
     </w:tblStylePr>
   </w:style>
-  <w:style w:type="table" w:styleId="ColorfulShading-Accent5">
+  <w:style w:type="table" w:styleId="Sombreadovistoso-nfasis5">
     <w:name w:val="Colorful Shading Accent 5"/>
-    <w:basedOn w:val="TableNormal"/>
+    <w:basedOn w:val="Tablanormal"/>
     <w:uiPriority w:val="71"/>
     <w:rsid w:val="00CB0664"/>
     <w:pPr>
@@ -12120,9 +12070,9 @@
       </w:rPr>
     </w:tblStylePr>
   </w:style>
-  <w:style w:type="table" w:styleId="ColorfulShading-Accent6">
+  <w:style w:type="table" w:styleId="Sombreadovistoso-nfasis6">
     <w:name w:val="Colorful Shading Accent 6"/>
-    <w:basedOn w:val="TableNormal"/>
+    <w:basedOn w:val="Tablanormal"/>
     <w:uiPriority w:val="71"/>
     <w:rsid w:val="00CB0664"/>
     <w:pPr>
@@ -12242,9 +12192,9 @@
       </w:rPr>
     </w:tblStylePr>
   </w:style>
-  <w:style w:type="table" w:styleId="ColorfulList">
+  <w:style w:type="table" w:styleId="Listavistosa">
     <w:name w:val="Colorful List"/>
-    <w:basedOn w:val="TableNormal"/>
+    <w:basedOn w:val="Tablanormal"/>
     <w:uiPriority w:val="72"/>
     <w:rsid w:val="00CB0664"/>
     <w:pPr>
@@ -12328,9 +12278,9 @@
       </w:tcPr>
     </w:tblStylePr>
   </w:style>
-  <w:style w:type="table" w:styleId="ColorfulList-Accent1">
+  <w:style w:type="table" w:styleId="Listavistosa-nfasis1">
     <w:name w:val="Colorful List Accent 1"/>
-    <w:basedOn w:val="TableNormal"/>
+    <w:basedOn w:val="Tablanormal"/>
     <w:uiPriority w:val="72"/>
     <w:rsid w:val="00CB0664"/>
     <w:pPr>
@@ -12414,9 +12364,9 @@
       </w:tcPr>
     </w:tblStylePr>
   </w:style>
-  <w:style w:type="table" w:styleId="ColorfulList-Accent2">
+  <w:style w:type="table" w:styleId="Listavistosa-nfasis2">
     <w:name w:val="Colorful List Accent 2"/>
-    <w:basedOn w:val="TableNormal"/>
+    <w:basedOn w:val="Tablanormal"/>
     <w:uiPriority w:val="72"/>
     <w:rsid w:val="00CB0664"/>
     <w:pPr>
@@ -12500,9 +12450,9 @@
       </w:tcPr>
     </w:tblStylePr>
   </w:style>
-  <w:style w:type="table" w:styleId="ColorfulList-Accent3">
+  <w:style w:type="table" w:styleId="Listavistosa-nfasis3">
     <w:name w:val="Colorful List Accent 3"/>
-    <w:basedOn w:val="TableNormal"/>
+    <w:basedOn w:val="Tablanormal"/>
     <w:uiPriority w:val="72"/>
     <w:rsid w:val="00CB0664"/>
     <w:pPr>
@@ -12586,9 +12536,9 @@
       </w:tcPr>
     </w:tblStylePr>
   </w:style>
-  <w:style w:type="table" w:styleId="ColorfulList-Accent4">
+  <w:style w:type="table" w:styleId="Listavistosa-nfasis4">
     <w:name w:val="Colorful List Accent 4"/>
-    <w:basedOn w:val="TableNormal"/>
+    <w:basedOn w:val="Tablanormal"/>
     <w:uiPriority w:val="72"/>
     <w:rsid w:val="00CB0664"/>
     <w:pPr>
@@ -12672,9 +12622,9 @@
       </w:tcPr>
     </w:tblStylePr>
   </w:style>
-  <w:style w:type="table" w:styleId="ColorfulList-Accent5">
+  <w:style w:type="table" w:styleId="Listavistosa-nfasis5">
     <w:name w:val="Colorful List Accent 5"/>
-    <w:basedOn w:val="TableNormal"/>
+    <w:basedOn w:val="Tablanormal"/>
     <w:uiPriority w:val="72"/>
     <w:rsid w:val="00CB0664"/>
     <w:pPr>
@@ -12758,9 +12708,9 @@
       </w:tcPr>
     </w:tblStylePr>
   </w:style>
-  <w:style w:type="table" w:styleId="ColorfulList-Accent6">
+  <w:style w:type="table" w:styleId="Listavistosa-nfasis6">
     <w:name w:val="Colorful List Accent 6"/>
-    <w:basedOn w:val="TableNormal"/>
+    <w:basedOn w:val="Tablanormal"/>
     <w:uiPriority w:val="72"/>
     <w:rsid w:val="00CB0664"/>
     <w:pPr>
@@ -12844,9 +12794,9 @@
       </w:tcPr>
     </w:tblStylePr>
   </w:style>
-  <w:style w:type="table" w:styleId="ColorfulGrid">
+  <w:style w:type="table" w:styleId="Cuadrculavistosa">
     <w:name w:val="Colorful Grid"/>
-    <w:basedOn w:val="TableNormal"/>
+    <w:basedOn w:val="Tablanormal"/>
     <w:uiPriority w:val="73"/>
     <w:rsid w:val="00CB0664"/>
     <w:pPr>
@@ -12924,9 +12874,9 @@
       </w:tcPr>
     </w:tblStylePr>
   </w:style>
-  <w:style w:type="table" w:styleId="ColorfulGrid-Accent1">
+  <w:style w:type="table" w:styleId="Cuadrculavistosa-nfasis1">
     <w:name w:val="Colorful Grid Accent 1"/>
-    <w:basedOn w:val="TableNormal"/>
+    <w:basedOn w:val="Tablanormal"/>
     <w:uiPriority w:val="73"/>
     <w:rsid w:val="00CB0664"/>
     <w:pPr>
@@ -13004,9 +12954,9 @@
       </w:tcPr>
     </w:tblStylePr>
   </w:style>
-  <w:style w:type="table" w:styleId="ColorfulGrid-Accent2">
+  <w:style w:type="table" w:styleId="Cuadrculavistosa-nfasis2">
     <w:name w:val="Colorful Grid Accent 2"/>
-    <w:basedOn w:val="TableNormal"/>
+    <w:basedOn w:val="Tablanormal"/>
     <w:uiPriority w:val="73"/>
     <w:rsid w:val="00CB0664"/>
     <w:pPr>
@@ -13084,9 +13034,9 @@
       </w:tcPr>
     </w:tblStylePr>
   </w:style>
-  <w:style w:type="table" w:styleId="ColorfulGrid-Accent3">
+  <w:style w:type="table" w:styleId="Cuadrculavistosa-nfasis3">
     <w:name w:val="Colorful Grid Accent 3"/>
-    <w:basedOn w:val="TableNormal"/>
+    <w:basedOn w:val="Tablanormal"/>
     <w:uiPriority w:val="73"/>
     <w:rsid w:val="00CB0664"/>
     <w:pPr>
@@ -13164,9 +13114,9 @@
       </w:tcPr>
     </w:tblStylePr>
   </w:style>
-  <w:style w:type="table" w:styleId="ColorfulGrid-Accent4">
+  <w:style w:type="table" w:styleId="Cuadrculavistosa-nfasis4">
     <w:name w:val="Colorful Grid Accent 4"/>
-    <w:basedOn w:val="TableNormal"/>
+    <w:basedOn w:val="Tablanormal"/>
     <w:uiPriority w:val="73"/>
     <w:rsid w:val="00CB0664"/>
     <w:pPr>
@@ -13244,9 +13194,9 @@
       </w:tcPr>
     </w:tblStylePr>
   </w:style>
-  <w:style w:type="table" w:styleId="ColorfulGrid-Accent5">
+  <w:style w:type="table" w:styleId="Cuadrculavistosa-nfasis5">
     <w:name w:val="Colorful Grid Accent 5"/>
-    <w:basedOn w:val="TableNormal"/>
+    <w:basedOn w:val="Tablanormal"/>
     <w:uiPriority w:val="73"/>
     <w:rsid w:val="00CB0664"/>
     <w:pPr>
@@ -13324,9 +13274,9 @@
       </w:tcPr>
     </w:tblStylePr>
   </w:style>
-  <w:style w:type="table" w:styleId="ColorfulGrid-Accent6">
+  <w:style w:type="table" w:styleId="Cuadrculavistosa-nfasis6">
     <w:name w:val="Colorful Grid Accent 6"/>
-    <w:basedOn w:val="TableNormal"/>
+    <w:basedOn w:val="Tablanormal"/>
     <w:uiPriority w:val="73"/>
     <w:rsid w:val="00CB0664"/>
     <w:pPr>

</xml_diff>